<commit_message>
feat(code): créé la fonction permetant le déplacement
[60/DONE]
</commit_message>
<xml_diff>
--- a/doc/I320-RapportProjet.docx
+++ b/doc/I320-RapportProjet.docx
@@ -205,7 +205,7 @@
         </w:rPr>
         <w:fldChar w:fldCharType="separate"/>
       </w:r>
-      <w:hyperlink w:anchor="_Toc240025000" w:history="1">
+      <w:hyperlink w:anchor="_Toc240025452" w:history="1">
         <w:r>
           <w:rPr>
             <w:rStyle w:val="Lienhypertexte"/>
@@ -253,7 +253,7 @@
             <w:noProof/>
             <w:webHidden/>
           </w:rPr>
-          <w:instrText xml:space="preserve"> PAGEREF _Toc240025000 \h </w:instrText>
+          <w:instrText xml:space="preserve"> PAGEREF _Toc240025452 \h </w:instrText>
         </w:r>
         <w:r>
           <w:rPr>
@@ -301,7 +301,7 @@
           <w14:ligatures w14:val="standardContextual"/>
         </w:rPr>
       </w:pPr>
-      <w:hyperlink w:anchor="_Toc240025001" w:history="1">
+      <w:hyperlink w:anchor="_Toc240025453" w:history="1">
         <w:r>
           <w:rPr>
             <w:rStyle w:val="Lienhypertexte"/>
@@ -347,7 +347,7 @@
             <w:noProof/>
             <w:webHidden/>
           </w:rPr>
-          <w:instrText xml:space="preserve"> PAGEREF _Toc240025001 \h </w:instrText>
+          <w:instrText xml:space="preserve"> PAGEREF _Toc240025453 \h </w:instrText>
         </w:r>
         <w:r>
           <w:rPr>
@@ -395,7 +395,7 @@
           <w14:ligatures w14:val="standardContextual"/>
         </w:rPr>
       </w:pPr>
-      <w:hyperlink w:anchor="_Toc240025002" w:history="1">
+      <w:hyperlink w:anchor="_Toc240025454" w:history="1">
         <w:r>
           <w:rPr>
             <w:rStyle w:val="Lienhypertexte"/>
@@ -441,7 +441,7 @@
             <w:noProof/>
             <w:webHidden/>
           </w:rPr>
-          <w:instrText xml:space="preserve"> PAGEREF _Toc240025002 \h </w:instrText>
+          <w:instrText xml:space="preserve"> PAGEREF _Toc240025454 \h </w:instrText>
         </w:r>
         <w:r>
           <w:rPr>
@@ -489,7 +489,7 @@
           <w14:ligatures w14:val="standardContextual"/>
         </w:rPr>
       </w:pPr>
-      <w:hyperlink w:anchor="_Toc240025003" w:history="1">
+      <w:hyperlink w:anchor="_Toc240025455" w:history="1">
         <w:r>
           <w:rPr>
             <w:rStyle w:val="Lienhypertexte"/>
@@ -535,7 +535,7 @@
             <w:noProof/>
             <w:webHidden/>
           </w:rPr>
-          <w:instrText xml:space="preserve"> PAGEREF _Toc240025003 \h </w:instrText>
+          <w:instrText xml:space="preserve"> PAGEREF _Toc240025455 \h </w:instrText>
         </w:r>
         <w:r>
           <w:rPr>
@@ -585,7 +585,7 @@
           <w14:ligatures w14:val="standardContextual"/>
         </w:rPr>
       </w:pPr>
-      <w:hyperlink w:anchor="_Toc240025004" w:history="1">
+      <w:hyperlink w:anchor="_Toc240025456" w:history="1">
         <w:r>
           <w:rPr>
             <w:rStyle w:val="Lienhypertexte"/>
@@ -633,7 +633,7 @@
             <w:noProof/>
             <w:webHidden/>
           </w:rPr>
-          <w:instrText xml:space="preserve"> PAGEREF _Toc240025004 \h </w:instrText>
+          <w:instrText xml:space="preserve"> PAGEREF _Toc240025456 \h </w:instrText>
         </w:r>
         <w:r>
           <w:rPr>
@@ -683,7 +683,7 @@
           <w14:ligatures w14:val="standardContextual"/>
         </w:rPr>
       </w:pPr>
-      <w:hyperlink w:anchor="_Toc240025005" w:history="1">
+      <w:hyperlink w:anchor="_Toc240025457" w:history="1">
         <w:r>
           <w:rPr>
             <w:rStyle w:val="Lienhypertexte"/>
@@ -731,7 +731,7 @@
             <w:noProof/>
             <w:webHidden/>
           </w:rPr>
-          <w:instrText xml:space="preserve"> PAGEREF _Toc240025005 \h </w:instrText>
+          <w:instrText xml:space="preserve"> PAGEREF _Toc240025457 \h </w:instrText>
         </w:r>
         <w:r>
           <w:rPr>
@@ -779,7 +779,7 @@
           <w14:ligatures w14:val="standardContextual"/>
         </w:rPr>
       </w:pPr>
-      <w:hyperlink w:anchor="_Toc240025006" w:history="1">
+      <w:hyperlink w:anchor="_Toc240025458" w:history="1">
         <w:r>
           <w:rPr>
             <w:rStyle w:val="Lienhypertexte"/>
@@ -825,7 +825,7 @@
             <w:noProof/>
             <w:webHidden/>
           </w:rPr>
-          <w:instrText xml:space="preserve"> PAGEREF _Toc240025006 \h </w:instrText>
+          <w:instrText xml:space="preserve"> PAGEREF _Toc240025458 \h </w:instrText>
         </w:r>
         <w:r>
           <w:rPr>
@@ -874,7 +874,7 @@
           <w14:ligatures w14:val="standardContextual"/>
         </w:rPr>
       </w:pPr>
-      <w:hyperlink w:anchor="_Toc240025007" w:history="1">
+      <w:hyperlink w:anchor="_Toc240025459" w:history="1">
         <w:r>
           <w:rPr>
             <w:rStyle w:val="Lienhypertexte"/>
@@ -901,7 +901,7 @@
             <w:noProof/>
             <w:webHidden/>
           </w:rPr>
-          <w:instrText xml:space="preserve"> PAGEREF _Toc240025007 \h </w:instrText>
+          <w:instrText xml:space="preserve"> PAGEREF _Toc240025459 \h </w:instrText>
         </w:r>
         <w:r>
           <w:rPr>
@@ -950,7 +950,7 @@
           <w14:ligatures w14:val="standardContextual"/>
         </w:rPr>
       </w:pPr>
-      <w:hyperlink w:anchor="_Toc240025008" w:history="1">
+      <w:hyperlink w:anchor="_Toc240025460" w:history="1">
         <w:r>
           <w:rPr>
             <w:rStyle w:val="Lienhypertexte"/>
@@ -977,7 +977,7 @@
             <w:noProof/>
             <w:webHidden/>
           </w:rPr>
-          <w:instrText xml:space="preserve"> PAGEREF _Toc240025008 \h </w:instrText>
+          <w:instrText xml:space="preserve"> PAGEREF _Toc240025460 \h </w:instrText>
         </w:r>
         <w:r>
           <w:rPr>
@@ -1026,7 +1026,7 @@
           <w14:ligatures w14:val="standardContextual"/>
         </w:rPr>
       </w:pPr>
-      <w:hyperlink w:anchor="_Toc240025009" w:history="1">
+      <w:hyperlink w:anchor="_Toc240025461" w:history="1">
         <w:r>
           <w:rPr>
             <w:rStyle w:val="Lienhypertexte"/>
@@ -1053,7 +1053,7 @@
             <w:noProof/>
             <w:webHidden/>
           </w:rPr>
-          <w:instrText xml:space="preserve"> PAGEREF _Toc240025009 \h </w:instrText>
+          <w:instrText xml:space="preserve"> PAGEREF _Toc240025461 \h </w:instrText>
         </w:r>
         <w:r>
           <w:rPr>
@@ -1102,7 +1102,7 @@
           <w14:ligatures w14:val="standardContextual"/>
         </w:rPr>
       </w:pPr>
-      <w:hyperlink w:anchor="_Toc240025010" w:history="1">
+      <w:hyperlink w:anchor="_Toc240025462" w:history="1">
         <w:r>
           <w:rPr>
             <w:rStyle w:val="Lienhypertexte"/>
@@ -1129,7 +1129,7 @@
             <w:noProof/>
             <w:webHidden/>
           </w:rPr>
-          <w:instrText xml:space="preserve"> PAGEREF _Toc240025010 \h </w:instrText>
+          <w:instrText xml:space="preserve"> PAGEREF _Toc240025462 \h </w:instrText>
         </w:r>
         <w:r>
           <w:rPr>
@@ -1178,7 +1178,7 @@
           <w14:ligatures w14:val="standardContextual"/>
         </w:rPr>
       </w:pPr>
-      <w:hyperlink w:anchor="_Toc240025011" w:history="1">
+      <w:hyperlink w:anchor="_Toc240025463" w:history="1">
         <w:r>
           <w:rPr>
             <w:rStyle w:val="Lienhypertexte"/>
@@ -1205,7 +1205,7 @@
             <w:noProof/>
             <w:webHidden/>
           </w:rPr>
-          <w:instrText xml:space="preserve"> PAGEREF _Toc240025011 \h </w:instrText>
+          <w:instrText xml:space="preserve"> PAGEREF _Toc240025463 \h </w:instrText>
         </w:r>
         <w:r>
           <w:rPr>
@@ -1254,7 +1254,7 @@
           <w14:ligatures w14:val="standardContextual"/>
         </w:rPr>
       </w:pPr>
-      <w:hyperlink w:anchor="_Toc240025012" w:history="1">
+      <w:hyperlink w:anchor="_Toc240025464" w:history="1">
         <w:r>
           <w:rPr>
             <w:rStyle w:val="Lienhypertexte"/>
@@ -1281,7 +1281,7 @@
             <w:noProof/>
             <w:webHidden/>
           </w:rPr>
-          <w:instrText xml:space="preserve"> PAGEREF _Toc240025012 \h </w:instrText>
+          <w:instrText xml:space="preserve"> PAGEREF _Toc240025464 \h </w:instrText>
         </w:r>
         <w:r>
           <w:rPr>
@@ -1331,7 +1331,7 @@
           <w14:ligatures w14:val="standardContextual"/>
         </w:rPr>
       </w:pPr>
-      <w:hyperlink w:anchor="_Toc240025013" w:history="1">
+      <w:hyperlink w:anchor="_Toc240025465" w:history="1">
         <w:r>
           <w:rPr>
             <w:rStyle w:val="Lienhypertexte"/>
@@ -1379,7 +1379,7 @@
             <w:noProof/>
             <w:webHidden/>
           </w:rPr>
-          <w:instrText xml:space="preserve"> PAGEREF _Toc240025013 \h </w:instrText>
+          <w:instrText xml:space="preserve"> PAGEREF _Toc240025465 \h </w:instrText>
         </w:r>
         <w:r>
           <w:rPr>
@@ -1427,7 +1427,7 @@
           <w14:ligatures w14:val="standardContextual"/>
         </w:rPr>
       </w:pPr>
-      <w:hyperlink w:anchor="_Toc240025014" w:history="1">
+      <w:hyperlink w:anchor="_Toc240025466" w:history="1">
         <w:r>
           <w:rPr>
             <w:rStyle w:val="Lienhypertexte"/>
@@ -1473,7 +1473,7 @@
             <w:noProof/>
             <w:webHidden/>
           </w:rPr>
-          <w:instrText xml:space="preserve"> PAGEREF _Toc240025014 \h </w:instrText>
+          <w:instrText xml:space="preserve"> PAGEREF _Toc240025466 \h </w:instrText>
         </w:r>
         <w:r>
           <w:rPr>
@@ -1521,7 +1521,7 @@
           <w14:ligatures w14:val="standardContextual"/>
         </w:rPr>
       </w:pPr>
-      <w:hyperlink w:anchor="_Toc240025015" w:history="1">
+      <w:hyperlink w:anchor="_Toc240025467" w:history="1">
         <w:r>
           <w:rPr>
             <w:rStyle w:val="Lienhypertexte"/>
@@ -1567,7 +1567,7 @@
             <w:noProof/>
             <w:webHidden/>
           </w:rPr>
-          <w:instrText xml:space="preserve"> PAGEREF _Toc240025015 \h </w:instrText>
+          <w:instrText xml:space="preserve"> PAGEREF _Toc240025467 \h </w:instrText>
         </w:r>
         <w:r>
           <w:rPr>
@@ -1617,7 +1617,7 @@
           <w14:ligatures w14:val="standardContextual"/>
         </w:rPr>
       </w:pPr>
-      <w:hyperlink w:anchor="_Toc240025016" w:history="1">
+      <w:hyperlink w:anchor="_Toc240025468" w:history="1">
         <w:r>
           <w:rPr>
             <w:rStyle w:val="Lienhypertexte"/>
@@ -1665,7 +1665,7 @@
             <w:noProof/>
             <w:webHidden/>
           </w:rPr>
-          <w:instrText xml:space="preserve"> PAGEREF _Toc240025016 \h </w:instrText>
+          <w:instrText xml:space="preserve"> PAGEREF _Toc240025468 \h </w:instrText>
         </w:r>
         <w:r>
           <w:rPr>
@@ -1713,7 +1713,7 @@
           <w14:ligatures w14:val="standardContextual"/>
         </w:rPr>
       </w:pPr>
-      <w:hyperlink w:anchor="_Toc240025017" w:history="1">
+      <w:hyperlink w:anchor="_Toc240025469" w:history="1">
         <w:r>
           <w:rPr>
             <w:rStyle w:val="Lienhypertexte"/>
@@ -1759,7 +1759,7 @@
             <w:noProof/>
             <w:webHidden/>
           </w:rPr>
-          <w:instrText xml:space="preserve"> PAGEREF _Toc240025017 \h </w:instrText>
+          <w:instrText xml:space="preserve"> PAGEREF _Toc240025469 \h </w:instrText>
         </w:r>
         <w:r>
           <w:rPr>
@@ -1809,7 +1809,7 @@
           <w14:ligatures w14:val="standardContextual"/>
         </w:rPr>
       </w:pPr>
-      <w:hyperlink w:anchor="_Toc240025018" w:history="1">
+      <w:hyperlink w:anchor="_Toc240025470" w:history="1">
         <w:r>
           <w:rPr>
             <w:rStyle w:val="Lienhypertexte"/>
@@ -1857,7 +1857,7 @@
             <w:noProof/>
             <w:webHidden/>
           </w:rPr>
-          <w:instrText xml:space="preserve"> PAGEREF _Toc240025018 \h </w:instrText>
+          <w:instrText xml:space="preserve"> PAGEREF _Toc240025470 \h </w:instrText>
         </w:r>
         <w:r>
           <w:rPr>
@@ -1905,7 +1905,7 @@
           <w14:ligatures w14:val="standardContextual"/>
         </w:rPr>
       </w:pPr>
-      <w:hyperlink w:anchor="_Toc240025019" w:history="1">
+      <w:hyperlink w:anchor="_Toc240025471" w:history="1">
         <w:r>
           <w:rPr>
             <w:rStyle w:val="Lienhypertexte"/>
@@ -1951,7 +1951,7 @@
             <w:noProof/>
             <w:webHidden/>
           </w:rPr>
-          <w:instrText xml:space="preserve"> PAGEREF _Toc240025019 \h </w:instrText>
+          <w:instrText xml:space="preserve"> PAGEREF _Toc240025471 \h </w:instrText>
         </w:r>
         <w:r>
           <w:rPr>
@@ -1999,7 +1999,7 @@
           <w14:ligatures w14:val="standardContextual"/>
         </w:rPr>
       </w:pPr>
-      <w:hyperlink w:anchor="_Toc240025020" w:history="1">
+      <w:hyperlink w:anchor="_Toc240025472" w:history="1">
         <w:r>
           <w:rPr>
             <w:rStyle w:val="Lienhypertexte"/>
@@ -2045,7 +2045,7 @@
             <w:noProof/>
             <w:webHidden/>
           </w:rPr>
-          <w:instrText xml:space="preserve"> PAGEREF _Toc240025020 \h </w:instrText>
+          <w:instrText xml:space="preserve"> PAGEREF _Toc240025472 \h </w:instrText>
         </w:r>
         <w:r>
           <w:rPr>
@@ -2093,7 +2093,7 @@
           <w14:ligatures w14:val="standardContextual"/>
         </w:rPr>
       </w:pPr>
-      <w:hyperlink w:anchor="_Toc240025021" w:history="1">
+      <w:hyperlink w:anchor="_Toc240025473" w:history="1">
         <w:r>
           <w:rPr>
             <w:rStyle w:val="Lienhypertexte"/>
@@ -2139,7 +2139,7 @@
             <w:noProof/>
             <w:webHidden/>
           </w:rPr>
-          <w:instrText xml:space="preserve"> PAGEREF _Toc240025021 \h </w:instrText>
+          <w:instrText xml:space="preserve"> PAGEREF _Toc240025473 \h </w:instrText>
         </w:r>
         <w:r>
           <w:rPr>
@@ -2189,7 +2189,7 @@
           <w14:ligatures w14:val="standardContextual"/>
         </w:rPr>
       </w:pPr>
-      <w:hyperlink w:anchor="_Toc240025022" w:history="1">
+      <w:hyperlink w:anchor="_Toc240025474" w:history="1">
         <w:r>
           <w:rPr>
             <w:rStyle w:val="Lienhypertexte"/>
@@ -2237,7 +2237,7 @@
             <w:noProof/>
             <w:webHidden/>
           </w:rPr>
-          <w:instrText xml:space="preserve"> PAGEREF _Toc240025022 \h </w:instrText>
+          <w:instrText xml:space="preserve"> PAGEREF _Toc240025474 \h </w:instrText>
         </w:r>
         <w:r>
           <w:rPr>
@@ -2285,7 +2285,7 @@
           <w14:ligatures w14:val="standardContextual"/>
         </w:rPr>
       </w:pPr>
-      <w:hyperlink w:anchor="_Toc240025023" w:history="1">
+      <w:hyperlink w:anchor="_Toc240025475" w:history="1">
         <w:r>
           <w:rPr>
             <w:rStyle w:val="Lienhypertexte"/>
@@ -2331,7 +2331,7 @@
             <w:noProof/>
             <w:webHidden/>
           </w:rPr>
-          <w:instrText xml:space="preserve"> PAGEREF _Toc240025023 \h </w:instrText>
+          <w:instrText xml:space="preserve"> PAGEREF _Toc240025475 \h </w:instrText>
         </w:r>
         <w:r>
           <w:rPr>
@@ -2379,7 +2379,7 @@
           <w14:ligatures w14:val="standardContextual"/>
         </w:rPr>
       </w:pPr>
-      <w:hyperlink w:anchor="_Toc240025024" w:history="1">
+      <w:hyperlink w:anchor="_Toc240025476" w:history="1">
         <w:r>
           <w:rPr>
             <w:rStyle w:val="Lienhypertexte"/>
@@ -2425,7 +2425,7 @@
             <w:noProof/>
             <w:webHidden/>
           </w:rPr>
-          <w:instrText xml:space="preserve"> PAGEREF _Toc240025024 \h </w:instrText>
+          <w:instrText xml:space="preserve"> PAGEREF _Toc240025476 \h </w:instrText>
         </w:r>
         <w:r>
           <w:rPr>
@@ -2473,7 +2473,7 @@
           <w14:ligatures w14:val="standardContextual"/>
         </w:rPr>
       </w:pPr>
-      <w:hyperlink w:anchor="_Toc240025025" w:history="1">
+      <w:hyperlink w:anchor="_Toc240025477" w:history="1">
         <w:r>
           <w:rPr>
             <w:rStyle w:val="Lienhypertexte"/>
@@ -2519,7 +2519,7 @@
             <w:noProof/>
             <w:webHidden/>
           </w:rPr>
-          <w:instrText xml:space="preserve"> PAGEREF _Toc240025025 \h </w:instrText>
+          <w:instrText xml:space="preserve"> PAGEREF _Toc240025477 \h </w:instrText>
         </w:r>
         <w:r>
           <w:rPr>
@@ -2569,7 +2569,7 @@
           <w14:ligatures w14:val="standardContextual"/>
         </w:rPr>
       </w:pPr>
-      <w:hyperlink w:anchor="_Toc240025026" w:history="1">
+      <w:hyperlink w:anchor="_Toc240025478" w:history="1">
         <w:r>
           <w:rPr>
             <w:rStyle w:val="Lienhypertexte"/>
@@ -2617,7 +2617,7 @@
             <w:noProof/>
             <w:webHidden/>
           </w:rPr>
-          <w:instrText xml:space="preserve"> PAGEREF _Toc240025026 \h </w:instrText>
+          <w:instrText xml:space="preserve"> PAGEREF _Toc240025478 \h </w:instrText>
         </w:r>
         <w:r>
           <w:rPr>
@@ -2668,7 +2668,7 @@
       <w:pPr>
         <w:pStyle w:val="Titre1"/>
       </w:pPr>
-      <w:bookmarkStart w:id="0" w:name="_Toc240025000"/>
+      <w:bookmarkStart w:id="0" w:name="_Toc240025452"/>
       <w:r>
         <w:lastRenderedPageBreak/>
         <w:t>Introduction</w:t>
@@ -2686,7 +2686,7 @@
       </w:pPr>
       <w:bookmarkStart w:id="1" w:name="_Toc532179969"/>
       <w:bookmarkStart w:id="2" w:name="_Toc165969639"/>
-      <w:bookmarkStart w:id="3" w:name="_Toc240025001"/>
+      <w:bookmarkStart w:id="3" w:name="_Toc240025453"/>
       <w:r>
         <w:t>T</w:t>
       </w:r>
@@ -2725,7 +2725,7 @@
       <w:pPr>
         <w:pStyle w:val="Titre2"/>
       </w:pPr>
-      <w:bookmarkStart w:id="4" w:name="_Toc240025002"/>
+      <w:bookmarkStart w:id="4" w:name="_Toc240025454"/>
       <w:r>
         <w:t>Objectifs produit</w:t>
       </w:r>
@@ -2792,7 +2792,7 @@
       <w:pPr>
         <w:pStyle w:val="Titre2"/>
       </w:pPr>
-      <w:bookmarkStart w:id="5" w:name="_Toc240025003"/>
+      <w:bookmarkStart w:id="5" w:name="_Toc240025455"/>
       <w:r>
         <w:t>Objectifs pédagogiques</w:t>
       </w:r>
@@ -2810,6 +2810,9 @@
       <w:r>
         <w:t>Le projet a pour but de nous mettre en situation réel d’une entreprise et permettant également de mettre en pratique les connaissances que nous avons acquis durant le module I320 sur la programmation orientée objet.</w:t>
       </w:r>
+      <w:r>
+        <w:t xml:space="preserve"> Il nous servira également à apprendre à utiliser GitHub dans le cadre d’un projet.</w:t>
+      </w:r>
     </w:p>
     <w:p>
       <w:pPr>
@@ -2820,7 +2823,7 @@
       <w:pPr>
         <w:pStyle w:val="Titre1"/>
       </w:pPr>
-      <w:bookmarkStart w:id="6" w:name="_Toc240025004"/>
+      <w:bookmarkStart w:id="6" w:name="_Toc240025456"/>
       <w:r>
         <w:t>Planification</w:t>
       </w:r>
@@ -3045,7 +3048,7 @@
       </w:pPr>
       <w:bookmarkStart w:id="7" w:name="_Toc532179957"/>
       <w:bookmarkStart w:id="8" w:name="_Toc165969641"/>
-      <w:bookmarkStart w:id="9" w:name="_Toc240025005"/>
+      <w:bookmarkStart w:id="9" w:name="_Toc240025457"/>
       <w:r>
         <w:t>Analyse</w:t>
       </w:r>
@@ -3057,7 +3060,7 @@
       <w:pPr>
         <w:pStyle w:val="Titre2"/>
       </w:pPr>
-      <w:bookmarkStart w:id="10" w:name="_Toc240025006"/>
+      <w:bookmarkStart w:id="10" w:name="_Toc240025458"/>
       <w:r>
         <w:t>User story</w:t>
       </w:r>
@@ -3075,7 +3078,7 @@
         </w:numPr>
         <w:ind w:left="567"/>
       </w:pPr>
-      <w:bookmarkStart w:id="12" w:name="_Toc240025007"/>
+      <w:bookmarkStart w:id="12" w:name="_Toc240025459"/>
       <w:r>
         <w:t xml:space="preserve">#1 — US </w:t>
       </w:r>
@@ -3252,7 +3255,7 @@
         </w:numPr>
         <w:ind w:left="567"/>
       </w:pPr>
-      <w:bookmarkStart w:id="13" w:name="_Toc240025008"/>
+      <w:bookmarkStart w:id="13" w:name="_Toc240025460"/>
       <w:r>
         <w:t xml:space="preserve">#2 — US </w:t>
       </w:r>
@@ -3397,7 +3400,7 @@
         </w:numPr>
         <w:ind w:left="567"/>
       </w:pPr>
-      <w:bookmarkStart w:id="14" w:name="_Toc240025009"/>
+      <w:bookmarkStart w:id="14" w:name="_Toc240025461"/>
       <w:r>
         <w:t xml:space="preserve">#3 — US </w:t>
       </w:r>
@@ -3538,7 +3541,7 @@
         </w:numPr>
         <w:ind w:left="567"/>
       </w:pPr>
-      <w:bookmarkStart w:id="15" w:name="_Toc240025010"/>
+      <w:bookmarkStart w:id="15" w:name="_Toc240025462"/>
       <w:r>
         <w:t xml:space="preserve">#4 — US </w:t>
       </w:r>
@@ -3715,7 +3718,7 @@
         </w:numPr>
         <w:ind w:left="567"/>
       </w:pPr>
-      <w:bookmarkStart w:id="16" w:name="_Toc240025011"/>
+      <w:bookmarkStart w:id="16" w:name="_Toc240025463"/>
       <w:r>
         <w:lastRenderedPageBreak/>
         <w:t xml:space="preserve">#5 — US </w:t>
@@ -3846,7 +3849,7 @@
         </w:numPr>
         <w:ind w:left="567" w:hanging="567"/>
       </w:pPr>
-      <w:bookmarkStart w:id="17" w:name="_Toc240025012"/>
+      <w:bookmarkStart w:id="17" w:name="_Toc240025464"/>
       <w:r>
         <w:lastRenderedPageBreak/>
         <w:t xml:space="preserve">#6 — US </w:t>
@@ -3926,6 +3929,9 @@
           </wp:inline>
         </w:drawing>
       </w:r>
+      <w:r>
+        <w:t>132</w:t>
+      </w:r>
     </w:p>
     <w:p>
       <w:pPr>
@@ -3995,7 +4001,7 @@
       </w:pPr>
       <w:bookmarkStart w:id="18" w:name="_Toc532179964"/>
       <w:bookmarkStart w:id="19" w:name="_Toc165969648"/>
-      <w:bookmarkStart w:id="20" w:name="_Toc240025013"/>
+      <w:bookmarkStart w:id="20" w:name="_Toc240025465"/>
       <w:bookmarkEnd w:id="11"/>
       <w:r>
         <w:t>Réalisation</w:t>
@@ -4010,7 +4016,7 @@
       </w:pPr>
       <w:bookmarkStart w:id="21" w:name="_Toc532179965"/>
       <w:bookmarkStart w:id="22" w:name="_Toc165969649"/>
-      <w:bookmarkStart w:id="23" w:name="_Toc240025014"/>
+      <w:bookmarkStart w:id="23" w:name="_Toc240025466"/>
       <w:r>
         <w:t>Dossier de Réalisation</w:t>
       </w:r>
@@ -4177,7 +4183,7 @@
       </w:pPr>
       <w:bookmarkStart w:id="24" w:name="_Toc532179960"/>
       <w:bookmarkStart w:id="25" w:name="_Toc165969644"/>
-      <w:bookmarkStart w:id="26" w:name="_Toc240025015"/>
+      <w:bookmarkStart w:id="26" w:name="_Toc240025467"/>
       <w:r>
         <w:t>Modifications</w:t>
       </w:r>
@@ -4227,7 +4233,7 @@
       </w:pPr>
       <w:bookmarkStart w:id="27" w:name="_Toc532179966"/>
       <w:bookmarkStart w:id="28" w:name="_Toc165969650"/>
-      <w:bookmarkStart w:id="29" w:name="_Toc240025016"/>
+      <w:bookmarkStart w:id="29" w:name="_Toc240025468"/>
       <w:r>
         <w:t>Tests</w:t>
       </w:r>
@@ -4242,7 +4248,7 @@
       <w:bookmarkStart w:id="30" w:name="_Toc532179968"/>
       <w:bookmarkStart w:id="31" w:name="_Toc165969652"/>
       <w:bookmarkStart w:id="32" w:name="_Ref308525868"/>
-      <w:bookmarkStart w:id="33" w:name="_Toc240025017"/>
+      <w:bookmarkStart w:id="33" w:name="_Toc240025469"/>
       <w:r>
         <w:t>Dossier des tests</w:t>
       </w:r>
@@ -4341,7 +4347,7 @@
         <w:pStyle w:val="Titre1"/>
       </w:pPr>
       <w:bookmarkStart w:id="34" w:name="_Toc165969653"/>
-      <w:bookmarkStart w:id="35" w:name="_Toc240025018"/>
+      <w:bookmarkStart w:id="35" w:name="_Toc240025470"/>
       <w:r>
         <w:t>Conclusion</w:t>
       </w:r>
@@ -4353,7 +4359,7 @@
         <w:pStyle w:val="Titre2"/>
       </w:pPr>
       <w:bookmarkStart w:id="36" w:name="_Toc165969654"/>
-      <w:bookmarkStart w:id="37" w:name="_Toc240025019"/>
+      <w:bookmarkStart w:id="37" w:name="_Toc240025471"/>
       <w:r>
         <w:t xml:space="preserve">Bilan des </w:t>
       </w:r>
@@ -4401,7 +4407,7 @@
         <w:pStyle w:val="Titre2"/>
       </w:pPr>
       <w:bookmarkStart w:id="38" w:name="_Toc165969655"/>
-      <w:bookmarkStart w:id="39" w:name="_Toc240025020"/>
+      <w:bookmarkStart w:id="39" w:name="_Toc240025472"/>
       <w:r>
         <w:t>Bilan de la planification</w:t>
       </w:r>
@@ -4448,7 +4454,7 @@
         <w:pStyle w:val="Titre2"/>
       </w:pPr>
       <w:bookmarkStart w:id="40" w:name="_Toc165969656"/>
-      <w:bookmarkStart w:id="41" w:name="_Toc240025021"/>
+      <w:bookmarkStart w:id="41" w:name="_Toc240025473"/>
       <w:r>
         <w:t>Bilan personnel</w:t>
       </w:r>
@@ -4557,7 +4563,7 @@
       </w:pPr>
       <w:bookmarkStart w:id="42" w:name="_Toc532179971"/>
       <w:bookmarkStart w:id="43" w:name="_Toc165969657"/>
-      <w:bookmarkStart w:id="44" w:name="_Toc240025022"/>
+      <w:bookmarkStart w:id="44" w:name="_Toc240025474"/>
       <w:r>
         <w:t>Divers</w:t>
       </w:r>
@@ -4571,7 +4577,7 @@
       </w:pPr>
       <w:bookmarkStart w:id="45" w:name="_Toc532179972"/>
       <w:bookmarkStart w:id="46" w:name="_Toc165969658"/>
-      <w:bookmarkStart w:id="47" w:name="_Toc240025023"/>
+      <w:bookmarkStart w:id="47" w:name="_Toc240025475"/>
       <w:r>
         <w:t>Journal de travail</w:t>
       </w:r>
@@ -4613,7 +4619,7 @@
       <w:pPr>
         <w:pStyle w:val="Titre2"/>
       </w:pPr>
-      <w:bookmarkStart w:id="48" w:name="_Toc240025024"/>
+      <w:bookmarkStart w:id="48" w:name="_Toc240025476"/>
       <w:r>
         <w:t>Bibliographie</w:t>
       </w:r>
@@ -4644,7 +4650,7 @@
       <w:pPr>
         <w:pStyle w:val="Titre2"/>
       </w:pPr>
-      <w:bookmarkStart w:id="49" w:name="_Toc240025025"/>
+      <w:bookmarkStart w:id="49" w:name="_Toc240025477"/>
       <w:r>
         <w:t>Webographie</w:t>
       </w:r>
@@ -4666,7 +4672,7 @@
       <w:pPr>
         <w:pStyle w:val="Titre1"/>
       </w:pPr>
-      <w:bookmarkStart w:id="50" w:name="_Toc240025026"/>
+      <w:bookmarkStart w:id="50" w:name="_Toc240025478"/>
       <w:r>
         <w:t>Annexes</w:t>
       </w:r>

</xml_diff>

<commit_message>
chore(rapport): avancer dans le rapport.
[90]/[Done]
</commit_message>
<xml_diff>
--- a/doc/I320-RapportProjet.docx
+++ b/doc/I320-RapportProjet.docx
@@ -4,7 +4,7 @@
   <w:body>
     <w:p>
       <w:pPr>
-        <w:pStyle w:val="Titre"/>
+        <w:pStyle w:val="Title"/>
       </w:pPr>
       <w:r>
         <w:t>I320 Projet</w:t>
@@ -143,7 +143,7 @@
     </w:p>
     <w:p>
       <w:pPr>
-        <w:pStyle w:val="Titre"/>
+        <w:pStyle w:val="Title"/>
       </w:pPr>
       <w:r>
         <w:br w:type="page"/>
@@ -155,7 +155,7 @@
     </w:p>
     <w:p>
       <w:pPr>
-        <w:pStyle w:val="TM10"/>
+        <w:pStyle w:val="TOC1"/>
         <w:tabs>
           <w:tab w:val="left" w:pos="400"/>
           <w:tab w:val="right" w:leader="dot" w:pos="9060"/>
@@ -208,7 +208,7 @@
       <w:hyperlink w:anchor="_Toc240025452" w:history="1">
         <w:r>
           <w:rPr>
-            <w:rStyle w:val="Lienhypertexte"/>
+            <w:rStyle w:val="Hyperlink"/>
             <w:noProof/>
           </w:rPr>
           <w:t>1</w:t>
@@ -229,7 +229,7 @@
         </w:r>
         <w:r>
           <w:rPr>
-            <w:rStyle w:val="Lienhypertexte"/>
+            <w:rStyle w:val="Hyperlink"/>
             <w:noProof/>
           </w:rPr>
           <w:t>Introduction</w:t>
@@ -286,7 +286,7 @@
     </w:p>
     <w:p>
       <w:pPr>
-        <w:pStyle w:val="TM2"/>
+        <w:pStyle w:val="TOC2"/>
         <w:tabs>
           <w:tab w:val="left" w:pos="800"/>
           <w:tab w:val="right" w:leader="dot" w:pos="9060"/>
@@ -304,7 +304,7 @@
       <w:hyperlink w:anchor="_Toc240025453" w:history="1">
         <w:r>
           <w:rPr>
-            <w:rStyle w:val="Lienhypertexte"/>
+            <w:rStyle w:val="Hyperlink"/>
             <w:noProof/>
           </w:rPr>
           <w:t>1.1</w:t>
@@ -323,7 +323,7 @@
         </w:r>
         <w:r>
           <w:rPr>
-            <w:rStyle w:val="Lienhypertexte"/>
+            <w:rStyle w:val="Hyperlink"/>
             <w:noProof/>
           </w:rPr>
           <w:t>Titre</w:t>
@@ -380,7 +380,7 @@
     </w:p>
     <w:p>
       <w:pPr>
-        <w:pStyle w:val="TM2"/>
+        <w:pStyle w:val="TOC2"/>
         <w:tabs>
           <w:tab w:val="left" w:pos="800"/>
           <w:tab w:val="right" w:leader="dot" w:pos="9060"/>
@@ -398,7 +398,7 @@
       <w:hyperlink w:anchor="_Toc240025454" w:history="1">
         <w:r>
           <w:rPr>
-            <w:rStyle w:val="Lienhypertexte"/>
+            <w:rStyle w:val="Hyperlink"/>
             <w:noProof/>
           </w:rPr>
           <w:t>1.2</w:t>
@@ -417,7 +417,7 @@
         </w:r>
         <w:r>
           <w:rPr>
-            <w:rStyle w:val="Lienhypertexte"/>
+            <w:rStyle w:val="Hyperlink"/>
             <w:noProof/>
           </w:rPr>
           <w:t>Objectifs produit</w:t>
@@ -474,7 +474,7 @@
     </w:p>
     <w:p>
       <w:pPr>
-        <w:pStyle w:val="TM2"/>
+        <w:pStyle w:val="TOC2"/>
         <w:tabs>
           <w:tab w:val="left" w:pos="800"/>
           <w:tab w:val="right" w:leader="dot" w:pos="9060"/>
@@ -492,7 +492,7 @@
       <w:hyperlink w:anchor="_Toc240025455" w:history="1">
         <w:r>
           <w:rPr>
-            <w:rStyle w:val="Lienhypertexte"/>
+            <w:rStyle w:val="Hyperlink"/>
             <w:noProof/>
           </w:rPr>
           <w:t>1.3</w:t>
@@ -511,7 +511,7 @@
         </w:r>
         <w:r>
           <w:rPr>
-            <w:rStyle w:val="Lienhypertexte"/>
+            <w:rStyle w:val="Hyperlink"/>
             <w:noProof/>
           </w:rPr>
           <w:t>Objectifs pédagogiques</w:t>
@@ -568,7 +568,7 @@
     </w:p>
     <w:p>
       <w:pPr>
-        <w:pStyle w:val="TM10"/>
+        <w:pStyle w:val="TOC1"/>
         <w:tabs>
           <w:tab w:val="left" w:pos="400"/>
           <w:tab w:val="right" w:leader="dot" w:pos="9060"/>
@@ -588,7 +588,7 @@
       <w:hyperlink w:anchor="_Toc240025456" w:history="1">
         <w:r>
           <w:rPr>
-            <w:rStyle w:val="Lienhypertexte"/>
+            <w:rStyle w:val="Hyperlink"/>
             <w:noProof/>
           </w:rPr>
           <w:t>2</w:t>
@@ -609,7 +609,7 @@
         </w:r>
         <w:r>
           <w:rPr>
-            <w:rStyle w:val="Lienhypertexte"/>
+            <w:rStyle w:val="Hyperlink"/>
             <w:noProof/>
           </w:rPr>
           <w:t>Planification Initiale</w:t>
@@ -666,7 +666,7 @@
     </w:p>
     <w:p>
       <w:pPr>
-        <w:pStyle w:val="TM10"/>
+        <w:pStyle w:val="TOC1"/>
         <w:tabs>
           <w:tab w:val="left" w:pos="400"/>
           <w:tab w:val="right" w:leader="dot" w:pos="9060"/>
@@ -686,7 +686,7 @@
       <w:hyperlink w:anchor="_Toc240025457" w:history="1">
         <w:r>
           <w:rPr>
-            <w:rStyle w:val="Lienhypertexte"/>
+            <w:rStyle w:val="Hyperlink"/>
             <w:noProof/>
           </w:rPr>
           <w:t>3</w:t>
@@ -707,7 +707,7 @@
         </w:r>
         <w:r>
           <w:rPr>
-            <w:rStyle w:val="Lienhypertexte"/>
+            <w:rStyle w:val="Hyperlink"/>
             <w:noProof/>
           </w:rPr>
           <w:t>Analyse</w:t>
@@ -764,7 +764,7 @@
     </w:p>
     <w:p>
       <w:pPr>
-        <w:pStyle w:val="TM2"/>
+        <w:pStyle w:val="TOC2"/>
         <w:tabs>
           <w:tab w:val="left" w:pos="800"/>
           <w:tab w:val="right" w:leader="dot" w:pos="9060"/>
@@ -782,7 +782,7 @@
       <w:hyperlink w:anchor="_Toc240025458" w:history="1">
         <w:r>
           <w:rPr>
-            <w:rStyle w:val="Lienhypertexte"/>
+            <w:rStyle w:val="Hyperlink"/>
             <w:noProof/>
           </w:rPr>
           <w:t>3.1</w:t>
@@ -801,7 +801,7 @@
         </w:r>
         <w:r>
           <w:rPr>
-            <w:rStyle w:val="Lienhypertexte"/>
+            <w:rStyle w:val="Hyperlink"/>
             <w:noProof/>
           </w:rPr>
           <w:t>User story</w:t>
@@ -858,7 +858,7 @@
     </w:p>
     <w:p>
       <w:pPr>
-        <w:pStyle w:val="TM10"/>
+        <w:pStyle w:val="TOC1"/>
         <w:tabs>
           <w:tab w:val="right" w:leader="dot" w:pos="9060"/>
         </w:tabs>
@@ -877,7 +877,7 @@
       <w:hyperlink w:anchor="_Toc240025459" w:history="1">
         <w:r>
           <w:rPr>
-            <w:rStyle w:val="Lienhypertexte"/>
+            <w:rStyle w:val="Hyperlink"/>
             <w:noProof/>
           </w:rPr>
           <w:t>#1 — US 1: Déplacement</w:t>
@@ -934,7 +934,7 @@
     </w:p>
     <w:p>
       <w:pPr>
-        <w:pStyle w:val="TM10"/>
+        <w:pStyle w:val="TOC1"/>
         <w:tabs>
           <w:tab w:val="right" w:leader="dot" w:pos="9060"/>
         </w:tabs>
@@ -953,7 +953,7 @@
       <w:hyperlink w:anchor="_Toc240025460" w:history="1">
         <w:r>
           <w:rPr>
-            <w:rStyle w:val="Lienhypertexte"/>
+            <w:rStyle w:val="Hyperlink"/>
             <w:noProof/>
           </w:rPr>
           <w:t>#2 — US 2: Tir</w:t>
@@ -1010,7 +1010,7 @@
     </w:p>
     <w:p>
       <w:pPr>
-        <w:pStyle w:val="TM10"/>
+        <w:pStyle w:val="TOC1"/>
         <w:tabs>
           <w:tab w:val="right" w:leader="dot" w:pos="9060"/>
         </w:tabs>
@@ -1029,7 +1029,7 @@
       <w:hyperlink w:anchor="_Toc240025461" w:history="1">
         <w:r>
           <w:rPr>
-            <w:rStyle w:val="Lienhypertexte"/>
+            <w:rStyle w:val="Hyperlink"/>
             <w:noProof/>
           </w:rPr>
           <w:t>#3 — US 3: Personnage Joueur</w:t>
@@ -1086,7 +1086,7 @@
     </w:p>
     <w:p>
       <w:pPr>
-        <w:pStyle w:val="TM10"/>
+        <w:pStyle w:val="TOC1"/>
         <w:tabs>
           <w:tab w:val="right" w:leader="dot" w:pos="9060"/>
         </w:tabs>
@@ -1105,7 +1105,7 @@
       <w:hyperlink w:anchor="_Toc240025462" w:history="1">
         <w:r>
           <w:rPr>
-            <w:rStyle w:val="Lienhypertexte"/>
+            <w:rStyle w:val="Hyperlink"/>
             <w:noProof/>
           </w:rPr>
           <w:t>#4 — US 4: Personnage ennemie</w:t>
@@ -1162,7 +1162,7 @@
     </w:p>
     <w:p>
       <w:pPr>
-        <w:pStyle w:val="TM10"/>
+        <w:pStyle w:val="TOC1"/>
         <w:tabs>
           <w:tab w:val="right" w:leader="dot" w:pos="9060"/>
         </w:tabs>
@@ -1181,7 +1181,7 @@
       <w:hyperlink w:anchor="_Toc240025463" w:history="1">
         <w:r>
           <w:rPr>
-            <w:rStyle w:val="Lienhypertexte"/>
+            <w:rStyle w:val="Hyperlink"/>
             <w:noProof/>
           </w:rPr>
           <w:t>#5 — US 5: Barrière</w:t>
@@ -1238,7 +1238,7 @@
     </w:p>
     <w:p>
       <w:pPr>
-        <w:pStyle w:val="TM10"/>
+        <w:pStyle w:val="TOC1"/>
         <w:tabs>
           <w:tab w:val="right" w:leader="dot" w:pos="9060"/>
         </w:tabs>
@@ -1257,7 +1257,7 @@
       <w:hyperlink w:anchor="_Toc240025464" w:history="1">
         <w:r>
           <w:rPr>
-            <w:rStyle w:val="Lienhypertexte"/>
+            <w:rStyle w:val="Hyperlink"/>
             <w:noProof/>
           </w:rPr>
           <w:t>#6 — US 6: Vague</w:t>
@@ -1314,7 +1314,7 @@
     </w:p>
     <w:p>
       <w:pPr>
-        <w:pStyle w:val="TM10"/>
+        <w:pStyle w:val="TOC1"/>
         <w:tabs>
           <w:tab w:val="left" w:pos="400"/>
           <w:tab w:val="right" w:leader="dot" w:pos="9060"/>
@@ -1334,7 +1334,7 @@
       <w:hyperlink w:anchor="_Toc240025465" w:history="1">
         <w:r>
           <w:rPr>
-            <w:rStyle w:val="Lienhypertexte"/>
+            <w:rStyle w:val="Hyperlink"/>
             <w:noProof/>
           </w:rPr>
           <w:t>4</w:t>
@@ -1355,7 +1355,7 @@
         </w:r>
         <w:r>
           <w:rPr>
-            <w:rStyle w:val="Lienhypertexte"/>
+            <w:rStyle w:val="Hyperlink"/>
             <w:noProof/>
           </w:rPr>
           <w:t>Réalisation</w:t>
@@ -1412,7 +1412,7 @@
     </w:p>
     <w:p>
       <w:pPr>
-        <w:pStyle w:val="TM2"/>
+        <w:pStyle w:val="TOC2"/>
         <w:tabs>
           <w:tab w:val="left" w:pos="800"/>
           <w:tab w:val="right" w:leader="dot" w:pos="9060"/>
@@ -1430,7 +1430,7 @@
       <w:hyperlink w:anchor="_Toc240025466" w:history="1">
         <w:r>
           <w:rPr>
-            <w:rStyle w:val="Lienhypertexte"/>
+            <w:rStyle w:val="Hyperlink"/>
             <w:noProof/>
           </w:rPr>
           <w:t>4.1</w:t>
@@ -1449,7 +1449,7 @@
         </w:r>
         <w:r>
           <w:rPr>
-            <w:rStyle w:val="Lienhypertexte"/>
+            <w:rStyle w:val="Hyperlink"/>
             <w:noProof/>
           </w:rPr>
           <w:t>Dossier de Réalisation</w:t>
@@ -1506,7 +1506,7 @@
     </w:p>
     <w:p>
       <w:pPr>
-        <w:pStyle w:val="TM2"/>
+        <w:pStyle w:val="TOC2"/>
         <w:tabs>
           <w:tab w:val="left" w:pos="800"/>
           <w:tab w:val="right" w:leader="dot" w:pos="9060"/>
@@ -1524,7 +1524,7 @@
       <w:hyperlink w:anchor="_Toc240025467" w:history="1">
         <w:r>
           <w:rPr>
-            <w:rStyle w:val="Lienhypertexte"/>
+            <w:rStyle w:val="Hyperlink"/>
             <w:noProof/>
           </w:rPr>
           <w:t>4.2</w:t>
@@ -1543,7 +1543,7 @@
         </w:r>
         <w:r>
           <w:rPr>
-            <w:rStyle w:val="Lienhypertexte"/>
+            <w:rStyle w:val="Hyperlink"/>
             <w:noProof/>
           </w:rPr>
           <w:t>Modifications</w:t>
@@ -1600,7 +1600,7 @@
     </w:p>
     <w:p>
       <w:pPr>
-        <w:pStyle w:val="TM10"/>
+        <w:pStyle w:val="TOC1"/>
         <w:tabs>
           <w:tab w:val="left" w:pos="400"/>
           <w:tab w:val="right" w:leader="dot" w:pos="9060"/>
@@ -1620,7 +1620,7 @@
       <w:hyperlink w:anchor="_Toc240025468" w:history="1">
         <w:r>
           <w:rPr>
-            <w:rStyle w:val="Lienhypertexte"/>
+            <w:rStyle w:val="Hyperlink"/>
             <w:noProof/>
           </w:rPr>
           <w:t>5</w:t>
@@ -1641,7 +1641,7 @@
         </w:r>
         <w:r>
           <w:rPr>
-            <w:rStyle w:val="Lienhypertexte"/>
+            <w:rStyle w:val="Hyperlink"/>
             <w:noProof/>
           </w:rPr>
           <w:t>Tests</w:t>
@@ -1698,7 +1698,7 @@
     </w:p>
     <w:p>
       <w:pPr>
-        <w:pStyle w:val="TM2"/>
+        <w:pStyle w:val="TOC2"/>
         <w:tabs>
           <w:tab w:val="left" w:pos="800"/>
           <w:tab w:val="right" w:leader="dot" w:pos="9060"/>
@@ -1716,7 +1716,7 @@
       <w:hyperlink w:anchor="_Toc240025469" w:history="1">
         <w:r>
           <w:rPr>
-            <w:rStyle w:val="Lienhypertexte"/>
+            <w:rStyle w:val="Hyperlink"/>
             <w:noProof/>
           </w:rPr>
           <w:t>5.1</w:t>
@@ -1735,7 +1735,7 @@
         </w:r>
         <w:r>
           <w:rPr>
-            <w:rStyle w:val="Lienhypertexte"/>
+            <w:rStyle w:val="Hyperlink"/>
             <w:noProof/>
           </w:rPr>
           <w:t>Dossier des tests</w:t>
@@ -1792,7 +1792,7 @@
     </w:p>
     <w:p>
       <w:pPr>
-        <w:pStyle w:val="TM10"/>
+        <w:pStyle w:val="TOC1"/>
         <w:tabs>
           <w:tab w:val="left" w:pos="400"/>
           <w:tab w:val="right" w:leader="dot" w:pos="9060"/>
@@ -1812,7 +1812,7 @@
       <w:hyperlink w:anchor="_Toc240025470" w:history="1">
         <w:r>
           <w:rPr>
-            <w:rStyle w:val="Lienhypertexte"/>
+            <w:rStyle w:val="Hyperlink"/>
             <w:noProof/>
           </w:rPr>
           <w:t>6</w:t>
@@ -1833,7 +1833,7 @@
         </w:r>
         <w:r>
           <w:rPr>
-            <w:rStyle w:val="Lienhypertexte"/>
+            <w:rStyle w:val="Hyperlink"/>
             <w:noProof/>
           </w:rPr>
           <w:t>Conclusion</w:t>
@@ -1890,7 +1890,7 @@
     </w:p>
     <w:p>
       <w:pPr>
-        <w:pStyle w:val="TM2"/>
+        <w:pStyle w:val="TOC2"/>
         <w:tabs>
           <w:tab w:val="left" w:pos="800"/>
           <w:tab w:val="right" w:leader="dot" w:pos="9060"/>
@@ -1908,7 +1908,7 @@
       <w:hyperlink w:anchor="_Toc240025471" w:history="1">
         <w:r>
           <w:rPr>
-            <w:rStyle w:val="Lienhypertexte"/>
+            <w:rStyle w:val="Hyperlink"/>
             <w:noProof/>
           </w:rPr>
           <w:t>6.1</w:t>
@@ -1927,7 +1927,7 @@
         </w:r>
         <w:r>
           <w:rPr>
-            <w:rStyle w:val="Lienhypertexte"/>
+            <w:rStyle w:val="Hyperlink"/>
             <w:noProof/>
           </w:rPr>
           <w:t>Bilan des fonctionnalités demandées</w:t>
@@ -1984,7 +1984,7 @@
     </w:p>
     <w:p>
       <w:pPr>
-        <w:pStyle w:val="TM2"/>
+        <w:pStyle w:val="TOC2"/>
         <w:tabs>
           <w:tab w:val="left" w:pos="800"/>
           <w:tab w:val="right" w:leader="dot" w:pos="9060"/>
@@ -2002,7 +2002,7 @@
       <w:hyperlink w:anchor="_Toc240025472" w:history="1">
         <w:r>
           <w:rPr>
-            <w:rStyle w:val="Lienhypertexte"/>
+            <w:rStyle w:val="Hyperlink"/>
             <w:noProof/>
           </w:rPr>
           <w:t>6.2</w:t>
@@ -2021,7 +2021,7 @@
         </w:r>
         <w:r>
           <w:rPr>
-            <w:rStyle w:val="Lienhypertexte"/>
+            <w:rStyle w:val="Hyperlink"/>
             <w:noProof/>
           </w:rPr>
           <w:t>Bilan de la planification</w:t>
@@ -2078,7 +2078,7 @@
     </w:p>
     <w:p>
       <w:pPr>
-        <w:pStyle w:val="TM2"/>
+        <w:pStyle w:val="TOC2"/>
         <w:tabs>
           <w:tab w:val="left" w:pos="800"/>
           <w:tab w:val="right" w:leader="dot" w:pos="9060"/>
@@ -2096,7 +2096,7 @@
       <w:hyperlink w:anchor="_Toc240025473" w:history="1">
         <w:r>
           <w:rPr>
-            <w:rStyle w:val="Lienhypertexte"/>
+            <w:rStyle w:val="Hyperlink"/>
             <w:noProof/>
           </w:rPr>
           <w:t>6.3</w:t>
@@ -2115,7 +2115,7 @@
         </w:r>
         <w:r>
           <w:rPr>
-            <w:rStyle w:val="Lienhypertexte"/>
+            <w:rStyle w:val="Hyperlink"/>
             <w:noProof/>
           </w:rPr>
           <w:t>Bilan personnel</w:t>
@@ -2172,7 +2172,7 @@
     </w:p>
     <w:p>
       <w:pPr>
-        <w:pStyle w:val="TM10"/>
+        <w:pStyle w:val="TOC1"/>
         <w:tabs>
           <w:tab w:val="left" w:pos="400"/>
           <w:tab w:val="right" w:leader="dot" w:pos="9060"/>
@@ -2192,7 +2192,7 @@
       <w:hyperlink w:anchor="_Toc240025474" w:history="1">
         <w:r>
           <w:rPr>
-            <w:rStyle w:val="Lienhypertexte"/>
+            <w:rStyle w:val="Hyperlink"/>
             <w:noProof/>
           </w:rPr>
           <w:t>7</w:t>
@@ -2213,7 +2213,7 @@
         </w:r>
         <w:r>
           <w:rPr>
-            <w:rStyle w:val="Lienhypertexte"/>
+            <w:rStyle w:val="Hyperlink"/>
             <w:noProof/>
           </w:rPr>
           <w:t>Divers</w:t>
@@ -2270,7 +2270,7 @@
     </w:p>
     <w:p>
       <w:pPr>
-        <w:pStyle w:val="TM2"/>
+        <w:pStyle w:val="TOC2"/>
         <w:tabs>
           <w:tab w:val="left" w:pos="800"/>
           <w:tab w:val="right" w:leader="dot" w:pos="9060"/>
@@ -2288,7 +2288,7 @@
       <w:hyperlink w:anchor="_Toc240025475" w:history="1">
         <w:r>
           <w:rPr>
-            <w:rStyle w:val="Lienhypertexte"/>
+            <w:rStyle w:val="Hyperlink"/>
             <w:noProof/>
           </w:rPr>
           <w:t>7.1</w:t>
@@ -2307,7 +2307,7 @@
         </w:r>
         <w:r>
           <w:rPr>
-            <w:rStyle w:val="Lienhypertexte"/>
+            <w:rStyle w:val="Hyperlink"/>
             <w:noProof/>
           </w:rPr>
           <w:t>Journal de travail</w:t>
@@ -2364,7 +2364,7 @@
     </w:p>
     <w:p>
       <w:pPr>
-        <w:pStyle w:val="TM2"/>
+        <w:pStyle w:val="TOC2"/>
         <w:tabs>
           <w:tab w:val="left" w:pos="800"/>
           <w:tab w:val="right" w:leader="dot" w:pos="9060"/>
@@ -2382,7 +2382,7 @@
       <w:hyperlink w:anchor="_Toc240025476" w:history="1">
         <w:r>
           <w:rPr>
-            <w:rStyle w:val="Lienhypertexte"/>
+            <w:rStyle w:val="Hyperlink"/>
             <w:noProof/>
           </w:rPr>
           <w:t>7.2</w:t>
@@ -2401,7 +2401,7 @@
         </w:r>
         <w:r>
           <w:rPr>
-            <w:rStyle w:val="Lienhypertexte"/>
+            <w:rStyle w:val="Hyperlink"/>
             <w:noProof/>
           </w:rPr>
           <w:t>Bibliographie</w:t>
@@ -2458,7 +2458,7 @@
     </w:p>
     <w:p>
       <w:pPr>
-        <w:pStyle w:val="TM2"/>
+        <w:pStyle w:val="TOC2"/>
         <w:tabs>
           <w:tab w:val="left" w:pos="800"/>
           <w:tab w:val="right" w:leader="dot" w:pos="9060"/>
@@ -2476,7 +2476,7 @@
       <w:hyperlink w:anchor="_Toc240025477" w:history="1">
         <w:r>
           <w:rPr>
-            <w:rStyle w:val="Lienhypertexte"/>
+            <w:rStyle w:val="Hyperlink"/>
             <w:noProof/>
           </w:rPr>
           <w:t>7.3</w:t>
@@ -2495,7 +2495,7 @@
         </w:r>
         <w:r>
           <w:rPr>
-            <w:rStyle w:val="Lienhypertexte"/>
+            <w:rStyle w:val="Hyperlink"/>
             <w:noProof/>
           </w:rPr>
           <w:t>Webographie</w:t>
@@ -2552,7 +2552,7 @@
     </w:p>
     <w:p>
       <w:pPr>
-        <w:pStyle w:val="TM10"/>
+        <w:pStyle w:val="TOC1"/>
         <w:tabs>
           <w:tab w:val="left" w:pos="400"/>
           <w:tab w:val="right" w:leader="dot" w:pos="9060"/>
@@ -2572,7 +2572,7 @@
       <w:hyperlink w:anchor="_Toc240025478" w:history="1">
         <w:r>
           <w:rPr>
-            <w:rStyle w:val="Lienhypertexte"/>
+            <w:rStyle w:val="Hyperlink"/>
             <w:noProof/>
           </w:rPr>
           <w:t>8</w:t>
@@ -2593,7 +2593,7 @@
         </w:r>
         <w:r>
           <w:rPr>
-            <w:rStyle w:val="Lienhypertexte"/>
+            <w:rStyle w:val="Hyperlink"/>
             <w:noProof/>
           </w:rPr>
           <w:t>Annexes</w:t>
@@ -2666,7 +2666,7 @@
     </w:p>
     <w:p>
       <w:pPr>
-        <w:pStyle w:val="Titre1"/>
+        <w:pStyle w:val="Heading1"/>
       </w:pPr>
       <w:bookmarkStart w:id="0" w:name="_Toc240025452"/>
       <w:r>
@@ -2677,16 +2677,16 @@
     </w:p>
     <w:p>
       <w:pPr>
-        <w:pStyle w:val="Corpsdetexte"/>
-      </w:pPr>
-    </w:p>
-    <w:p>
-      <w:pPr>
-        <w:pStyle w:val="Titre2"/>
-      </w:pPr>
-      <w:bookmarkStart w:id="1" w:name="_Toc532179969"/>
-      <w:bookmarkStart w:id="2" w:name="_Toc165969639"/>
-      <w:bookmarkStart w:id="3" w:name="_Toc240025453"/>
+        <w:pStyle w:val="BodyText"/>
+      </w:pPr>
+    </w:p>
+    <w:p>
+      <w:pPr>
+        <w:pStyle w:val="Heading2"/>
+      </w:pPr>
+      <w:bookmarkStart w:id="1" w:name="_Toc240025453"/>
+      <w:bookmarkStart w:id="2" w:name="_Toc532179969"/>
+      <w:bookmarkStart w:id="3" w:name="_Toc165969639"/>
       <w:r>
         <w:t>T</w:t>
       </w:r>
@@ -2696,139 +2696,139 @@
       <w:r>
         <w:t>e</w:t>
       </w:r>
+      <w:bookmarkEnd w:id="1"/>
+    </w:p>
+    <w:p>
+      <w:pPr>
+        <w:pStyle w:val="BodyTextIndent"/>
+      </w:pPr>
+    </w:p>
+    <w:p>
+      <w:pPr>
+        <w:ind w:left="1134"/>
+      </w:pPr>
+      <w:proofErr w:type="spellStart"/>
+      <w:r>
+        <w:t>Shoot’em</w:t>
+      </w:r>
+      <w:proofErr w:type="spellEnd"/>
+      <w:r>
+        <w:t xml:space="preserve"> up</w:t>
+      </w:r>
+    </w:p>
+    <w:p>
+      <w:pPr>
+        <w:pStyle w:val="BodyTextIndent"/>
+      </w:pPr>
+    </w:p>
+    <w:p>
+      <w:pPr>
+        <w:pStyle w:val="Heading2"/>
+      </w:pPr>
+      <w:bookmarkStart w:id="4" w:name="_Toc240025454"/>
+      <w:r>
+        <w:t>Objectifs produit</w:t>
+      </w:r>
+      <w:bookmarkEnd w:id="4"/>
+    </w:p>
+    <w:p>
+      <w:pPr>
+        <w:pStyle w:val="BodyTextIndent"/>
+      </w:pPr>
+    </w:p>
+    <w:p>
+      <w:pPr>
+        <w:ind w:left="1134"/>
+      </w:pPr>
+      <w:r>
+        <w:t xml:space="preserve">Durant ce projet je devrai </w:t>
+      </w:r>
+      <w:r>
+        <w:t>créer</w:t>
+      </w:r>
+      <w:r>
+        <w:t xml:space="preserve"> un jeu dans le genre shoot ‘</w:t>
+      </w:r>
+      <w:proofErr w:type="spellStart"/>
+      <w:r>
+        <w:t>em</w:t>
+      </w:r>
+      <w:proofErr w:type="spellEnd"/>
+      <w:r>
+        <w:t xml:space="preserve"> up. J’ai </w:t>
+      </w:r>
+      <w:r>
+        <w:t>choisi</w:t>
+      </w:r>
+      <w:r>
+        <w:t xml:space="preserve"> le thème de l’anime </w:t>
+      </w:r>
+      <w:proofErr w:type="spellStart"/>
+      <w:r>
+        <w:t>tensura</w:t>
+      </w:r>
+      <w:proofErr w:type="spellEnd"/>
+      <w:r>
+        <w:t xml:space="preserve">. Le jeu se déroulera avec le joueur en tant que </w:t>
+      </w:r>
+      <w:proofErr w:type="spellStart"/>
+      <w:r>
+        <w:t>slime</w:t>
+      </w:r>
+      <w:proofErr w:type="spellEnd"/>
+      <w:r>
+        <w:t xml:space="preserve"> tirant des</w:t>
+      </w:r>
+      <w:r>
+        <w:t xml:space="preserve"> projectiles sur des loups pour les tués. Il pourra se protéger à l’aide de barricade présente sur le terrain. Il mourra après un certain nombre de fois qu’il aura été touché par les loups. Le joueur gagnera après avoir battu 3 vagues de loup avec une puissance exponentiel.</w:t>
+      </w:r>
+    </w:p>
+    <w:p>
+      <w:pPr>
+        <w:pStyle w:val="BodyTextIndent"/>
+      </w:pPr>
+    </w:p>
+    <w:p>
+      <w:pPr>
+        <w:pStyle w:val="Heading2"/>
+      </w:pPr>
+      <w:bookmarkStart w:id="5" w:name="_Toc240025455"/>
+      <w:r>
+        <w:t>Objectifs pédagogiques</w:t>
+      </w:r>
+      <w:bookmarkEnd w:id="5"/>
+    </w:p>
+    <w:p>
+      <w:pPr>
+        <w:pStyle w:val="BodyTextIndent"/>
+      </w:pPr>
+    </w:p>
+    <w:p>
+      <w:pPr>
+        <w:ind w:left="1134"/>
+      </w:pPr>
+      <w:r>
+        <w:t>Le projet a pour but de nous mettre en situation réel d’une entreprise et permettant également de mettre en pratique les connaissances que nous avons acquis durant le module I320 sur la programmation orientée objet.</w:t>
+      </w:r>
+      <w:r>
+        <w:t xml:space="preserve"> Il nous servira également à apprendre à utiliser GitHub dans le cadre d’un projet.</w:t>
+      </w:r>
+    </w:p>
+    <w:p>
+      <w:pPr>
+        <w:pStyle w:val="BodyTextIndent"/>
+      </w:pPr>
+    </w:p>
+    <w:p>
+      <w:pPr>
+        <w:pStyle w:val="Heading1"/>
+      </w:pPr>
+      <w:bookmarkStart w:id="6" w:name="_Toc240025456"/>
+      <w:r>
+        <w:t>Planification</w:t>
+      </w:r>
+      <w:bookmarkEnd w:id="2"/>
       <w:bookmarkEnd w:id="3"/>
-    </w:p>
-    <w:p>
-      <w:pPr>
-        <w:pStyle w:val="Retraitcorpsdetexte"/>
-      </w:pPr>
-    </w:p>
-    <w:p>
-      <w:pPr>
-        <w:ind w:left="1134"/>
-      </w:pPr>
-      <w:proofErr w:type="spellStart"/>
-      <w:r>
-        <w:t>Shoot’em</w:t>
-      </w:r>
-      <w:proofErr w:type="spellEnd"/>
-      <w:r>
-        <w:t xml:space="preserve"> up</w:t>
-      </w:r>
-    </w:p>
-    <w:p>
-      <w:pPr>
-        <w:pStyle w:val="Retraitcorpsdetexte"/>
-      </w:pPr>
-    </w:p>
-    <w:p>
-      <w:pPr>
-        <w:pStyle w:val="Titre2"/>
-      </w:pPr>
-      <w:bookmarkStart w:id="4" w:name="_Toc240025454"/>
-      <w:r>
-        <w:t>Objectifs produit</w:t>
-      </w:r>
-      <w:bookmarkEnd w:id="4"/>
-    </w:p>
-    <w:p>
-      <w:pPr>
-        <w:pStyle w:val="Retraitcorpsdetexte"/>
-      </w:pPr>
-    </w:p>
-    <w:p>
-      <w:pPr>
-        <w:ind w:left="1134"/>
-      </w:pPr>
-      <w:r>
-        <w:t xml:space="preserve">Durant ce projet je devrai </w:t>
-      </w:r>
-      <w:r>
-        <w:t>créer</w:t>
-      </w:r>
-      <w:r>
-        <w:t xml:space="preserve"> un jeu dans le genre shoot ‘</w:t>
-      </w:r>
-      <w:proofErr w:type="spellStart"/>
-      <w:r>
-        <w:t>em</w:t>
-      </w:r>
-      <w:proofErr w:type="spellEnd"/>
-      <w:r>
-        <w:t xml:space="preserve"> up. J’ai </w:t>
-      </w:r>
-      <w:r>
-        <w:t>choisi</w:t>
-      </w:r>
-      <w:r>
-        <w:t xml:space="preserve"> le thème de l’anime </w:t>
-      </w:r>
-      <w:proofErr w:type="spellStart"/>
-      <w:r>
-        <w:t>tensura</w:t>
-      </w:r>
-      <w:proofErr w:type="spellEnd"/>
-      <w:r>
-        <w:t xml:space="preserve">. Le jeu se déroulera avec le joueur en tant que </w:t>
-      </w:r>
-      <w:proofErr w:type="spellStart"/>
-      <w:r>
-        <w:t>slime</w:t>
-      </w:r>
-      <w:proofErr w:type="spellEnd"/>
-      <w:r>
-        <w:t xml:space="preserve"> tirant des</w:t>
-      </w:r>
-      <w:r>
-        <w:t xml:space="preserve"> projectiles sur des loups pour les tués. Il pourra se protéger à l’aide de barricade présente sur le terrain. Il mourra après un certain nombre de fois qu’il aura été touché par les loups. Le joueur gagnera après avoir battu 3 vagues de loup avec une puissance exponentiel.</w:t>
-      </w:r>
-    </w:p>
-    <w:p>
-      <w:pPr>
-        <w:pStyle w:val="Retraitcorpsdetexte"/>
-      </w:pPr>
-    </w:p>
-    <w:p>
-      <w:pPr>
-        <w:pStyle w:val="Titre2"/>
-      </w:pPr>
-      <w:bookmarkStart w:id="5" w:name="_Toc240025455"/>
-      <w:r>
-        <w:t>Objectifs pédagogiques</w:t>
-      </w:r>
-      <w:bookmarkEnd w:id="5"/>
-    </w:p>
-    <w:p>
-      <w:pPr>
-        <w:pStyle w:val="Retraitcorpsdetexte"/>
-      </w:pPr>
-    </w:p>
-    <w:p>
-      <w:pPr>
-        <w:ind w:left="1134"/>
-      </w:pPr>
-      <w:r>
-        <w:t>Le projet a pour but de nous mettre en situation réel d’une entreprise et permettant également de mettre en pratique les connaissances que nous avons acquis durant le module I320 sur la programmation orientée objet.</w:t>
-      </w:r>
-      <w:r>
-        <w:t xml:space="preserve"> Il nous servira également à apprendre à utiliser GitHub dans le cadre d’un projet.</w:t>
-      </w:r>
-    </w:p>
-    <w:p>
-      <w:pPr>
-        <w:pStyle w:val="Retraitcorpsdetexte"/>
-      </w:pPr>
-    </w:p>
-    <w:p>
-      <w:pPr>
-        <w:pStyle w:val="Titre1"/>
-      </w:pPr>
-      <w:bookmarkStart w:id="6" w:name="_Toc240025456"/>
-      <w:r>
-        <w:t>Planification</w:t>
-      </w:r>
-      <w:bookmarkEnd w:id="1"/>
-      <w:bookmarkEnd w:id="2"/>
       <w:r>
         <w:t xml:space="preserve"> Initiale</w:t>
       </w:r>
@@ -2836,7 +2836,7 @@
     </w:p>
     <w:tbl>
       <w:tblPr>
-        <w:tblStyle w:val="Grilledutableau"/>
+        <w:tblStyle w:val="TableGrid"/>
         <w:tblW w:w="0" w:type="auto"/>
         <w:tblInd w:w="567" w:type="dxa"/>
         <w:tblLook w:val="04A0" w:firstRow="1" w:lastRow="0" w:firstColumn="1" w:lastColumn="0" w:noHBand="0" w:noVBand="1"/>
@@ -3044,7 +3044,7 @@
     </w:p>
     <w:p>
       <w:pPr>
-        <w:pStyle w:val="Titre1"/>
+        <w:pStyle w:val="Heading1"/>
       </w:pPr>
       <w:bookmarkStart w:id="7" w:name="_Toc532179957"/>
       <w:bookmarkStart w:id="8" w:name="_Toc165969641"/>
@@ -3058,7 +3058,7 @@
     </w:p>
     <w:p>
       <w:pPr>
-        <w:pStyle w:val="Titre2"/>
+        <w:pStyle w:val="Heading2"/>
       </w:pPr>
       <w:bookmarkStart w:id="10" w:name="_Toc240025458"/>
       <w:r>
@@ -3071,7 +3071,7 @@
     </w:p>
     <w:p>
       <w:pPr>
-        <w:pStyle w:val="Titre1"/>
+        <w:pStyle w:val="Heading1"/>
         <w:numPr>
           <w:ilvl w:val="0"/>
           <w:numId w:val="0"/>
@@ -3248,7 +3248,7 @@
     <w:p/>
     <w:p>
       <w:pPr>
-        <w:pStyle w:val="Titre1"/>
+        <w:pStyle w:val="Heading1"/>
         <w:numPr>
           <w:ilvl w:val="0"/>
           <w:numId w:val="0"/>
@@ -3393,7 +3393,7 @@
     <w:p/>
     <w:p>
       <w:pPr>
-        <w:pStyle w:val="Titre1"/>
+        <w:pStyle w:val="Heading1"/>
         <w:numPr>
           <w:ilvl w:val="0"/>
           <w:numId w:val="0"/>
@@ -3534,7 +3534,7 @@
     <w:p/>
     <w:p>
       <w:pPr>
-        <w:pStyle w:val="Titre1"/>
+        <w:pStyle w:val="Heading1"/>
         <w:numPr>
           <w:ilvl w:val="0"/>
           <w:numId w:val="0"/>
@@ -3711,7 +3711,7 @@
     </w:p>
     <w:p>
       <w:pPr>
-        <w:pStyle w:val="Titre1"/>
+        <w:pStyle w:val="Heading1"/>
         <w:numPr>
           <w:ilvl w:val="0"/>
           <w:numId w:val="0"/>
@@ -3842,7 +3842,7 @@
     </w:p>
     <w:p>
       <w:pPr>
-        <w:pStyle w:val="Titre1"/>
+        <w:pStyle w:val="Heading1"/>
         <w:numPr>
           <w:ilvl w:val="0"/>
           <w:numId w:val="0"/>
@@ -3995,759 +3995,246 @@
     </w:p>
     <w:p/>
     <w:p/>
-    <w:p>
-      <w:pPr>
-        <w:pStyle w:val="Titre1"/>
-      </w:pPr>
-      <w:bookmarkStart w:id="18" w:name="_Toc532179964"/>
-      <w:bookmarkStart w:id="19" w:name="_Toc165969648"/>
-      <w:bookmarkStart w:id="20" w:name="_Toc240025465"/>
-      <w:bookmarkEnd w:id="11"/>
-      <w:r>
-        <w:t>Réalisation</w:t>
-      </w:r>
-      <w:bookmarkEnd w:id="18"/>
-      <w:bookmarkEnd w:id="19"/>
-      <w:bookmarkEnd w:id="20"/>
-    </w:p>
-    <w:p>
-      <w:pPr>
-        <w:pStyle w:val="Titre2"/>
-      </w:pPr>
-      <w:bookmarkStart w:id="21" w:name="_Toc532179965"/>
-      <w:bookmarkStart w:id="22" w:name="_Toc165969649"/>
-      <w:bookmarkStart w:id="23" w:name="_Toc240025466"/>
-      <w:r>
-        <w:t>Dossier de Réalisation</w:t>
-      </w:r>
-      <w:bookmarkEnd w:id="21"/>
-      <w:bookmarkEnd w:id="22"/>
-      <w:bookmarkEnd w:id="23"/>
-    </w:p>
-    <w:p>
-      <w:pPr>
-        <w:pStyle w:val="Informations"/>
-        <w:numPr>
-          <w:ilvl w:val="5"/>
-          <w:numId w:val="20"/>
-        </w:numPr>
-      </w:pPr>
-      <w:r>
-        <w:t>Ce</w:t>
-      </w:r>
-      <w:r>
-        <w:t>tte partie</w:t>
-      </w:r>
-      <w:r>
-        <w:t xml:space="preserve"> permet de reproduire ou reprendre le projet par un tiers.</w:t>
-      </w:r>
-    </w:p>
-    <w:p>
-      <w:pPr>
-        <w:pStyle w:val="Informations"/>
-        <w:numPr>
-          <w:ilvl w:val="5"/>
-          <w:numId w:val="20"/>
-        </w:numPr>
-      </w:pPr>
-      <w:r>
-        <w:t xml:space="preserve">Pour chaque </w:t>
-      </w:r>
-      <w:r>
-        <w:t xml:space="preserve">étape, il faut décrire sa mise en </w:t>
-      </w:r>
-      <w:r>
-        <w:t>œuvre. Typiquement</w:t>
-      </w:r>
-      <w:r>
-        <w:t> :</w:t>
-      </w:r>
-    </w:p>
-    <w:p>
-      <w:pPr>
-        <w:pStyle w:val="Informations"/>
-        <w:numPr>
-          <w:ilvl w:val="6"/>
-          <w:numId w:val="20"/>
-        </w:numPr>
-      </w:pPr>
-      <w:r>
-        <w:t>Versions des outils logiciels utilisés (OS, applications, pilotes, librairies, etc.)</w:t>
-      </w:r>
-    </w:p>
-    <w:p>
-      <w:pPr>
-        <w:pStyle w:val="Informations"/>
-        <w:numPr>
-          <w:ilvl w:val="6"/>
-          <w:numId w:val="20"/>
-        </w:numPr>
-      </w:pPr>
-      <w:r>
-        <w:t>Configurations spéciales</w:t>
-      </w:r>
-      <w:r>
-        <w:t xml:space="preserve"> des outils (Equipements, </w:t>
-      </w:r>
-      <w:r>
-        <w:t>PC</w:t>
-      </w:r>
-      <w:r>
-        <w:t xml:space="preserve">, machines, </w:t>
-      </w:r>
-      <w:r>
-        <w:t xml:space="preserve">outillage, </w:t>
-      </w:r>
-      <w:r>
-        <w:t>etc.)</w:t>
-      </w:r>
-    </w:p>
-    <w:p>
-      <w:pPr>
-        <w:pStyle w:val="Informations"/>
-        <w:numPr>
-          <w:ilvl w:val="6"/>
-          <w:numId w:val="20"/>
-        </w:numPr>
-      </w:pPr>
-      <w:r>
-        <w:t xml:space="preserve">Code source </w:t>
-      </w:r>
-      <w:r>
-        <w:t xml:space="preserve">commenté </w:t>
-      </w:r>
-      <w:r>
-        <w:t xml:space="preserve">des </w:t>
-      </w:r>
-      <w:r>
-        <w:t>éléments logiciels</w:t>
-      </w:r>
-      <w:r>
-        <w:t xml:space="preserve"> développés.</w:t>
-      </w:r>
-    </w:p>
-    <w:p>
-      <w:pPr>
-        <w:pStyle w:val="Informations"/>
-        <w:numPr>
-          <w:ilvl w:val="6"/>
-          <w:numId w:val="20"/>
-        </w:numPr>
-      </w:pPr>
-      <w:r>
-        <w:t>Modèle physique d’une base de données.</w:t>
-      </w:r>
-    </w:p>
-    <w:p>
-      <w:pPr>
-        <w:pStyle w:val="Informations"/>
-        <w:numPr>
-          <w:ilvl w:val="6"/>
-          <w:numId w:val="20"/>
-        </w:numPr>
-      </w:pPr>
-      <w:r>
-        <w:t>Arborescences des documents produits</w:t>
-      </w:r>
-      <w:r>
-        <w:t>.</w:t>
-      </w:r>
-    </w:p>
-    <w:p>
-      <w:pPr>
-        <w:pStyle w:val="Informations"/>
-        <w:numPr>
-          <w:ilvl w:val="5"/>
-          <w:numId w:val="20"/>
-        </w:numPr>
-      </w:pPr>
-      <w:r>
-        <w:t>Il faut décrire le parcours de réalisation e</w:t>
-      </w:r>
-      <w:r>
-        <w:t>t</w:t>
-      </w:r>
-      <w:r>
-        <w:t xml:space="preserve"> justifi</w:t>
-      </w:r>
-      <w:r>
-        <w:t>er</w:t>
-      </w:r>
-      <w:r>
-        <w:t xml:space="preserve"> les choix. </w:t>
-      </w:r>
-    </w:p>
-    <w:p>
-      <w:pPr>
-        <w:pStyle w:val="Titre2"/>
-      </w:pPr>
-      <w:bookmarkStart w:id="24" w:name="_Toc532179960"/>
-      <w:bookmarkStart w:id="25" w:name="_Toc165969644"/>
-      <w:bookmarkStart w:id="26" w:name="_Toc240025467"/>
-      <w:r>
-        <w:t>Modifications</w:t>
-      </w:r>
-      <w:bookmarkEnd w:id="24"/>
-      <w:bookmarkEnd w:id="25"/>
-      <w:bookmarkEnd w:id="26"/>
-    </w:p>
-    <w:p>
-      <w:pPr>
-        <w:pStyle w:val="Informations"/>
-        <w:numPr>
-          <w:ilvl w:val="5"/>
-          <w:numId w:val="21"/>
-        </w:numPr>
-      </w:pPr>
-      <w:r>
-        <w:t>Historique</w:t>
-      </w:r>
-      <w:r>
-        <w:t xml:space="preserve"> des modifications demandées (ou nécessaires) au</w:t>
-      </w:r>
-      <w:r>
-        <w:t>x</w:t>
-      </w:r>
-      <w:r>
-        <w:t xml:space="preserve"> spécifications détaillé</w:t>
-      </w:r>
-      <w:r>
-        <w:t>es.</w:t>
-      </w:r>
-    </w:p>
-    <w:p>
-      <w:pPr>
-        <w:pStyle w:val="Informations"/>
-        <w:numPr>
-          <w:ilvl w:val="5"/>
-          <w:numId w:val="21"/>
-        </w:numPr>
-      </w:pPr>
-      <w:r>
-        <w:t>Date, raison, description, etc.</w:t>
-      </w:r>
-    </w:p>
-    <w:p>
-      <w:pPr>
-        <w:pStyle w:val="Titre1"/>
-      </w:pPr>
-      <w:bookmarkStart w:id="27" w:name="_Toc532179966"/>
-      <w:bookmarkStart w:id="28" w:name="_Toc165969650"/>
-      <w:bookmarkStart w:id="29" w:name="_Toc240025468"/>
-      <w:r>
-        <w:t>Tests</w:t>
-      </w:r>
-      <w:bookmarkEnd w:id="27"/>
-      <w:bookmarkEnd w:id="28"/>
-      <w:bookmarkEnd w:id="29"/>
-    </w:p>
-    <w:p>
-      <w:pPr>
-        <w:pStyle w:val="Titre2"/>
-      </w:pPr>
-      <w:bookmarkStart w:id="30" w:name="_Toc532179968"/>
-      <w:bookmarkStart w:id="31" w:name="_Toc165969652"/>
-      <w:bookmarkStart w:id="32" w:name="_Ref308525868"/>
-      <w:bookmarkStart w:id="33" w:name="_Toc240025469"/>
-      <w:r>
-        <w:t>Dossier des tests</w:t>
-      </w:r>
-      <w:bookmarkEnd w:id="30"/>
-      <w:bookmarkEnd w:id="31"/>
-      <w:bookmarkEnd w:id="32"/>
-      <w:bookmarkEnd w:id="33"/>
-    </w:p>
-    <w:p>
-      <w:pPr>
-        <w:pStyle w:val="Informations"/>
-        <w:numPr>
-          <w:ilvl w:val="5"/>
-          <w:numId w:val="22"/>
-        </w:numPr>
-      </w:pPr>
-      <w:r>
-        <w:t>On dresse le bilan des t</w:t>
-      </w:r>
-      <w:r>
-        <w:t>ests effectués (qui, quand, avec quelles données…)</w:t>
-      </w:r>
-      <w:r>
-        <w:t xml:space="preserve"> sous forme de procédure. Lorsque cela est possible, fournir un tableau des tests effectués avec les </w:t>
-      </w:r>
+    <w:bookmarkEnd w:id="11"/>
+    <w:p>
+      <w:pPr>
+        <w:pStyle w:val="Heading1"/>
+      </w:pPr>
+      <w:r>
+        <w:t>RAPPORT DE TESTS</w:t>
+      </w:r>
+    </w:p>
+    <w:p>
+      <w:pPr>
+        <w:ind w:left="567"/>
+      </w:pPr>
+      <w:r>
+        <w:t>Dans le cahier des charges aucun minimum de test unitaire n'a été demandé, j'ai donc décidé de mettre en place plusieurs tests unitaires (via MS Test). Ces tests permettent de vérifier que la logique principale du jeu fonctionne comme prévu :</w:t>
+      </w:r>
+    </w:p>
+    <w:p>
+      <w:pPr>
+        <w:pStyle w:val="Heading2"/>
+      </w:pPr>
+      <w:r>
+        <w:t>Tir du joueur</w:t>
+      </w:r>
+    </w:p>
+    <w:p>
+      <w:pPr>
+        <w:ind w:left="1134"/>
+      </w:pPr>
+      <w:r>
+        <w:t>Vérifie que lorsque le joueur tire ou que les classes gèrent les tirs, les projectiles se comportent correctement et avancent selon leur vitesse.</w:t>
+      </w:r>
+    </w:p>
+    <w:p>
+      <w:pPr>
+        <w:pStyle w:val="Heading2"/>
+      </w:pPr>
+      <w:r>
+        <w:t>Disparition des balles</w:t>
+      </w:r>
+    </w:p>
+    <w:p>
+      <w:pPr>
+        <w:ind w:left="1134"/>
+      </w:pPr>
+      <w:r>
+        <w:t>S'assure qu'une balle se supprime d'elle-même ou devient hors de l'espace de jeu (</w:t>
+      </w:r>
+      <w:proofErr w:type="spellStart"/>
+      <w:r>
+        <w:t>outofspace</w:t>
+      </w:r>
+      <w:proofErr w:type="spellEnd"/>
+      <w:r>
+        <w:t>) après un certain parcours.</w:t>
+      </w:r>
+    </w:p>
+    <w:p>
+      <w:pPr>
+        <w:pStyle w:val="Heading2"/>
+      </w:pPr>
+      <w:r>
+        <w:t>Augmentation du score</w:t>
+      </w:r>
+    </w:p>
+    <w:p>
+      <w:pPr>
+        <w:ind w:left="426" w:firstLine="708"/>
+      </w:pPr>
+      <w:r>
+        <w:t>Vérifie que le score augmente bien lorsqu'un ennemi est vaincu.</w:t>
+      </w:r>
+    </w:p>
+    <w:p>
+      <w:pPr>
+        <w:pStyle w:val="Heading2"/>
+      </w:pPr>
+      <w:r>
+        <w:t>Limites de zone d'écran</w:t>
+      </w:r>
+    </w:p>
+    <w:p>
+      <w:pPr>
+        <w:ind w:left="1134"/>
+      </w:pPr>
+      <w:r>
+        <w:t>S'assure que le joueur reste confiné ou gère correctement les limites de l'espace de jeu défini dans Config.</w:t>
+      </w:r>
+    </w:p>
+    <w:p>
+      <w:pPr>
+        <w:pStyle w:val="Heading2"/>
+      </w:pPr>
       <w:r>
         <w:lastRenderedPageBreak/>
-        <w:t>résultats obtenus et les actions à entreprendre en conséquence</w:t>
-      </w:r>
-      <w:r>
-        <w:t xml:space="preserve"> (et une estimation de leur durée)</w:t>
-      </w:r>
-      <w:r>
-        <w:t>.</w:t>
-      </w:r>
-    </w:p>
-    <w:p>
-      <w:pPr>
-        <w:pStyle w:val="Informations"/>
-        <w:numPr>
-          <w:ilvl w:val="5"/>
-          <w:numId w:val="22"/>
-        </w:numPr>
-      </w:pPr>
-      <w:r>
-        <w:t xml:space="preserve">Si des tests prévus dans la stratégie n'ont pas pu être </w:t>
-      </w:r>
-      <w:r>
-        <w:t>effectués :</w:t>
-      </w:r>
-    </w:p>
-    <w:p>
-      <w:pPr>
-        <w:pStyle w:val="Informations"/>
-        <w:numPr>
-          <w:ilvl w:val="6"/>
-          <w:numId w:val="22"/>
-        </w:numPr>
-      </w:pPr>
-      <w:r>
-        <w:t>raison, décisions, etc.</w:t>
-      </w:r>
-    </w:p>
-    <w:p>
-      <w:pPr>
-        <w:pStyle w:val="Informations"/>
-        <w:numPr>
-          <w:ilvl w:val="5"/>
-          <w:numId w:val="22"/>
-        </w:numPr>
-      </w:pPr>
-      <w:r>
-        <w:t>Liste des bugs répertoriés avec la date de découverte et leur état:</w:t>
-      </w:r>
-    </w:p>
-    <w:p>
-      <w:pPr>
-        <w:pStyle w:val="Informations"/>
-        <w:numPr>
-          <w:ilvl w:val="6"/>
-          <w:numId w:val="22"/>
-        </w:numPr>
-      </w:pPr>
-      <w:r>
-        <w:t>Corrigé</w:t>
-      </w:r>
-      <w:r>
-        <w:t xml:space="preserve">, </w:t>
-      </w:r>
-      <w:r>
-        <w:t>date de correction, corrigé par, etc.</w:t>
-      </w:r>
-    </w:p>
-    <w:p>
-      <w:pPr>
-        <w:pStyle w:val="Titre1"/>
-      </w:pPr>
-      <w:bookmarkStart w:id="34" w:name="_Toc165969653"/>
-      <w:bookmarkStart w:id="35" w:name="_Toc240025470"/>
-      <w:r>
-        <w:t>Conclusion</w:t>
-      </w:r>
-      <w:bookmarkEnd w:id="34"/>
-      <w:bookmarkEnd w:id="35"/>
-    </w:p>
-    <w:p>
-      <w:pPr>
-        <w:pStyle w:val="Titre2"/>
-      </w:pPr>
-      <w:bookmarkStart w:id="36" w:name="_Toc165969654"/>
-      <w:bookmarkStart w:id="37" w:name="_Toc240025471"/>
-      <w:r>
-        <w:t xml:space="preserve">Bilan des </w:t>
-      </w:r>
-      <w:bookmarkEnd w:id="36"/>
-      <w:r>
-        <w:t>fonctionnalités demandées</w:t>
-      </w:r>
-      <w:bookmarkEnd w:id="37"/>
-    </w:p>
-    <w:p>
-      <w:pPr>
-        <w:pStyle w:val="Informations"/>
-        <w:numPr>
-          <w:ilvl w:val="5"/>
-          <w:numId w:val="23"/>
-        </w:numPr>
-      </w:pPr>
-      <w:r>
-        <w:t xml:space="preserve">Il s’agit de reprendre point par point les fonctionnalités décrites dans les spécifications de départ </w:t>
-      </w:r>
-      <w:r>
-        <w:t>et de définir si elles sont atteintes ou pas, et pourquoi.</w:t>
-      </w:r>
-    </w:p>
-    <w:p>
-      <w:pPr>
-        <w:pStyle w:val="Informations"/>
-        <w:numPr>
-          <w:ilvl w:val="5"/>
-          <w:numId w:val="23"/>
-        </w:numPr>
-      </w:pPr>
-      <w:r>
-        <w:t>Si ce n’est pas le cas, estimer</w:t>
-      </w:r>
-      <w:r>
-        <w:t xml:space="preserve"> en « % » ou en « temps supplémentaire » </w:t>
-      </w:r>
-      <w:r>
-        <w:t>le travail qu’il reste à accomplir pour terminer le tout.</w:t>
-      </w:r>
-    </w:p>
-    <w:p>
-      <w:pPr>
-        <w:pStyle w:val="Titre2"/>
-      </w:pPr>
-      <w:bookmarkStart w:id="38" w:name="_Toc165969655"/>
-      <w:bookmarkStart w:id="39" w:name="_Toc240025472"/>
-      <w:r>
-        <w:t>Bilan de la planification</w:t>
-      </w:r>
-      <w:bookmarkEnd w:id="38"/>
-      <w:bookmarkEnd w:id="39"/>
-    </w:p>
-    <w:p>
-      <w:pPr>
-        <w:pStyle w:val="Informations"/>
-        <w:numPr>
-          <w:ilvl w:val="5"/>
-          <w:numId w:val="24"/>
-        </w:numPr>
-      </w:pPr>
-      <w:r>
-        <w:t xml:space="preserve">Distinguer </w:t>
-      </w:r>
-      <w:r>
-        <w:t xml:space="preserve">et expliquer </w:t>
-      </w:r>
-      <w:r>
-        <w:t xml:space="preserve">les tâches qui ont généré des retards ou de l'avance dans la </w:t>
-      </w:r>
-      <w:r>
-        <w:t>gestion du</w:t>
-      </w:r>
-      <w:r>
-        <w:t xml:space="preserve"> projet.</w:t>
-      </w:r>
-      <w:r>
-        <w:t xml:space="preserve"> Indiquer </w:t>
-      </w:r>
-      <w:proofErr w:type="gramStart"/>
-      <w:r>
-        <w:t>les différence</w:t>
-      </w:r>
-      <w:proofErr w:type="gramEnd"/>
-      <w:r>
-        <w:t xml:space="preserve"> entre les planifications initiales et détaillées avec le journal de travail.</w:t>
-      </w:r>
-    </w:p>
-    <w:p>
-      <w:pPr>
-        <w:pStyle w:val="Titre2"/>
-      </w:pPr>
-      <w:bookmarkStart w:id="40" w:name="_Toc165969656"/>
-      <w:bookmarkStart w:id="41" w:name="_Toc240025473"/>
-      <w:r>
-        <w:t>Bilan personnel</w:t>
-      </w:r>
-      <w:bookmarkEnd w:id="40"/>
-      <w:bookmarkEnd w:id="41"/>
-    </w:p>
-    <w:p>
-      <w:pPr>
-        <w:pStyle w:val="Informations"/>
-        <w:numPr>
-          <w:ilvl w:val="5"/>
-          <w:numId w:val="24"/>
-        </w:numPr>
-      </w:pPr>
-      <w:r>
-        <w:t>Si c’était à refaire</w:t>
-      </w:r>
-      <w:r>
-        <w:t>:</w:t>
-      </w:r>
-    </w:p>
-    <w:p>
-      <w:pPr>
-        <w:pStyle w:val="Informations"/>
-        <w:numPr>
-          <w:ilvl w:val="6"/>
-          <w:numId w:val="24"/>
-        </w:numPr>
-      </w:pPr>
-      <w:r>
-        <w:t>Q</w:t>
-      </w:r>
-      <w:r>
-        <w:t xml:space="preserve">u’est-ce </w:t>
-      </w:r>
-      <w:r>
-        <w:t>qu’il faudrait garder</w:t>
-      </w:r>
-      <w:r>
-        <w:t> </w:t>
-      </w:r>
-      <w:r>
-        <w:t>? Les</w:t>
-      </w:r>
-      <w:r>
-        <w:t xml:space="preserve"> plus et les moins ?</w:t>
-      </w:r>
-    </w:p>
-    <w:p>
-      <w:pPr>
-        <w:pStyle w:val="Informations"/>
-        <w:numPr>
-          <w:ilvl w:val="6"/>
-          <w:numId w:val="24"/>
-        </w:numPr>
-      </w:pPr>
-      <w:r>
-        <w:t>Q</w:t>
-      </w:r>
-      <w:r>
-        <w:t xml:space="preserve">u’est-ce </w:t>
-      </w:r>
-      <w:r>
-        <w:t>qu’il faudrait gérer, réaliser ou traiter différemment ?</w:t>
-      </w:r>
-    </w:p>
-    <w:p>
-      <w:pPr>
-        <w:pStyle w:val="Informations"/>
-        <w:numPr>
-          <w:ilvl w:val="5"/>
-          <w:numId w:val="24"/>
-        </w:numPr>
-      </w:pPr>
-      <w:r>
-        <w:t>Qu’est que ce projet m’a appris ?</w:t>
-      </w:r>
-    </w:p>
-    <w:p>
-      <w:pPr>
-        <w:pStyle w:val="Informations"/>
-        <w:numPr>
-          <w:ilvl w:val="5"/>
-          <w:numId w:val="24"/>
-        </w:numPr>
-      </w:pPr>
-      <w:r>
-        <w:t>Suite à donner, améliorations souhaitables, …</w:t>
-      </w:r>
-    </w:p>
-    <w:p>
-      <w:pPr>
-        <w:pStyle w:val="Informations"/>
-        <w:numPr>
-          <w:ilvl w:val="5"/>
-          <w:numId w:val="24"/>
-        </w:numPr>
-      </w:pPr>
-      <w:r>
-        <w:t>Remerciements, signature, etc.</w:t>
-      </w:r>
-    </w:p>
-    <w:p>
-      <w:pPr>
-        <w:pStyle w:val="Titre1"/>
-      </w:pPr>
-      <w:bookmarkStart w:id="42" w:name="_Toc532179971"/>
-      <w:bookmarkStart w:id="43" w:name="_Toc165969657"/>
-      <w:bookmarkStart w:id="44" w:name="_Toc240025474"/>
-      <w:r>
-        <w:t>Divers</w:t>
-      </w:r>
-      <w:bookmarkEnd w:id="42"/>
-      <w:bookmarkEnd w:id="43"/>
-      <w:bookmarkEnd w:id="44"/>
-    </w:p>
-    <w:p>
-      <w:pPr>
-        <w:pStyle w:val="Titre2"/>
-      </w:pPr>
-      <w:bookmarkStart w:id="45" w:name="_Toc532179972"/>
-      <w:bookmarkStart w:id="46" w:name="_Toc165969658"/>
-      <w:bookmarkStart w:id="47" w:name="_Toc240025475"/>
-      <w:r>
-        <w:t>Journal de travail</w:t>
-      </w:r>
-      <w:bookmarkEnd w:id="45"/>
-      <w:bookmarkEnd w:id="46"/>
-      <w:bookmarkEnd w:id="47"/>
-    </w:p>
-    <w:p>
-      <w:pPr>
-        <w:pStyle w:val="Informations"/>
-        <w:numPr>
-          <w:ilvl w:val="5"/>
-          <w:numId w:val="25"/>
-        </w:numPr>
-      </w:pPr>
-      <w:r>
-        <w:t>Date, activité</w:t>
-      </w:r>
-      <w:r>
-        <w:t xml:space="preserve"> (description qui permet</w:t>
-      </w:r>
-      <w:r>
-        <w:t xml:space="preserve"> de reproduire le cheminement du projet)</w:t>
-      </w:r>
-      <w:r>
-        <w:t>, durée</w:t>
-      </w:r>
-      <w:r>
-        <w:t>, liens et références sur des documents externes</w:t>
-      </w:r>
-      <w:r>
-        <w:t>.</w:t>
-      </w:r>
-      <w:r>
-        <w:t xml:space="preserve"> Lorsqu’une activité de recherches a été entreprise, il convient d’énumérer ce qui a été trouvé, avec les références.</w:t>
-      </w:r>
-    </w:p>
-    <w:p>
-      <w:pPr>
-        <w:pStyle w:val="Titre2"/>
-      </w:pPr>
-      <w:bookmarkStart w:id="48" w:name="_Toc240025476"/>
-      <w:r>
-        <w:t>Bibliographie</w:t>
-      </w:r>
-      <w:bookmarkEnd w:id="48"/>
-    </w:p>
-    <w:p>
-      <w:pPr>
-        <w:pStyle w:val="Informations"/>
-        <w:numPr>
-          <w:ilvl w:val="5"/>
-          <w:numId w:val="25"/>
-        </w:numPr>
-      </w:pPr>
-      <w:r>
-        <w:t>Références des livres</w:t>
-      </w:r>
-      <w:r>
-        <w:t>, revues et publications</w:t>
-      </w:r>
-      <w:r>
-        <w:t xml:space="preserve"> u</w:t>
-      </w:r>
-      <w:r>
-        <w:t>tilisés durant le projet.</w:t>
-      </w:r>
-    </w:p>
-    <w:p>
-      <w:pPr>
-        <w:pStyle w:val="Titre2"/>
-      </w:pPr>
-      <w:bookmarkStart w:id="49" w:name="_Toc240025477"/>
-      <w:r>
-        <w:t>Webographie</w:t>
-      </w:r>
-      <w:bookmarkEnd w:id="49"/>
-    </w:p>
-    <w:p>
-      <w:pPr>
-        <w:pStyle w:val="Informations"/>
-        <w:numPr>
-          <w:ilvl w:val="5"/>
-          <w:numId w:val="25"/>
-        </w:numPr>
-      </w:pPr>
-      <w:r>
-        <w:t>Références des sites Internet consultés durant le projet.</w:t>
-      </w:r>
-    </w:p>
-    <w:p>
-      <w:pPr>
-        <w:pStyle w:val="Titre1"/>
-      </w:pPr>
-      <w:bookmarkStart w:id="50" w:name="_Toc240025478"/>
-      <w:r>
-        <w:t>Annexes</w:t>
-      </w:r>
-      <w:bookmarkEnd w:id="50"/>
-    </w:p>
-    <w:p>
-      <w:pPr>
-        <w:pStyle w:val="Informations"/>
-        <w:numPr>
-          <w:ilvl w:val="5"/>
-          <w:numId w:val="25"/>
-        </w:numPr>
-      </w:pPr>
-      <w:r>
-        <w:t>Listing du code source (partiel ou, plus rarement complet)</w:t>
-      </w:r>
-    </w:p>
-    <w:p>
-      <w:pPr>
-        <w:pStyle w:val="Informations"/>
-        <w:numPr>
-          <w:ilvl w:val="5"/>
-          <w:numId w:val="25"/>
-        </w:numPr>
-      </w:pPr>
-      <w:r>
-        <w:t>Guide</w:t>
-      </w:r>
-      <w:r>
-        <w:t>(s)</w:t>
-      </w:r>
-      <w:r>
-        <w:t xml:space="preserve"> d’utilisation et/ou guide de l’administrateur</w:t>
-      </w:r>
-    </w:p>
-    <w:p>
-      <w:pPr>
-        <w:pStyle w:val="Informations"/>
-        <w:numPr>
-          <w:ilvl w:val="5"/>
-          <w:numId w:val="25"/>
-        </w:numPr>
-      </w:pPr>
-      <w:r>
-        <w:t>Etat ou</w:t>
-      </w:r>
-      <w:r>
-        <w:t xml:space="preserve"> « dump » </w:t>
-      </w:r>
-      <w:r>
-        <w:t xml:space="preserve">de la configuration </w:t>
-      </w:r>
-      <w:r>
-        <w:t>des équipements</w:t>
-      </w:r>
-      <w:r>
-        <w:t xml:space="preserve"> (routeur, switch, robot, etc.).</w:t>
-      </w:r>
-    </w:p>
-    <w:p>
-      <w:pPr>
-        <w:pStyle w:val="Informations"/>
-        <w:numPr>
-          <w:ilvl w:val="5"/>
-          <w:numId w:val="25"/>
-        </w:numPr>
-      </w:pPr>
-      <w:r>
-        <w:t>Extraits</w:t>
-      </w:r>
-      <w:r>
-        <w:t xml:space="preserve"> de catalogue, documentation de fabricant</w:t>
-      </w:r>
-      <w:r>
-        <w:t>, etc.</w:t>
+        <w:t>Collision avec les protections</w:t>
+      </w:r>
+    </w:p>
+    <w:p>
+      <w:pPr>
+        <w:ind w:left="1134"/>
+      </w:pPr>
+      <w:r>
+        <w:t xml:space="preserve">S'assure de la bonne détection de distance (via </w:t>
+      </w:r>
+      <w:proofErr w:type="spellStart"/>
+      <w:r>
+        <w:t>MathHelpers.Distance</w:t>
+      </w:r>
+      <w:proofErr w:type="spellEnd"/>
+      <w:r>
+        <w:t>) pour les collisions entre entités, tirs et barrières.</w:t>
+      </w:r>
+    </w:p>
+    <w:p>
+      <w:pPr>
+        <w:pStyle w:val="Heading1"/>
+      </w:pPr>
+      <w:r>
+        <w:t>CONCEPTION</w:t>
+      </w:r>
+    </w:p>
+    <w:p>
+      <w:pPr>
+        <w:pStyle w:val="Heading2"/>
+      </w:pPr>
+      <w:r>
+        <w:t>Avant le codage</w:t>
+      </w:r>
+    </w:p>
+    <w:p>
+      <w:pPr>
+        <w:ind w:left="1134"/>
+      </w:pPr>
+      <w:r>
+        <w:t>J'ai commencé par créer les différentes User Stories pour organiser l'ensemble des fonctionnalités à coder et estimer le temps nécessaire.</w:t>
+      </w:r>
+    </w:p>
+    <w:p>
+      <w:pPr>
+        <w:pStyle w:val="Heading2"/>
+      </w:pPr>
+      <w:r>
+        <w:t>Pendant le codage</w:t>
+      </w:r>
+    </w:p>
+    <w:p>
+      <w:pPr>
+        <w:ind w:left="1134"/>
+      </w:pPr>
+      <w:r>
+        <w:t>J'ai aussi essayé de respecter au plus le principe DRY en réutilisant des méthodes et fonctions afin de ne pas me répéter inutilement.</w:t>
+      </w:r>
+    </w:p>
+    <w:p>
+      <w:pPr>
+        <w:pStyle w:val="Heading1"/>
+      </w:pPr>
+      <w:r>
+        <w:t>EXPLICATION DE L'USAGE FAIT DE L'IA DANS CE PROJET</w:t>
+      </w:r>
+    </w:p>
+    <w:p>
+      <w:pPr>
+        <w:pStyle w:val="Heading2"/>
+      </w:pPr>
+      <w:r>
+        <w:t>Dans le code</w:t>
+      </w:r>
+    </w:p>
+    <w:p>
+      <w:pPr>
+        <w:ind w:left="1134"/>
+      </w:pPr>
+      <w:r>
+        <w:t>Durant le projet, l'IA m'a orienté quand j'ai été bloqué sur l'implémentation de mes US (gestion de l'affichage double buffer, structuration des classes Player, Ennemie, Tir, Barriere).</w:t>
+      </w:r>
+    </w:p>
+    <w:p>
+      <w:pPr>
+        <w:pStyle w:val="Heading2"/>
+      </w:pPr>
+      <w:r>
+        <w:t>Hors code</w:t>
+      </w:r>
+    </w:p>
+    <w:p>
+      <w:pPr>
+        <w:ind w:left="1134"/>
+      </w:pPr>
+      <w:r>
+        <w:t>J'ai utilisé l'aide externe et l'IA afin de résoudre des erreurs avec le compilateur et Visual Studio 2022.</w:t>
+      </w:r>
+    </w:p>
+    <w:p>
+      <w:pPr>
+        <w:pStyle w:val="Heading1"/>
+      </w:pPr>
+      <w:r>
+        <w:t>BILAN DU DÉROULEMENT DU PROJET</w:t>
+      </w:r>
+    </w:p>
+    <w:p>
+      <w:pPr>
+        <w:ind w:left="567"/>
+      </w:pPr>
+      <w:r>
+        <w:t>Sur le début du projet je bloquais énormément car j'avais du mal à comprendre la programmation orientée objet, mais par la suite, le projet s'est majoritairement bien passé. J'ai réussi à coder les fonctionnalités du cahier des charges et aussi d'autres options en plus. J'ai quand même rencontré quelques difficultés, notamment pour gérer les collisions et l'affichage fluide, mais j'ai réussi à tout régler au fur et à mesure.</w:t>
+      </w:r>
+    </w:p>
+    <w:p>
+      <w:pPr>
+        <w:pStyle w:val="Heading1"/>
+      </w:pPr>
+      <w:r>
+        <w:t>BILAN PRODUIT</w:t>
+      </w:r>
+    </w:p>
+    <w:p>
+      <w:pPr>
+        <w:ind w:left="567"/>
+      </w:pPr>
+      <w:r>
+        <w:t>Le résultat final correspond à ce que je voulais faire. Le jeu est fonctionnel, jouable et reprend bien le style demandé dans le cahier des charges. Ce projet m'a permis d'en apprendre beaucoup en programmation orientée objet et en Windows Forms.</w:t>
+      </w:r>
+    </w:p>
+    <w:p>
+      <w:pPr>
+        <w:pStyle w:val="Heading1"/>
+      </w:pPr>
+      <w:r>
+        <w:t>CONCLUSION</w:t>
+      </w:r>
+    </w:p>
+    <w:p>
+      <w:pPr>
+        <w:ind w:left="567"/>
+      </w:pPr>
+      <w:r>
+        <w:t>En conclusion, réaliser ce jeu a été une très bonne expérience. Même si le début était compliqué à cause de la programmation orientée objet, ce jeu m'a vraiment aidé à mieux comprendre cette dernière. Ce projet m'a permis d'en apprendre beaucoup en C# et je suis satisfait du produit final.</w:t>
       </w:r>
     </w:p>
     <w:sectPr>
@@ -4786,7 +4273,7 @@
 <w:ftr xmlns:wpc="http://schemas.microsoft.com/office/word/2010/wordprocessingCanvas" xmlns:cx="http://schemas.microsoft.com/office/drawing/2014/chartex" xmlns:cx1="http://schemas.microsoft.com/office/drawing/2015/9/8/chartex" xmlns:cx2="http://schemas.microsoft.com/office/drawing/2015/10/21/chartex" xmlns:cx3="http://schemas.microsoft.com/office/drawing/2016/5/9/chartex" xmlns:cx4="http://schemas.microsoft.com/office/drawing/2016/5/10/chartex" xmlns:cx5="http://schemas.microsoft.com/office/drawing/2016/5/11/chartex" xmlns:cx6="http://schemas.microsoft.com/office/drawing/2016/5/12/chartex" xmlns:cx7="http://schemas.microsoft.com/office/drawing/2016/5/13/chartex" xmlns:cx8="http://schemas.microsoft.com/office/drawing/2016/5/14/chartex" xmlns:mc="http://schemas.openxmlformats.org/markup-compatibility/2006" xmlns:aink="http://schemas.microsoft.com/office/drawing/2016/ink" xmlns:am3d="http://schemas.microsoft.com/office/drawing/2017/model3d" xmlns:o="urn:schemas-microsoft-com:office:office" xmlns:oel="http://schemas.microsoft.com/office/2019/extlst" xmlns:r="http://schemas.openxmlformats.org/officeDocument/2006/relationships" xmlns:m="http://schemas.openxmlformats.org/officeDocument/2006/math" xmlns:v="urn:schemas-microsoft-com:vml" xmlns:wp14="http://schemas.microsoft.com/office/word/2010/wordprocessingDrawing" xmlns:wp="http://schemas.openxmlformats.org/drawingml/2006/wordprocessingDrawing" xmlns:w10="urn:schemas-microsoft-com:office:word" xmlns:w="http://schemas.openxmlformats.org/wordprocessingml/2006/main" xmlns:w14="http://schemas.microsoft.com/office/word/2010/wordml" xmlns:w15="http://schemas.microsoft.com/office/word/2012/wordml" xmlns:w16cex="http://schemas.microsoft.com/office/word/2018/wordml/cex" xmlns:w16cid="http://schemas.microsoft.com/office/word/2016/wordml/cid" xmlns:w16="http://schemas.microsoft.com/office/word/2018/wordml" xmlns:w16du="http://schemas.microsoft.com/office/word/2023/wordml/word16du" xmlns:w16sdtdh="http://schemas.microsoft.com/office/word/2020/wordml/sdtdatahash" xmlns:w16sdtfl="http://schemas.microsoft.com/office/word/2024/wordml/sdtformatlock" xmlns:w16se="http://schemas.microsoft.com/office/word/2015/wordml/symex" xmlns:wpg="http://schemas.microsoft.com/office/word/2010/wordprocessingGroup" xmlns:wpi="http://schemas.microsoft.com/office/word/2010/wordprocessingInk" xmlns:wne="http://schemas.microsoft.com/office/word/2006/wordml" xmlns:wps="http://schemas.microsoft.com/office/word/2010/wordprocessingShape" mc:Ignorable="w14 w15 w16se w16cid w16 w16cex w16sdtdh w16sdtfl w16du wp14">
   <w:tbl>
     <w:tblPr>
-      <w:tblStyle w:val="Grilledutableau"/>
+      <w:tblStyle w:val="TableGrid"/>
       <w:tblW w:w="5000" w:type="pct"/>
       <w:jc w:val="center"/>
       <w:tblBorders>
@@ -5003,7 +4490,7 @@
           </w:r>
           <w:r>
             <w:rPr>
-              <w:rStyle w:val="Numrodepage"/>
+              <w:rStyle w:val="PageNumber"/>
               <w:rFonts w:cs="Arial"/>
               <w:szCs w:val="16"/>
             </w:rPr>
@@ -5011,7 +4498,7 @@
           </w:r>
           <w:r>
             <w:rPr>
-              <w:rStyle w:val="Numrodepage"/>
+              <w:rStyle w:val="PageNumber"/>
               <w:rFonts w:cs="Arial"/>
               <w:szCs w:val="16"/>
             </w:rPr>
@@ -5019,7 +4506,7 @@
           </w:r>
           <w:r>
             <w:rPr>
-              <w:rStyle w:val="Numrodepage"/>
+              <w:rStyle w:val="PageNumber"/>
               <w:rFonts w:cs="Arial"/>
               <w:szCs w:val="16"/>
             </w:rPr>
@@ -5027,7 +4514,7 @@
           </w:r>
           <w:r>
             <w:rPr>
-              <w:rStyle w:val="Numrodepage"/>
+              <w:rStyle w:val="PageNumber"/>
               <w:rFonts w:cs="Arial"/>
               <w:noProof/>
               <w:szCs w:val="16"/>
@@ -5036,7 +4523,7 @@
           </w:r>
           <w:r>
             <w:rPr>
-              <w:rStyle w:val="Numrodepage"/>
+              <w:rStyle w:val="PageNumber"/>
               <w:rFonts w:cs="Arial"/>
               <w:szCs w:val="16"/>
             </w:rPr>
@@ -5044,7 +4531,7 @@
           </w:r>
           <w:r>
             <w:rPr>
-              <w:rStyle w:val="Numrodepage"/>
+              <w:rStyle w:val="PageNumber"/>
               <w:rFonts w:cs="Arial"/>
               <w:szCs w:val="16"/>
             </w:rPr>
@@ -5052,7 +4539,7 @@
           </w:r>
           <w:r>
             <w:rPr>
-              <w:rStyle w:val="Numrodepage"/>
+              <w:rStyle w:val="PageNumber"/>
               <w:rFonts w:cs="Arial"/>
               <w:szCs w:val="16"/>
             </w:rPr>
@@ -5060,7 +4547,7 @@
           </w:r>
           <w:r>
             <w:rPr>
-              <w:rStyle w:val="Numrodepage"/>
+              <w:rStyle w:val="PageNumber"/>
               <w:rFonts w:cs="Arial"/>
               <w:szCs w:val="16"/>
             </w:rPr>
@@ -5068,7 +4555,7 @@
           </w:r>
           <w:r>
             <w:rPr>
-              <w:rStyle w:val="Numrodepage"/>
+              <w:rStyle w:val="PageNumber"/>
               <w:rFonts w:cs="Arial"/>
               <w:szCs w:val="16"/>
             </w:rPr>
@@ -5076,7 +4563,7 @@
           </w:r>
           <w:r>
             <w:rPr>
-              <w:rStyle w:val="Numrodepage"/>
+              <w:rStyle w:val="PageNumber"/>
               <w:rFonts w:cs="Arial"/>
               <w:noProof/>
               <w:szCs w:val="16"/>
@@ -5085,7 +4572,7 @@
           </w:r>
           <w:r>
             <w:rPr>
-              <w:rStyle w:val="Numrodepage"/>
+              <w:rStyle w:val="PageNumber"/>
               <w:rFonts w:cs="Arial"/>
               <w:szCs w:val="16"/>
             </w:rPr>
@@ -5237,7 +4724,7 @@
               <w:noProof/>
               <w:szCs w:val="16"/>
             </w:rPr>
-            <w:t>04.09.2026 16:21</w:t>
+            <w:t>11.09.2026 16:34</w:t>
           </w:r>
           <w:r>
             <w:rPr>
@@ -5285,7 +4772,7 @@
   </w:tbl>
   <w:p>
     <w:pPr>
-      <w:pStyle w:val="Pieddepage"/>
+      <w:pStyle w:val="Footer"/>
       <w:rPr>
         <w:sz w:val="2"/>
         <w:szCs w:val="2"/>
@@ -5318,7 +4805,7 @@
 <w:hdr xmlns:wpc="http://schemas.microsoft.com/office/word/2010/wordprocessingCanvas" xmlns:cx="http://schemas.microsoft.com/office/drawing/2014/chartex" xmlns:cx1="http://schemas.microsoft.com/office/drawing/2015/9/8/chartex" xmlns:cx2="http://schemas.microsoft.com/office/drawing/2015/10/21/chartex" xmlns:cx3="http://schemas.microsoft.com/office/drawing/2016/5/9/chartex" xmlns:cx4="http://schemas.microsoft.com/office/drawing/2016/5/10/chartex" xmlns:cx5="http://schemas.microsoft.com/office/drawing/2016/5/11/chartex" xmlns:cx6="http://schemas.microsoft.com/office/drawing/2016/5/12/chartex" xmlns:cx7="http://schemas.microsoft.com/office/drawing/2016/5/13/chartex" xmlns:cx8="http://schemas.microsoft.com/office/drawing/2016/5/14/chartex" xmlns:mc="http://schemas.openxmlformats.org/markup-compatibility/2006" xmlns:aink="http://schemas.microsoft.com/office/drawing/2016/ink" xmlns:am3d="http://schemas.microsoft.com/office/drawing/2017/model3d" xmlns:o="urn:schemas-microsoft-com:office:office" xmlns:oel="http://schemas.microsoft.com/office/2019/extlst" xmlns:r="http://schemas.openxmlformats.org/officeDocument/2006/relationships" xmlns:m="http://schemas.openxmlformats.org/officeDocument/2006/math" xmlns:v="urn:schemas-microsoft-com:vml" xmlns:wp14="http://schemas.microsoft.com/office/word/2010/wordprocessingDrawing" xmlns:wp="http://schemas.openxmlformats.org/drawingml/2006/wordprocessingDrawing" xmlns:w10="urn:schemas-microsoft-com:office:word" xmlns:w="http://schemas.openxmlformats.org/wordprocessingml/2006/main" xmlns:w14="http://schemas.microsoft.com/office/word/2010/wordml" xmlns:w15="http://schemas.microsoft.com/office/word/2012/wordml" xmlns:w16cex="http://schemas.microsoft.com/office/word/2018/wordml/cex" xmlns:w16cid="http://schemas.microsoft.com/office/word/2016/wordml/cid" xmlns:w16="http://schemas.microsoft.com/office/word/2018/wordml" xmlns:w16du="http://schemas.microsoft.com/office/word/2023/wordml/word16du" xmlns:w16sdtdh="http://schemas.microsoft.com/office/word/2020/wordml/sdtdatahash" xmlns:w16sdtfl="http://schemas.microsoft.com/office/word/2024/wordml/sdtformatlock" xmlns:w16se="http://schemas.microsoft.com/office/word/2015/wordml/symex" xmlns:wpg="http://schemas.microsoft.com/office/word/2010/wordprocessingGroup" xmlns:wpi="http://schemas.microsoft.com/office/word/2010/wordprocessingInk" xmlns:wne="http://schemas.microsoft.com/office/word/2006/wordml" xmlns:wps="http://schemas.microsoft.com/office/word/2010/wordprocessingShape" mc:Ignorable="w14 w15 w16se w16cid w16 w16cex w16sdtdh w16sdtfl w16du wp14">
   <w:tbl>
     <w:tblPr>
-      <w:tblStyle w:val="Grilledutableau"/>
+      <w:tblStyle w:val="TableGrid"/>
       <w:tblW w:w="5000" w:type="pct"/>
       <w:jc w:val="center"/>
       <w:tblBorders>
@@ -5330,9 +4817,9 @@
       <w:tblLook w:val="01E0" w:firstRow="1" w:lastRow="1" w:firstColumn="1" w:lastColumn="1" w:noHBand="0" w:noVBand="0"/>
     </w:tblPr>
     <w:tblGrid>
-      <w:gridCol w:w="2402"/>
-      <w:gridCol w:w="4400"/>
-      <w:gridCol w:w="2268"/>
+      <w:gridCol w:w="2390"/>
+      <w:gridCol w:w="4411"/>
+      <w:gridCol w:w="2269"/>
     </w:tblGrid>
     <w:tr>
       <w:trPr>
@@ -5367,7 +4854,7 @@
         </w:tcPr>
         <w:p>
           <w:pPr>
-            <w:pStyle w:val="En-tte"/>
+            <w:pStyle w:val="Header"/>
             <w:jc w:val="right"/>
           </w:pPr>
           <w:r>
@@ -5426,7 +4913,7 @@
   </w:tbl>
   <w:p>
     <w:pPr>
-      <w:pStyle w:val="En-tte"/>
+      <w:pStyle w:val="Header"/>
     </w:pPr>
   </w:p>
 </w:hdr>
@@ -5455,7 +4942,7 @@
         <v:path o:extrusionok="f" gradientshapeok="t" o:connecttype="rect"/>
         <o:lock v:ext="edit" aspectratio="t"/>
       </v:shapetype>
-      <v:shape id="_x0000_i1025" type="#_x0000_t75" style="width:12.1pt;height:12.1pt" o:bullet="t">
+      <v:shape id="_x0000_i1025" type="#_x0000_t75" style="width:12pt;height:12pt" o:bullet="t">
         <v:imagedata r:id="rId1" o:title="BD10263_"/>
       </v:shape>
     </w:pict>
@@ -5825,7 +5312,7 @@
     <w:lvl w:ilvl="4">
       <w:start w:val="1"/>
       <w:numFmt w:val="decimal"/>
-      <w:pStyle w:val="Titre5"/>
+      <w:pStyle w:val="Heading5"/>
       <w:lvlText w:val="%1.%2.%3.%4.%5"/>
       <w:lvlJc w:val="left"/>
       <w:pPr>
@@ -5841,7 +5328,7 @@
     <w:lvl w:ilvl="5">
       <w:start w:val="1"/>
       <w:numFmt w:val="decimal"/>
-      <w:pStyle w:val="Titre6"/>
+      <w:pStyle w:val="Heading6"/>
       <w:lvlText w:val="%1.%2.%3.%4.%5.%6"/>
       <w:lvlJc w:val="left"/>
       <w:pPr>
@@ -5857,7 +5344,7 @@
     <w:lvl w:ilvl="6">
       <w:start w:val="1"/>
       <w:numFmt w:val="decimal"/>
-      <w:pStyle w:val="Titre7"/>
+      <w:pStyle w:val="Heading7"/>
       <w:lvlText w:val="%1.%2.%3.%4.%5.%6.%7"/>
       <w:lvlJc w:val="left"/>
       <w:pPr>
@@ -5873,7 +5360,7 @@
     <w:lvl w:ilvl="7">
       <w:start w:val="1"/>
       <w:numFmt w:val="decimal"/>
-      <w:pStyle w:val="Titre8"/>
+      <w:pStyle w:val="Heading8"/>
       <w:lvlText w:val="%1.%2.%3.%4.%5.%6.%7.%8"/>
       <w:lvlJc w:val="left"/>
       <w:pPr>
@@ -5889,7 +5376,7 @@
     <w:lvl w:ilvl="8">
       <w:start w:val="1"/>
       <w:numFmt w:val="decimal"/>
-      <w:pStyle w:val="Titre9"/>
+      <w:pStyle w:val="Heading9"/>
       <w:lvlText w:val="%1.%2.%3.%4.%5.%6.%7.%8.%9"/>
       <w:lvlJc w:val="left"/>
       <w:pPr>
@@ -6752,7 +6239,7 @@
     <w:lvl w:ilvl="0">
       <w:start w:val="1"/>
       <w:numFmt w:val="decimal"/>
-      <w:pStyle w:val="Titre1"/>
+      <w:pStyle w:val="Heading1"/>
       <w:lvlText w:val="%1"/>
       <w:lvlJc w:val="left"/>
       <w:pPr>
@@ -6768,7 +6255,7 @@
     <w:lvl w:ilvl="1">
       <w:start w:val="1"/>
       <w:numFmt w:val="decimal"/>
-      <w:pStyle w:val="Titre2"/>
+      <w:pStyle w:val="Heading2"/>
       <w:lvlText w:val="%1.%2"/>
       <w:lvlJc w:val="left"/>
       <w:pPr>
@@ -6784,7 +6271,7 @@
     <w:lvl w:ilvl="2">
       <w:start w:val="1"/>
       <w:numFmt w:val="decimal"/>
-      <w:pStyle w:val="Titre3"/>
+      <w:pStyle w:val="Heading3"/>
       <w:lvlText w:val="%1.%2.%3"/>
       <w:lvlJc w:val="left"/>
       <w:pPr>
@@ -9375,10 +8862,10 @@
     <w:qFormat/>
     <w:rsid w:val="00615583"/>
   </w:style>
-  <w:style w:type="paragraph" w:styleId="Titre1">
+  <w:style w:type="paragraph" w:styleId="Heading1">
     <w:name w:val="heading 1"/>
     <w:basedOn w:val="Normal"/>
-    <w:next w:val="Corpsdetexte"/>
+    <w:next w:val="BodyText"/>
     <w:autoRedefine/>
     <w:qFormat/>
     <w:rsid w:val="00AA4393"/>
@@ -9401,10 +8888,10 @@
       <w:szCs w:val="32"/>
     </w:rPr>
   </w:style>
-  <w:style w:type="paragraph" w:styleId="Titre2">
+  <w:style w:type="paragraph" w:styleId="Heading2">
     <w:name w:val="heading 2"/>
     <w:basedOn w:val="Normal"/>
-    <w:next w:val="Retraitcorpsdetexte"/>
+    <w:next w:val="BodyTextIndent"/>
     <w:autoRedefine/>
     <w:qFormat/>
     <w:rsid w:val="00AA4393"/>
@@ -9426,10 +8913,10 @@
       <w:szCs w:val="28"/>
     </w:rPr>
   </w:style>
-  <w:style w:type="paragraph" w:styleId="Titre3">
+  <w:style w:type="paragraph" w:styleId="Heading3">
     <w:name w:val="heading 3"/>
     <w:basedOn w:val="Normal"/>
-    <w:next w:val="Retraitcorpsdetexte3"/>
+    <w:next w:val="BodyTextIndent3"/>
     <w:qFormat/>
     <w:rsid w:val="00AA4393"/>
     <w:pPr>
@@ -9449,7 +8936,7 @@
       <w:szCs w:val="26"/>
     </w:rPr>
   </w:style>
-  <w:style w:type="paragraph" w:styleId="Titre4">
+  <w:style w:type="paragraph" w:styleId="Heading4">
     <w:name w:val="heading 4"/>
     <w:basedOn w:val="Normal"/>
     <w:next w:val="Normal"/>
@@ -9468,7 +8955,7 @@
       <w:szCs w:val="28"/>
     </w:rPr>
   </w:style>
-  <w:style w:type="paragraph" w:styleId="Titre5">
+  <w:style w:type="paragraph" w:styleId="Heading5">
     <w:name w:val="heading 5"/>
     <w:basedOn w:val="Normal"/>
     <w:next w:val="Normal"/>
@@ -9492,7 +8979,7 @@
       <w:szCs w:val="26"/>
     </w:rPr>
   </w:style>
-  <w:style w:type="paragraph" w:styleId="Titre6">
+  <w:style w:type="paragraph" w:styleId="Heading6">
     <w:name w:val="heading 6"/>
     <w:basedOn w:val="Normal"/>
     <w:next w:val="Normal"/>
@@ -9514,7 +9001,7 @@
       <w:szCs w:val="22"/>
     </w:rPr>
   </w:style>
-  <w:style w:type="paragraph" w:styleId="Titre7">
+  <w:style w:type="paragraph" w:styleId="Heading7">
     <w:name w:val="heading 7"/>
     <w:basedOn w:val="Normal"/>
     <w:next w:val="Normal"/>
@@ -9532,7 +9019,7 @@
       <w:rFonts w:asciiTheme="majorHAnsi" w:hAnsiTheme="majorHAnsi"/>
     </w:rPr>
   </w:style>
-  <w:style w:type="paragraph" w:styleId="Titre8">
+  <w:style w:type="paragraph" w:styleId="Heading8">
     <w:name w:val="heading 8"/>
     <w:basedOn w:val="Normal"/>
     <w:next w:val="Normal"/>
@@ -9552,7 +9039,7 @@
       <w:iCs/>
     </w:rPr>
   </w:style>
-  <w:style w:type="paragraph" w:styleId="Titre9">
+  <w:style w:type="paragraph" w:styleId="Heading9">
     <w:name w:val="heading 9"/>
     <w:basedOn w:val="Normal"/>
     <w:next w:val="Normal"/>
@@ -9572,13 +9059,13 @@
       <w:szCs w:val="22"/>
     </w:rPr>
   </w:style>
-  <w:style w:type="character" w:default="1" w:styleId="Policepardfaut">
+  <w:style w:type="character" w:default="1" w:styleId="DefaultParagraphFont">
     <w:name w:val="Default Paragraph Font"/>
     <w:uiPriority w:val="1"/>
     <w:semiHidden/>
     <w:unhideWhenUsed/>
   </w:style>
-  <w:style w:type="table" w:default="1" w:styleId="TableauNormal">
+  <w:style w:type="table" w:default="1" w:styleId="TableNormal">
     <w:name w:val="Normal Table"/>
     <w:uiPriority w:val="99"/>
     <w:semiHidden/>
@@ -9593,13 +9080,13 @@
       </w:tblCellMar>
     </w:tblPr>
   </w:style>
-  <w:style w:type="numbering" w:default="1" w:styleId="Aucuneliste">
+  <w:style w:type="numbering" w:default="1" w:styleId="NoList">
     <w:name w:val="No List"/>
     <w:uiPriority w:val="99"/>
     <w:semiHidden/>
     <w:unhideWhenUsed/>
   </w:style>
-  <w:style w:type="paragraph" w:styleId="En-tte">
+  <w:style w:type="paragraph" w:styleId="Header">
     <w:name w:val="header"/>
     <w:basedOn w:val="Normal"/>
     <w:semiHidden/>
@@ -9611,7 +9098,7 @@
       </w:tabs>
     </w:pPr>
   </w:style>
-  <w:style w:type="paragraph" w:styleId="Pieddepage">
+  <w:style w:type="paragraph" w:styleId="Footer">
     <w:name w:val="footer"/>
     <w:basedOn w:val="Normal"/>
     <w:semiHidden/>
@@ -9623,9 +9110,9 @@
       </w:tabs>
     </w:pPr>
   </w:style>
-  <w:style w:type="table" w:styleId="Grilledutableau">
+  <w:style w:type="table" w:styleId="TableGrid">
     <w:name w:val="Table Grid"/>
-    <w:basedOn w:val="TableauNormal"/>
+    <w:basedOn w:val="TableNormal"/>
     <w:semiHidden/>
     <w:rsid w:val="00AE282D"/>
     <w:tblPr>
@@ -9639,9 +9126,9 @@
       </w:tblBorders>
     </w:tblPr>
   </w:style>
-  <w:style w:type="character" w:styleId="Numrodepage">
+  <w:style w:type="character" w:styleId="PageNumber">
     <w:name w:val="page number"/>
-    <w:basedOn w:val="Policepardfaut"/>
+    <w:basedOn w:val="DefaultParagraphFont"/>
     <w:semiHidden/>
     <w:rsid w:val="005E6192"/>
   </w:style>
@@ -9670,10 +9157,10 @@
       <w:spacing w:line="360" w:lineRule="auto"/>
     </w:pPr>
   </w:style>
-  <w:style w:type="paragraph" w:styleId="Corpsdetexte">
+  <w:style w:type="paragraph" w:styleId="BodyText">
     <w:name w:val="Body Text"/>
     <w:basedOn w:val="Normal"/>
-    <w:link w:val="CorpsdetexteCar"/>
+    <w:link w:val="BodyTextChar"/>
     <w:rsid w:val="008E53F9"/>
     <w:pPr>
       <w:tabs>
@@ -9757,7 +9244,7 @@
       <w:sz w:val="28"/>
     </w:rPr>
   </w:style>
-  <w:style w:type="paragraph" w:styleId="TM10">
+  <w:style w:type="paragraph" w:styleId="TOC1">
     <w:name w:val="toc 1"/>
     <w:basedOn w:val="Normal"/>
     <w:next w:val="Normal"/>
@@ -9773,7 +9260,7 @@
       <w:caps/>
     </w:rPr>
   </w:style>
-  <w:style w:type="paragraph" w:styleId="TM2">
+  <w:style w:type="paragraph" w:styleId="TOC2">
     <w:name w:val="toc 2"/>
     <w:basedOn w:val="Normal"/>
     <w:next w:val="Normal"/>
@@ -9787,7 +9274,7 @@
       <w:smallCaps/>
     </w:rPr>
   </w:style>
-  <w:style w:type="paragraph" w:styleId="TM3">
+  <w:style w:type="paragraph" w:styleId="TOC3">
     <w:name w:val="toc 3"/>
     <w:basedOn w:val="Normal"/>
     <w:next w:val="Normal"/>
@@ -9803,7 +9290,7 @@
       <w:iCs/>
     </w:rPr>
   </w:style>
-  <w:style w:type="paragraph" w:styleId="TM4">
+  <w:style w:type="paragraph" w:styleId="TOC4">
     <w:name w:val="toc 4"/>
     <w:basedOn w:val="Normal"/>
     <w:next w:val="Normal"/>
@@ -9820,7 +9307,7 @@
   </w:style>
   <w:style w:type="character" w:customStyle="1" w:styleId="TM1Car">
     <w:name w:val="TM1 Car"/>
-    <w:basedOn w:val="Policepardfaut"/>
+    <w:basedOn w:val="DefaultParagraphFont"/>
     <w:link w:val="TM1"/>
     <w:rsid w:val="007F30AE"/>
     <w:rPr>
@@ -9832,9 +9319,9 @@
       <w:lang w:val="fr-FR" w:eastAsia="fr-FR" w:bidi="ar-SA"/>
     </w:rPr>
   </w:style>
-  <w:style w:type="character" w:styleId="Lienhypertexte">
+  <w:style w:type="character" w:styleId="Hyperlink">
     <w:name w:val="Hyperlink"/>
-    <w:basedOn w:val="Policepardfaut"/>
+    <w:basedOn w:val="DefaultParagraphFont"/>
     <w:uiPriority w:val="99"/>
     <w:rsid w:val="00932149"/>
     <w:rPr>
@@ -9842,10 +9329,10 @@
       <w:u w:val="single"/>
     </w:rPr>
   </w:style>
-  <w:style w:type="paragraph" w:styleId="Textedebulles">
+  <w:style w:type="paragraph" w:styleId="BalloonText">
     <w:name w:val="Balloon Text"/>
     <w:basedOn w:val="Normal"/>
-    <w:link w:val="TextedebullesCar"/>
+    <w:link w:val="BalloonTextChar"/>
     <w:rsid w:val="00B64C66"/>
     <w:rPr>
       <w:rFonts w:ascii="Tahoma" w:hAnsi="Tahoma" w:cs="Tahoma"/>
@@ -9853,10 +9340,10 @@
       <w:szCs w:val="16"/>
     </w:rPr>
   </w:style>
-  <w:style w:type="character" w:customStyle="1" w:styleId="TextedebullesCar">
-    <w:name w:val="Texte de bulles Car"/>
-    <w:basedOn w:val="Policepardfaut"/>
-    <w:link w:val="Textedebulles"/>
+  <w:style w:type="character" w:customStyle="1" w:styleId="BalloonTextChar">
+    <w:name w:val="Balloon Text Char"/>
+    <w:basedOn w:val="DefaultParagraphFont"/>
+    <w:link w:val="BalloonText"/>
     <w:rsid w:val="00B64C66"/>
     <w:rPr>
       <w:rFonts w:ascii="Tahoma" w:hAnsi="Tahoma" w:cs="Tahoma"/>
@@ -9889,16 +9376,16 @@
   </w:style>
   <w:style w:type="character" w:customStyle="1" w:styleId="paragraphe2Car">
     <w:name w:val="paragraphe2 Car"/>
-    <w:basedOn w:val="Policepardfaut"/>
+    <w:basedOn w:val="DefaultParagraphFont"/>
     <w:link w:val="paragraphe2"/>
     <w:rsid w:val="00753A51"/>
     <w:rPr>
       <w:rFonts w:asciiTheme="minorHAnsi" w:hAnsiTheme="minorHAnsi"/>
     </w:rPr>
   </w:style>
-  <w:style w:type="character" w:styleId="lev">
+  <w:style w:type="character" w:styleId="Strong">
     <w:name w:val="Strong"/>
-    <w:basedOn w:val="Policepardfaut"/>
+    <w:basedOn w:val="DefaultParagraphFont"/>
     <w:qFormat/>
     <w:rsid w:val="0037071E"/>
     <w:rPr>
@@ -9906,26 +9393,26 @@
       <w:bCs/>
     </w:rPr>
   </w:style>
-  <w:style w:type="paragraph" w:styleId="Retraitcorpsdetexte">
+  <w:style w:type="paragraph" w:styleId="BodyTextIndent">
     <w:name w:val="Body Text Indent"/>
-    <w:basedOn w:val="Corpsdetexte"/>
-    <w:link w:val="RetraitcorpsdetexteCar"/>
+    <w:basedOn w:val="BodyText"/>
+    <w:link w:val="BodyTextIndentChar"/>
     <w:rsid w:val="00AA4393"/>
     <w:pPr>
       <w:ind w:left="1134"/>
       <w:contextualSpacing/>
     </w:pPr>
   </w:style>
-  <w:style w:type="character" w:customStyle="1" w:styleId="RetraitcorpsdetexteCar">
-    <w:name w:val="Retrait corps de texte Car"/>
-    <w:basedOn w:val="Policepardfaut"/>
-    <w:link w:val="Retraitcorpsdetexte"/>
+  <w:style w:type="character" w:customStyle="1" w:styleId="BodyTextIndentChar">
+    <w:name w:val="Body Text Indent Char"/>
+    <w:basedOn w:val="DefaultParagraphFont"/>
+    <w:link w:val="BodyTextIndent"/>
     <w:rsid w:val="00AA4393"/>
   </w:style>
-  <w:style w:type="paragraph" w:styleId="Retraitcorpsdetexte3">
+  <w:style w:type="paragraph" w:styleId="BodyTextIndent3">
     <w:name w:val="Body Text Indent 3"/>
-    <w:basedOn w:val="Corpsdetexte"/>
-    <w:link w:val="Retraitcorpsdetexte3Car"/>
+    <w:basedOn w:val="BodyText"/>
+    <w:link w:val="BodyTextIndent3Char"/>
     <w:rsid w:val="00AA4393"/>
     <w:pPr>
       <w:ind w:left="1814"/>
@@ -9934,20 +9421,20 @@
       <w:szCs w:val="16"/>
     </w:rPr>
   </w:style>
-  <w:style w:type="character" w:customStyle="1" w:styleId="Retraitcorpsdetexte3Car">
-    <w:name w:val="Retrait corps de texte 3 Car"/>
-    <w:basedOn w:val="Policepardfaut"/>
-    <w:link w:val="Retraitcorpsdetexte3"/>
+  <w:style w:type="character" w:customStyle="1" w:styleId="BodyTextIndent3Char">
+    <w:name w:val="Body Text Indent 3 Char"/>
+    <w:basedOn w:val="DefaultParagraphFont"/>
+    <w:link w:val="BodyTextIndent3"/>
     <w:rsid w:val="00AA4393"/>
     <w:rPr>
       <w:szCs w:val="16"/>
     </w:rPr>
   </w:style>
-  <w:style w:type="paragraph" w:styleId="Titre">
+  <w:style w:type="paragraph" w:styleId="Title">
     <w:name w:val="Title"/>
     <w:basedOn w:val="Normal"/>
     <w:next w:val="Normal"/>
-    <w:link w:val="TitreCar"/>
+    <w:link w:val="TitleChar"/>
     <w:qFormat/>
     <w:rsid w:val="000E7483"/>
     <w:pPr>
@@ -9967,10 +9454,10 @@
       <w:szCs w:val="52"/>
     </w:rPr>
   </w:style>
-  <w:style w:type="character" w:customStyle="1" w:styleId="TitreCar">
-    <w:name w:val="Titre Car"/>
-    <w:basedOn w:val="Policepardfaut"/>
-    <w:link w:val="Titre"/>
+  <w:style w:type="character" w:customStyle="1" w:styleId="TitleChar">
+    <w:name w:val="Title Char"/>
+    <w:basedOn w:val="DefaultParagraphFont"/>
+    <w:link w:val="Title"/>
     <w:rsid w:val="000E7483"/>
     <w:rPr>
       <w:rFonts w:asciiTheme="majorHAnsi" w:eastAsiaTheme="majorEastAsia" w:hAnsiTheme="majorHAnsi" w:cstheme="majorBidi"/>
@@ -9983,7 +9470,7 @@
   </w:style>
   <w:style w:type="paragraph" w:customStyle="1" w:styleId="Informations">
     <w:name w:val="Informations"/>
-    <w:basedOn w:val="Retraitcorpsdetexte"/>
+    <w:basedOn w:val="BodyTextIndent"/>
     <w:qFormat/>
     <w:rsid w:val="00645760"/>
     <w:pPr>
@@ -9994,7 +9481,7 @@
       <w:sz w:val="16"/>
     </w:rPr>
   </w:style>
-  <w:style w:type="paragraph" w:styleId="TM5">
+  <w:style w:type="paragraph" w:styleId="TOC5">
     <w:name w:val="toc 5"/>
     <w:basedOn w:val="Normal"/>
     <w:next w:val="Normal"/>
@@ -10009,7 +9496,7 @@
       <w:szCs w:val="18"/>
     </w:rPr>
   </w:style>
-  <w:style w:type="paragraph" w:styleId="TM6">
+  <w:style w:type="paragraph" w:styleId="TOC6">
     <w:name w:val="toc 6"/>
     <w:basedOn w:val="Normal"/>
     <w:next w:val="Normal"/>
@@ -10024,7 +9511,7 @@
       <w:szCs w:val="18"/>
     </w:rPr>
   </w:style>
-  <w:style w:type="paragraph" w:styleId="TM7">
+  <w:style w:type="paragraph" w:styleId="TOC7">
     <w:name w:val="toc 7"/>
     <w:basedOn w:val="Normal"/>
     <w:next w:val="Normal"/>
@@ -10039,7 +9526,7 @@
       <w:szCs w:val="18"/>
     </w:rPr>
   </w:style>
-  <w:style w:type="paragraph" w:styleId="TM8">
+  <w:style w:type="paragraph" w:styleId="TOC8">
     <w:name w:val="toc 8"/>
     <w:basedOn w:val="Normal"/>
     <w:next w:val="Normal"/>
@@ -10054,7 +9541,7 @@
       <w:szCs w:val="18"/>
     </w:rPr>
   </w:style>
-  <w:style w:type="paragraph" w:styleId="TM9">
+  <w:style w:type="paragraph" w:styleId="TOC9">
     <w:name w:val="toc 9"/>
     <w:basedOn w:val="Normal"/>
     <w:next w:val="Normal"/>
@@ -10069,26 +9556,26 @@
       <w:szCs w:val="18"/>
     </w:rPr>
   </w:style>
-  <w:style w:type="paragraph" w:styleId="Titredenote">
+  <w:style w:type="paragraph" w:styleId="NoteHeading">
     <w:name w:val="Note Heading"/>
     <w:basedOn w:val="Normal"/>
     <w:next w:val="Normal"/>
-    <w:link w:val="TitredenoteCar"/>
+    <w:link w:val="NoteHeadingChar"/>
     <w:rsid w:val="00AA4393"/>
     <w:rPr>
       <w:rFonts w:asciiTheme="majorHAnsi" w:hAnsiTheme="majorHAnsi"/>
     </w:rPr>
   </w:style>
-  <w:style w:type="character" w:customStyle="1" w:styleId="CorpsdetexteCar">
-    <w:name w:val="Corps de texte Car"/>
-    <w:basedOn w:val="Policepardfaut"/>
-    <w:link w:val="Corpsdetexte"/>
+  <w:style w:type="character" w:customStyle="1" w:styleId="BodyTextChar">
+    <w:name w:val="Body Text Char"/>
+    <w:basedOn w:val="DefaultParagraphFont"/>
+    <w:link w:val="BodyText"/>
     <w:rsid w:val="00AA4393"/>
   </w:style>
-  <w:style w:type="character" w:customStyle="1" w:styleId="TitredenoteCar">
-    <w:name w:val="Titre de note Car"/>
-    <w:basedOn w:val="Policepardfaut"/>
-    <w:link w:val="Titredenote"/>
+  <w:style w:type="character" w:customStyle="1" w:styleId="NoteHeadingChar">
+    <w:name w:val="Note Heading Char"/>
+    <w:basedOn w:val="DefaultParagraphFont"/>
+    <w:link w:val="NoteHeading"/>
     <w:rsid w:val="00AA4393"/>
     <w:rPr>
       <w:rFonts w:asciiTheme="majorHAnsi" w:hAnsiTheme="majorHAnsi"/>
@@ -10384,14 +9871,12 @@
 </file>
 
 <file path=customXml/item1.xml><?xml version="1.0" encoding="utf-8"?>
-<p:properties xmlns:p="http://schemas.microsoft.com/office/2006/metadata/properties" xmlns:xsi="http://www.w3.org/2001/XMLSchema-instance" xmlns:pc="http://schemas.microsoft.com/office/infopath/2007/PartnerControls">
-  <documentManagement>
-    <lcf76f155ced4ddcb4097134ff3c332f xmlns="a1b10758-7132-46a4-a2fe-7a2cf46f51f4">
-      <Terms xmlns="http://schemas.microsoft.com/office/infopath/2007/PartnerControls"/>
-    </lcf76f155ced4ddcb4097134ff3c332f>
-    <TaxCatchAll xmlns="f7d9f5a6-831d-4621-8c77-cbcaf993e406" xsi:nil="true"/>
-  </documentManagement>
-</p:properties>
+<?mso-contentType ?>
+<FormTemplates xmlns="http://schemas.microsoft.com/sharepoint/v3/contenttype/forms">
+  <Display>DocumentLibraryForm</Display>
+  <Edit>DocumentLibraryForm</Edit>
+  <New>DocumentLibraryForm</New>
+</FormTemplates>
 </file>
 
 <file path=customXml/item2.xml><?xml version="1.0" encoding="utf-8"?>
@@ -10638,12 +10123,14 @@
 </file>
 
 <file path=customXml/item3.xml><?xml version="1.0" encoding="utf-8"?>
-<?mso-contentType ?>
-<FormTemplates xmlns="http://schemas.microsoft.com/sharepoint/v3/contenttype/forms">
-  <Display>DocumentLibraryForm</Display>
-  <Edit>DocumentLibraryForm</Edit>
-  <New>DocumentLibraryForm</New>
-</FormTemplates>
+<p:properties xmlns:p="http://schemas.microsoft.com/office/2006/metadata/properties" xmlns:xsi="http://www.w3.org/2001/XMLSchema-instance" xmlns:pc="http://schemas.microsoft.com/office/infopath/2007/PartnerControls">
+  <documentManagement>
+    <lcf76f155ced4ddcb4097134ff3c332f xmlns="a1b10758-7132-46a4-a2fe-7a2cf46f51f4">
+      <Terms xmlns="http://schemas.microsoft.com/office/infopath/2007/PartnerControls"/>
+    </lcf76f155ced4ddcb4097134ff3c332f>
+    <TaxCatchAll xmlns="f7d9f5a6-831d-4621-8c77-cbcaf993e406" xsi:nil="true"/>
+  </documentManagement>
+</p:properties>
 </file>
 
 <file path=customXml/item4.xml><?xml version="1.0" encoding="utf-8"?>
@@ -10651,12 +10138,9 @@
 </file>
 
 <file path=customXml/itemProps1.xml><?xml version="1.0" encoding="utf-8"?>
-<ds:datastoreItem xmlns:ds="http://schemas.openxmlformats.org/officeDocument/2006/customXml" ds:itemID="{2319CDB8-A2CD-412D-8359-13E6B4DF1FF4}">
+<ds:datastoreItem xmlns:ds="http://schemas.openxmlformats.org/officeDocument/2006/customXml" ds:itemID="{6C3F7A66-EDE3-46FD-83EB-3C265E5D2669}">
   <ds:schemaRefs>
-    <ds:schemaRef ds:uri="http://schemas.microsoft.com/office/2006/metadata/properties"/>
-    <ds:schemaRef ds:uri="http://schemas.microsoft.com/office/infopath/2007/PartnerControls"/>
-    <ds:schemaRef ds:uri="a1b10758-7132-46a4-a2fe-7a2cf46f51f4"/>
-    <ds:schemaRef ds:uri="f7d9f5a6-831d-4621-8c77-cbcaf993e406"/>
+    <ds:schemaRef ds:uri="http://schemas.microsoft.com/sharepoint/v3/contenttype/forms"/>
   </ds:schemaRefs>
 </ds:datastoreItem>
 </file>
@@ -10681,9 +10165,12 @@
 </file>
 
 <file path=customXml/itemProps3.xml><?xml version="1.0" encoding="utf-8"?>
-<ds:datastoreItem xmlns:ds="http://schemas.openxmlformats.org/officeDocument/2006/customXml" ds:itemID="{6C3F7A66-EDE3-46FD-83EB-3C265E5D2669}">
+<ds:datastoreItem xmlns:ds="http://schemas.openxmlformats.org/officeDocument/2006/customXml" ds:itemID="{2319CDB8-A2CD-412D-8359-13E6B4DF1FF4}">
   <ds:schemaRefs>
-    <ds:schemaRef ds:uri="http://schemas.microsoft.com/sharepoint/v3/contenttype/forms"/>
+    <ds:schemaRef ds:uri="http://schemas.microsoft.com/office/2006/metadata/properties"/>
+    <ds:schemaRef ds:uri="http://schemas.microsoft.com/office/infopath/2007/PartnerControls"/>
+    <ds:schemaRef ds:uri="a1b10758-7132-46a4-a2fe-7a2cf46f51f4"/>
+    <ds:schemaRef ds:uri="f7d9f5a6-831d-4621-8c77-cbcaf993e406"/>
   </ds:schemaRefs>
 </ds:datastoreItem>
 </file>

</xml_diff>

<commit_message>
chore(commentaire): ajouter un commentaire
[5]/[Done]
</commit_message>
<xml_diff>
--- a/doc/I320-RapportProjet.docx
+++ b/doc/I320-RapportProjet.docx
@@ -4,7 +4,7 @@
   <w:body>
     <w:p>
       <w:pPr>
-        <w:pStyle w:val="Title"/>
+        <w:pStyle w:val="Titre"/>
       </w:pPr>
       <w:r>
         <w:t>I320 Projet</w:t>
@@ -143,7 +143,7 @@
     </w:p>
     <w:p>
       <w:pPr>
-        <w:pStyle w:val="Title"/>
+        <w:pStyle w:val="Titre"/>
       </w:pPr>
       <w:r>
         <w:br w:type="page"/>
@@ -155,7 +155,7 @@
     </w:p>
     <w:p>
       <w:pPr>
-        <w:pStyle w:val="TOC1"/>
+        <w:pStyle w:val="TM10"/>
         <w:tabs>
           <w:tab w:val="left" w:pos="400"/>
           <w:tab w:val="right" w:leader="dot" w:pos="9060"/>
@@ -208,7 +208,7 @@
       <w:hyperlink w:anchor="_Toc240025452" w:history="1">
         <w:r>
           <w:rPr>
-            <w:rStyle w:val="Hyperlink"/>
+            <w:rStyle w:val="Lienhypertexte"/>
             <w:noProof/>
           </w:rPr>
           <w:t>1</w:t>
@@ -229,7 +229,7 @@
         </w:r>
         <w:r>
           <w:rPr>
-            <w:rStyle w:val="Hyperlink"/>
+            <w:rStyle w:val="Lienhypertexte"/>
             <w:noProof/>
           </w:rPr>
           <w:t>Introduction</w:t>
@@ -286,7 +286,7 @@
     </w:p>
     <w:p>
       <w:pPr>
-        <w:pStyle w:val="TOC2"/>
+        <w:pStyle w:val="TM2"/>
         <w:tabs>
           <w:tab w:val="left" w:pos="800"/>
           <w:tab w:val="right" w:leader="dot" w:pos="9060"/>
@@ -304,7 +304,7 @@
       <w:hyperlink w:anchor="_Toc240025453" w:history="1">
         <w:r>
           <w:rPr>
-            <w:rStyle w:val="Hyperlink"/>
+            <w:rStyle w:val="Lienhypertexte"/>
             <w:noProof/>
           </w:rPr>
           <w:t>1.1</w:t>
@@ -323,7 +323,7 @@
         </w:r>
         <w:r>
           <w:rPr>
-            <w:rStyle w:val="Hyperlink"/>
+            <w:rStyle w:val="Lienhypertexte"/>
             <w:noProof/>
           </w:rPr>
           <w:t>Titre</w:t>
@@ -380,7 +380,7 @@
     </w:p>
     <w:p>
       <w:pPr>
-        <w:pStyle w:val="TOC2"/>
+        <w:pStyle w:val="TM2"/>
         <w:tabs>
           <w:tab w:val="left" w:pos="800"/>
           <w:tab w:val="right" w:leader="dot" w:pos="9060"/>
@@ -398,7 +398,7 @@
       <w:hyperlink w:anchor="_Toc240025454" w:history="1">
         <w:r>
           <w:rPr>
-            <w:rStyle w:val="Hyperlink"/>
+            <w:rStyle w:val="Lienhypertexte"/>
             <w:noProof/>
           </w:rPr>
           <w:t>1.2</w:t>
@@ -417,7 +417,7 @@
         </w:r>
         <w:r>
           <w:rPr>
-            <w:rStyle w:val="Hyperlink"/>
+            <w:rStyle w:val="Lienhypertexte"/>
             <w:noProof/>
           </w:rPr>
           <w:t>Objectifs produit</w:t>
@@ -474,7 +474,7 @@
     </w:p>
     <w:p>
       <w:pPr>
-        <w:pStyle w:val="TOC2"/>
+        <w:pStyle w:val="TM2"/>
         <w:tabs>
           <w:tab w:val="left" w:pos="800"/>
           <w:tab w:val="right" w:leader="dot" w:pos="9060"/>
@@ -492,7 +492,7 @@
       <w:hyperlink w:anchor="_Toc240025455" w:history="1">
         <w:r>
           <w:rPr>
-            <w:rStyle w:val="Hyperlink"/>
+            <w:rStyle w:val="Lienhypertexte"/>
             <w:noProof/>
           </w:rPr>
           <w:t>1.3</w:t>
@@ -511,7 +511,7 @@
         </w:r>
         <w:r>
           <w:rPr>
-            <w:rStyle w:val="Hyperlink"/>
+            <w:rStyle w:val="Lienhypertexte"/>
             <w:noProof/>
           </w:rPr>
           <w:t>Objectifs pédagogiques</w:t>
@@ -568,7 +568,7 @@
     </w:p>
     <w:p>
       <w:pPr>
-        <w:pStyle w:val="TOC1"/>
+        <w:pStyle w:val="TM10"/>
         <w:tabs>
           <w:tab w:val="left" w:pos="400"/>
           <w:tab w:val="right" w:leader="dot" w:pos="9060"/>
@@ -588,7 +588,7 @@
       <w:hyperlink w:anchor="_Toc240025456" w:history="1">
         <w:r>
           <w:rPr>
-            <w:rStyle w:val="Hyperlink"/>
+            <w:rStyle w:val="Lienhypertexte"/>
             <w:noProof/>
           </w:rPr>
           <w:t>2</w:t>
@@ -609,7 +609,7 @@
         </w:r>
         <w:r>
           <w:rPr>
-            <w:rStyle w:val="Hyperlink"/>
+            <w:rStyle w:val="Lienhypertexte"/>
             <w:noProof/>
           </w:rPr>
           <w:t>Planification Initiale</w:t>
@@ -666,7 +666,7 @@
     </w:p>
     <w:p>
       <w:pPr>
-        <w:pStyle w:val="TOC1"/>
+        <w:pStyle w:val="TM10"/>
         <w:tabs>
           <w:tab w:val="left" w:pos="400"/>
           <w:tab w:val="right" w:leader="dot" w:pos="9060"/>
@@ -686,7 +686,7 @@
       <w:hyperlink w:anchor="_Toc240025457" w:history="1">
         <w:r>
           <w:rPr>
-            <w:rStyle w:val="Hyperlink"/>
+            <w:rStyle w:val="Lienhypertexte"/>
             <w:noProof/>
           </w:rPr>
           <w:t>3</w:t>
@@ -707,7 +707,7 @@
         </w:r>
         <w:r>
           <w:rPr>
-            <w:rStyle w:val="Hyperlink"/>
+            <w:rStyle w:val="Lienhypertexte"/>
             <w:noProof/>
           </w:rPr>
           <w:t>Analyse</w:t>
@@ -764,7 +764,7 @@
     </w:p>
     <w:p>
       <w:pPr>
-        <w:pStyle w:val="TOC2"/>
+        <w:pStyle w:val="TM2"/>
         <w:tabs>
           <w:tab w:val="left" w:pos="800"/>
           <w:tab w:val="right" w:leader="dot" w:pos="9060"/>
@@ -782,7 +782,7 @@
       <w:hyperlink w:anchor="_Toc240025458" w:history="1">
         <w:r>
           <w:rPr>
-            <w:rStyle w:val="Hyperlink"/>
+            <w:rStyle w:val="Lienhypertexte"/>
             <w:noProof/>
           </w:rPr>
           <w:t>3.1</w:t>
@@ -801,7 +801,7 @@
         </w:r>
         <w:r>
           <w:rPr>
-            <w:rStyle w:val="Hyperlink"/>
+            <w:rStyle w:val="Lienhypertexte"/>
             <w:noProof/>
           </w:rPr>
           <w:t>User story</w:t>
@@ -858,7 +858,7 @@
     </w:p>
     <w:p>
       <w:pPr>
-        <w:pStyle w:val="TOC1"/>
+        <w:pStyle w:val="TM10"/>
         <w:tabs>
           <w:tab w:val="right" w:leader="dot" w:pos="9060"/>
         </w:tabs>
@@ -877,7 +877,7 @@
       <w:hyperlink w:anchor="_Toc240025459" w:history="1">
         <w:r>
           <w:rPr>
-            <w:rStyle w:val="Hyperlink"/>
+            <w:rStyle w:val="Lienhypertexte"/>
             <w:noProof/>
           </w:rPr>
           <w:t>#1 — US 1: Déplacement</w:t>
@@ -934,7 +934,7 @@
     </w:p>
     <w:p>
       <w:pPr>
-        <w:pStyle w:val="TOC1"/>
+        <w:pStyle w:val="TM10"/>
         <w:tabs>
           <w:tab w:val="right" w:leader="dot" w:pos="9060"/>
         </w:tabs>
@@ -953,7 +953,7 @@
       <w:hyperlink w:anchor="_Toc240025460" w:history="1">
         <w:r>
           <w:rPr>
-            <w:rStyle w:val="Hyperlink"/>
+            <w:rStyle w:val="Lienhypertexte"/>
             <w:noProof/>
           </w:rPr>
           <w:t>#2 — US 2: Tir</w:t>
@@ -1010,7 +1010,7 @@
     </w:p>
     <w:p>
       <w:pPr>
-        <w:pStyle w:val="TOC1"/>
+        <w:pStyle w:val="TM10"/>
         <w:tabs>
           <w:tab w:val="right" w:leader="dot" w:pos="9060"/>
         </w:tabs>
@@ -1029,7 +1029,7 @@
       <w:hyperlink w:anchor="_Toc240025461" w:history="1">
         <w:r>
           <w:rPr>
-            <w:rStyle w:val="Hyperlink"/>
+            <w:rStyle w:val="Lienhypertexte"/>
             <w:noProof/>
           </w:rPr>
           <w:t>#3 — US 3: Personnage Joueur</w:t>
@@ -1086,7 +1086,7 @@
     </w:p>
     <w:p>
       <w:pPr>
-        <w:pStyle w:val="TOC1"/>
+        <w:pStyle w:val="TM10"/>
         <w:tabs>
           <w:tab w:val="right" w:leader="dot" w:pos="9060"/>
         </w:tabs>
@@ -1105,7 +1105,7 @@
       <w:hyperlink w:anchor="_Toc240025462" w:history="1">
         <w:r>
           <w:rPr>
-            <w:rStyle w:val="Hyperlink"/>
+            <w:rStyle w:val="Lienhypertexte"/>
             <w:noProof/>
           </w:rPr>
           <w:t>#4 — US 4: Personnage ennemie</w:t>
@@ -1162,7 +1162,7 @@
     </w:p>
     <w:p>
       <w:pPr>
-        <w:pStyle w:val="TOC1"/>
+        <w:pStyle w:val="TM10"/>
         <w:tabs>
           <w:tab w:val="right" w:leader="dot" w:pos="9060"/>
         </w:tabs>
@@ -1181,7 +1181,7 @@
       <w:hyperlink w:anchor="_Toc240025463" w:history="1">
         <w:r>
           <w:rPr>
-            <w:rStyle w:val="Hyperlink"/>
+            <w:rStyle w:val="Lienhypertexte"/>
             <w:noProof/>
           </w:rPr>
           <w:t>#5 — US 5: Barrière</w:t>
@@ -1238,7 +1238,7 @@
     </w:p>
     <w:p>
       <w:pPr>
-        <w:pStyle w:val="TOC1"/>
+        <w:pStyle w:val="TM10"/>
         <w:tabs>
           <w:tab w:val="right" w:leader="dot" w:pos="9060"/>
         </w:tabs>
@@ -1257,7 +1257,7 @@
       <w:hyperlink w:anchor="_Toc240025464" w:history="1">
         <w:r>
           <w:rPr>
-            <w:rStyle w:val="Hyperlink"/>
+            <w:rStyle w:val="Lienhypertexte"/>
             <w:noProof/>
           </w:rPr>
           <w:t>#6 — US 6: Vague</w:t>
@@ -1314,7 +1314,7 @@
     </w:p>
     <w:p>
       <w:pPr>
-        <w:pStyle w:val="TOC1"/>
+        <w:pStyle w:val="TM10"/>
         <w:tabs>
           <w:tab w:val="left" w:pos="400"/>
           <w:tab w:val="right" w:leader="dot" w:pos="9060"/>
@@ -1334,7 +1334,7 @@
       <w:hyperlink w:anchor="_Toc240025465" w:history="1">
         <w:r>
           <w:rPr>
-            <w:rStyle w:val="Hyperlink"/>
+            <w:rStyle w:val="Lienhypertexte"/>
             <w:noProof/>
           </w:rPr>
           <w:t>4</w:t>
@@ -1355,7 +1355,7 @@
         </w:r>
         <w:r>
           <w:rPr>
-            <w:rStyle w:val="Hyperlink"/>
+            <w:rStyle w:val="Lienhypertexte"/>
             <w:noProof/>
           </w:rPr>
           <w:t>Réalisation</w:t>
@@ -1412,7 +1412,7 @@
     </w:p>
     <w:p>
       <w:pPr>
-        <w:pStyle w:val="TOC2"/>
+        <w:pStyle w:val="TM2"/>
         <w:tabs>
           <w:tab w:val="left" w:pos="800"/>
           <w:tab w:val="right" w:leader="dot" w:pos="9060"/>
@@ -1430,7 +1430,7 @@
       <w:hyperlink w:anchor="_Toc240025466" w:history="1">
         <w:r>
           <w:rPr>
-            <w:rStyle w:val="Hyperlink"/>
+            <w:rStyle w:val="Lienhypertexte"/>
             <w:noProof/>
           </w:rPr>
           <w:t>4.1</w:t>
@@ -1449,7 +1449,7 @@
         </w:r>
         <w:r>
           <w:rPr>
-            <w:rStyle w:val="Hyperlink"/>
+            <w:rStyle w:val="Lienhypertexte"/>
             <w:noProof/>
           </w:rPr>
           <w:t>Dossier de Réalisation</w:t>
@@ -1506,7 +1506,7 @@
     </w:p>
     <w:p>
       <w:pPr>
-        <w:pStyle w:val="TOC2"/>
+        <w:pStyle w:val="TM2"/>
         <w:tabs>
           <w:tab w:val="left" w:pos="800"/>
           <w:tab w:val="right" w:leader="dot" w:pos="9060"/>
@@ -1524,7 +1524,7 @@
       <w:hyperlink w:anchor="_Toc240025467" w:history="1">
         <w:r>
           <w:rPr>
-            <w:rStyle w:val="Hyperlink"/>
+            <w:rStyle w:val="Lienhypertexte"/>
             <w:noProof/>
           </w:rPr>
           <w:t>4.2</w:t>
@@ -1543,7 +1543,7 @@
         </w:r>
         <w:r>
           <w:rPr>
-            <w:rStyle w:val="Hyperlink"/>
+            <w:rStyle w:val="Lienhypertexte"/>
             <w:noProof/>
           </w:rPr>
           <w:t>Modifications</w:t>
@@ -1600,7 +1600,7 @@
     </w:p>
     <w:p>
       <w:pPr>
-        <w:pStyle w:val="TOC1"/>
+        <w:pStyle w:val="TM10"/>
         <w:tabs>
           <w:tab w:val="left" w:pos="400"/>
           <w:tab w:val="right" w:leader="dot" w:pos="9060"/>
@@ -1620,7 +1620,7 @@
       <w:hyperlink w:anchor="_Toc240025468" w:history="1">
         <w:r>
           <w:rPr>
-            <w:rStyle w:val="Hyperlink"/>
+            <w:rStyle w:val="Lienhypertexte"/>
             <w:noProof/>
           </w:rPr>
           <w:t>5</w:t>
@@ -1641,7 +1641,7 @@
         </w:r>
         <w:r>
           <w:rPr>
-            <w:rStyle w:val="Hyperlink"/>
+            <w:rStyle w:val="Lienhypertexte"/>
             <w:noProof/>
           </w:rPr>
           <w:t>Tests</w:t>
@@ -1698,7 +1698,7 @@
     </w:p>
     <w:p>
       <w:pPr>
-        <w:pStyle w:val="TOC2"/>
+        <w:pStyle w:val="TM2"/>
         <w:tabs>
           <w:tab w:val="left" w:pos="800"/>
           <w:tab w:val="right" w:leader="dot" w:pos="9060"/>
@@ -1716,7 +1716,7 @@
       <w:hyperlink w:anchor="_Toc240025469" w:history="1">
         <w:r>
           <w:rPr>
-            <w:rStyle w:val="Hyperlink"/>
+            <w:rStyle w:val="Lienhypertexte"/>
             <w:noProof/>
           </w:rPr>
           <w:t>5.1</w:t>
@@ -1735,7 +1735,7 @@
         </w:r>
         <w:r>
           <w:rPr>
-            <w:rStyle w:val="Hyperlink"/>
+            <w:rStyle w:val="Lienhypertexte"/>
             <w:noProof/>
           </w:rPr>
           <w:t>Dossier des tests</w:t>
@@ -1792,7 +1792,7 @@
     </w:p>
     <w:p>
       <w:pPr>
-        <w:pStyle w:val="TOC1"/>
+        <w:pStyle w:val="TM10"/>
         <w:tabs>
           <w:tab w:val="left" w:pos="400"/>
           <w:tab w:val="right" w:leader="dot" w:pos="9060"/>
@@ -1812,7 +1812,7 @@
       <w:hyperlink w:anchor="_Toc240025470" w:history="1">
         <w:r>
           <w:rPr>
-            <w:rStyle w:val="Hyperlink"/>
+            <w:rStyle w:val="Lienhypertexte"/>
             <w:noProof/>
           </w:rPr>
           <w:t>6</w:t>
@@ -1833,7 +1833,7 @@
         </w:r>
         <w:r>
           <w:rPr>
-            <w:rStyle w:val="Hyperlink"/>
+            <w:rStyle w:val="Lienhypertexte"/>
             <w:noProof/>
           </w:rPr>
           <w:t>Conclusion</w:t>
@@ -1890,7 +1890,7 @@
     </w:p>
     <w:p>
       <w:pPr>
-        <w:pStyle w:val="TOC2"/>
+        <w:pStyle w:val="TM2"/>
         <w:tabs>
           <w:tab w:val="left" w:pos="800"/>
           <w:tab w:val="right" w:leader="dot" w:pos="9060"/>
@@ -1908,7 +1908,7 @@
       <w:hyperlink w:anchor="_Toc240025471" w:history="1">
         <w:r>
           <w:rPr>
-            <w:rStyle w:val="Hyperlink"/>
+            <w:rStyle w:val="Lienhypertexte"/>
             <w:noProof/>
           </w:rPr>
           <w:t>6.1</w:t>
@@ -1927,7 +1927,7 @@
         </w:r>
         <w:r>
           <w:rPr>
-            <w:rStyle w:val="Hyperlink"/>
+            <w:rStyle w:val="Lienhypertexte"/>
             <w:noProof/>
           </w:rPr>
           <w:t>Bilan des fonctionnalités demandées</w:t>
@@ -1984,7 +1984,7 @@
     </w:p>
     <w:p>
       <w:pPr>
-        <w:pStyle w:val="TOC2"/>
+        <w:pStyle w:val="TM2"/>
         <w:tabs>
           <w:tab w:val="left" w:pos="800"/>
           <w:tab w:val="right" w:leader="dot" w:pos="9060"/>
@@ -2002,7 +2002,7 @@
       <w:hyperlink w:anchor="_Toc240025472" w:history="1">
         <w:r>
           <w:rPr>
-            <w:rStyle w:val="Hyperlink"/>
+            <w:rStyle w:val="Lienhypertexte"/>
             <w:noProof/>
           </w:rPr>
           <w:t>6.2</w:t>
@@ -2021,7 +2021,7 @@
         </w:r>
         <w:r>
           <w:rPr>
-            <w:rStyle w:val="Hyperlink"/>
+            <w:rStyle w:val="Lienhypertexte"/>
             <w:noProof/>
           </w:rPr>
           <w:t>Bilan de la planification</w:t>
@@ -2078,7 +2078,7 @@
     </w:p>
     <w:p>
       <w:pPr>
-        <w:pStyle w:val="TOC2"/>
+        <w:pStyle w:val="TM2"/>
         <w:tabs>
           <w:tab w:val="left" w:pos="800"/>
           <w:tab w:val="right" w:leader="dot" w:pos="9060"/>
@@ -2096,7 +2096,7 @@
       <w:hyperlink w:anchor="_Toc240025473" w:history="1">
         <w:r>
           <w:rPr>
-            <w:rStyle w:val="Hyperlink"/>
+            <w:rStyle w:val="Lienhypertexte"/>
             <w:noProof/>
           </w:rPr>
           <w:t>6.3</w:t>
@@ -2115,7 +2115,7 @@
         </w:r>
         <w:r>
           <w:rPr>
-            <w:rStyle w:val="Hyperlink"/>
+            <w:rStyle w:val="Lienhypertexte"/>
             <w:noProof/>
           </w:rPr>
           <w:t>Bilan personnel</w:t>
@@ -2172,7 +2172,7 @@
     </w:p>
     <w:p>
       <w:pPr>
-        <w:pStyle w:val="TOC1"/>
+        <w:pStyle w:val="TM10"/>
         <w:tabs>
           <w:tab w:val="left" w:pos="400"/>
           <w:tab w:val="right" w:leader="dot" w:pos="9060"/>
@@ -2192,7 +2192,7 @@
       <w:hyperlink w:anchor="_Toc240025474" w:history="1">
         <w:r>
           <w:rPr>
-            <w:rStyle w:val="Hyperlink"/>
+            <w:rStyle w:val="Lienhypertexte"/>
             <w:noProof/>
           </w:rPr>
           <w:t>7</w:t>
@@ -2213,7 +2213,7 @@
         </w:r>
         <w:r>
           <w:rPr>
-            <w:rStyle w:val="Hyperlink"/>
+            <w:rStyle w:val="Lienhypertexte"/>
             <w:noProof/>
           </w:rPr>
           <w:t>Divers</w:t>
@@ -2270,7 +2270,7 @@
     </w:p>
     <w:p>
       <w:pPr>
-        <w:pStyle w:val="TOC2"/>
+        <w:pStyle w:val="TM2"/>
         <w:tabs>
           <w:tab w:val="left" w:pos="800"/>
           <w:tab w:val="right" w:leader="dot" w:pos="9060"/>
@@ -2288,7 +2288,7 @@
       <w:hyperlink w:anchor="_Toc240025475" w:history="1">
         <w:r>
           <w:rPr>
-            <w:rStyle w:val="Hyperlink"/>
+            <w:rStyle w:val="Lienhypertexte"/>
             <w:noProof/>
           </w:rPr>
           <w:t>7.1</w:t>
@@ -2307,7 +2307,7 @@
         </w:r>
         <w:r>
           <w:rPr>
-            <w:rStyle w:val="Hyperlink"/>
+            <w:rStyle w:val="Lienhypertexte"/>
             <w:noProof/>
           </w:rPr>
           <w:t>Journal de travail</w:t>
@@ -2364,7 +2364,7 @@
     </w:p>
     <w:p>
       <w:pPr>
-        <w:pStyle w:val="TOC2"/>
+        <w:pStyle w:val="TM2"/>
         <w:tabs>
           <w:tab w:val="left" w:pos="800"/>
           <w:tab w:val="right" w:leader="dot" w:pos="9060"/>
@@ -2382,7 +2382,7 @@
       <w:hyperlink w:anchor="_Toc240025476" w:history="1">
         <w:r>
           <w:rPr>
-            <w:rStyle w:val="Hyperlink"/>
+            <w:rStyle w:val="Lienhypertexte"/>
             <w:noProof/>
           </w:rPr>
           <w:t>7.2</w:t>
@@ -2401,7 +2401,7 @@
         </w:r>
         <w:r>
           <w:rPr>
-            <w:rStyle w:val="Hyperlink"/>
+            <w:rStyle w:val="Lienhypertexte"/>
             <w:noProof/>
           </w:rPr>
           <w:t>Bibliographie</w:t>
@@ -2458,7 +2458,7 @@
     </w:p>
     <w:p>
       <w:pPr>
-        <w:pStyle w:val="TOC2"/>
+        <w:pStyle w:val="TM2"/>
         <w:tabs>
           <w:tab w:val="left" w:pos="800"/>
           <w:tab w:val="right" w:leader="dot" w:pos="9060"/>
@@ -2476,7 +2476,7 @@
       <w:hyperlink w:anchor="_Toc240025477" w:history="1">
         <w:r>
           <w:rPr>
-            <w:rStyle w:val="Hyperlink"/>
+            <w:rStyle w:val="Lienhypertexte"/>
             <w:noProof/>
           </w:rPr>
           <w:t>7.3</w:t>
@@ -2495,7 +2495,7 @@
         </w:r>
         <w:r>
           <w:rPr>
-            <w:rStyle w:val="Hyperlink"/>
+            <w:rStyle w:val="Lienhypertexte"/>
             <w:noProof/>
           </w:rPr>
           <w:t>Webographie</w:t>
@@ -2552,7 +2552,7 @@
     </w:p>
     <w:p>
       <w:pPr>
-        <w:pStyle w:val="TOC1"/>
+        <w:pStyle w:val="TM10"/>
         <w:tabs>
           <w:tab w:val="left" w:pos="400"/>
           <w:tab w:val="right" w:leader="dot" w:pos="9060"/>
@@ -2572,7 +2572,7 @@
       <w:hyperlink w:anchor="_Toc240025478" w:history="1">
         <w:r>
           <w:rPr>
-            <w:rStyle w:val="Hyperlink"/>
+            <w:rStyle w:val="Lienhypertexte"/>
             <w:noProof/>
           </w:rPr>
           <w:t>8</w:t>
@@ -2593,7 +2593,7 @@
         </w:r>
         <w:r>
           <w:rPr>
-            <w:rStyle w:val="Hyperlink"/>
+            <w:rStyle w:val="Lienhypertexte"/>
             <w:noProof/>
           </w:rPr>
           <w:t>Annexes</w:t>
@@ -2666,7 +2666,7 @@
     </w:p>
     <w:p>
       <w:pPr>
-        <w:pStyle w:val="Heading1"/>
+        <w:pStyle w:val="Titre1"/>
       </w:pPr>
       <w:bookmarkStart w:id="0" w:name="_Toc240025452"/>
       <w:r>
@@ -2677,12 +2677,12 @@
     </w:p>
     <w:p>
       <w:pPr>
-        <w:pStyle w:val="BodyText"/>
-      </w:pPr>
-    </w:p>
-    <w:p>
-      <w:pPr>
-        <w:pStyle w:val="Heading2"/>
+        <w:pStyle w:val="Corpsdetexte"/>
+      </w:pPr>
+    </w:p>
+    <w:p>
+      <w:pPr>
+        <w:pStyle w:val="Titre2"/>
       </w:pPr>
       <w:bookmarkStart w:id="1" w:name="_Toc240025453"/>
       <w:bookmarkStart w:id="2" w:name="_Toc532179969"/>
@@ -2700,7 +2700,7 @@
     </w:p>
     <w:p>
       <w:pPr>
-        <w:pStyle w:val="BodyTextIndent"/>
+        <w:pStyle w:val="Retraitcorpsdetexte"/>
       </w:pPr>
     </w:p>
     <w:p>
@@ -2718,12 +2718,12 @@
     </w:p>
     <w:p>
       <w:pPr>
-        <w:pStyle w:val="BodyTextIndent"/>
-      </w:pPr>
-    </w:p>
-    <w:p>
-      <w:pPr>
-        <w:pStyle w:val="Heading2"/>
+        <w:pStyle w:val="Retraitcorpsdetexte"/>
+      </w:pPr>
+    </w:p>
+    <w:p>
+      <w:pPr>
+        <w:pStyle w:val="Titre2"/>
       </w:pPr>
       <w:bookmarkStart w:id="4" w:name="_Toc240025454"/>
       <w:r>
@@ -2733,7 +2733,7 @@
     </w:p>
     <w:p>
       <w:pPr>
-        <w:pStyle w:val="BodyTextIndent"/>
+        <w:pStyle w:val="Retraitcorpsdetexte"/>
       </w:pPr>
     </w:p>
     <w:p>
@@ -2785,12 +2785,12 @@
     </w:p>
     <w:p>
       <w:pPr>
-        <w:pStyle w:val="BodyTextIndent"/>
-      </w:pPr>
-    </w:p>
-    <w:p>
-      <w:pPr>
-        <w:pStyle w:val="Heading2"/>
+        <w:pStyle w:val="Retraitcorpsdetexte"/>
+      </w:pPr>
+    </w:p>
+    <w:p>
+      <w:pPr>
+        <w:pStyle w:val="Titre2"/>
       </w:pPr>
       <w:bookmarkStart w:id="5" w:name="_Toc240025455"/>
       <w:r>
@@ -2800,7 +2800,7 @@
     </w:p>
     <w:p>
       <w:pPr>
-        <w:pStyle w:val="BodyTextIndent"/>
+        <w:pStyle w:val="Retraitcorpsdetexte"/>
       </w:pPr>
     </w:p>
     <w:p>
@@ -2816,12 +2816,12 @@
     </w:p>
     <w:p>
       <w:pPr>
-        <w:pStyle w:val="BodyTextIndent"/>
-      </w:pPr>
-    </w:p>
-    <w:p>
-      <w:pPr>
-        <w:pStyle w:val="Heading1"/>
+        <w:pStyle w:val="Retraitcorpsdetexte"/>
+      </w:pPr>
+    </w:p>
+    <w:p>
+      <w:pPr>
+        <w:pStyle w:val="Titre1"/>
       </w:pPr>
       <w:bookmarkStart w:id="6" w:name="_Toc240025456"/>
       <w:r>
@@ -2836,7 +2836,7 @@
     </w:p>
     <w:tbl>
       <w:tblPr>
-        <w:tblStyle w:val="TableGrid"/>
+        <w:tblStyle w:val="Grilledutableau"/>
         <w:tblW w:w="0" w:type="auto"/>
         <w:tblInd w:w="567" w:type="dxa"/>
         <w:tblLook w:val="04A0" w:firstRow="1" w:lastRow="0" w:firstColumn="1" w:lastColumn="0" w:noHBand="0" w:noVBand="1"/>
@@ -3044,7 +3044,7 @@
     </w:p>
     <w:p>
       <w:pPr>
-        <w:pStyle w:val="Heading1"/>
+        <w:pStyle w:val="Titre1"/>
       </w:pPr>
       <w:bookmarkStart w:id="7" w:name="_Toc532179957"/>
       <w:bookmarkStart w:id="8" w:name="_Toc165969641"/>
@@ -3058,7 +3058,7 @@
     </w:p>
     <w:p>
       <w:pPr>
-        <w:pStyle w:val="Heading2"/>
+        <w:pStyle w:val="Titre2"/>
       </w:pPr>
       <w:bookmarkStart w:id="10" w:name="_Toc240025458"/>
       <w:r>
@@ -3071,7 +3071,7 @@
     </w:p>
     <w:p>
       <w:pPr>
-        <w:pStyle w:val="Heading1"/>
+        <w:pStyle w:val="Titre1"/>
         <w:numPr>
           <w:ilvl w:val="0"/>
           <w:numId w:val="0"/>
@@ -3248,7 +3248,7 @@
     <w:p/>
     <w:p>
       <w:pPr>
-        <w:pStyle w:val="Heading1"/>
+        <w:pStyle w:val="Titre1"/>
         <w:numPr>
           <w:ilvl w:val="0"/>
           <w:numId w:val="0"/>
@@ -3393,7 +3393,7 @@
     <w:p/>
     <w:p>
       <w:pPr>
-        <w:pStyle w:val="Heading1"/>
+        <w:pStyle w:val="Titre1"/>
         <w:numPr>
           <w:ilvl w:val="0"/>
           <w:numId w:val="0"/>
@@ -3534,7 +3534,7 @@
     <w:p/>
     <w:p>
       <w:pPr>
-        <w:pStyle w:val="Heading1"/>
+        <w:pStyle w:val="Titre1"/>
         <w:numPr>
           <w:ilvl w:val="0"/>
           <w:numId w:val="0"/>
@@ -3711,7 +3711,7 @@
     </w:p>
     <w:p>
       <w:pPr>
-        <w:pStyle w:val="Heading1"/>
+        <w:pStyle w:val="Titre1"/>
         <w:numPr>
           <w:ilvl w:val="0"/>
           <w:numId w:val="0"/>
@@ -3842,7 +3842,7 @@
     </w:p>
     <w:p>
       <w:pPr>
-        <w:pStyle w:val="Heading1"/>
+        <w:pStyle w:val="Titre1"/>
         <w:numPr>
           <w:ilvl w:val="0"/>
           <w:numId w:val="0"/>
@@ -3998,203 +3998,574 @@
     <w:bookmarkEnd w:id="11"/>
     <w:p>
       <w:pPr>
-        <w:pStyle w:val="Heading1"/>
+        <w:pStyle w:val="Titre1"/>
       </w:pPr>
       <w:r>
         <w:t>RAPPORT DE TESTS</w:t>
       </w:r>
     </w:p>
     <w:p>
+      <w:r>
+        <w:t>Dans le cahier des charges, aucun minimum de test unitaire n'a été demandé, j'ai donc décidé de mettre en place plusieurs tests unitaires (via MS Test). Ces tests permettent de vérifier que la logique principale du jeu fonctionne comme prévu :</w:t>
+      </w:r>
+    </w:p>
+    <w:p>
+      <w:pPr>
+        <w:pStyle w:val="Titre2"/>
+      </w:pPr>
+      <w:r>
+        <w:t>Gestion du Joueur</w:t>
+      </w:r>
+    </w:p>
+    <w:p>
+      <w:pPr>
+        <w:pStyle w:val="Listepuces"/>
+        <w:numPr>
+          <w:ilvl w:val="0"/>
+          <w:numId w:val="37"/>
+        </w:numPr>
+        <w:tabs>
+          <w:tab w:val="clear" w:pos="360"/>
+          <w:tab w:val="num" w:pos="1428"/>
+        </w:tabs>
+        <w:ind w:left="1428"/>
+        <w:rPr>
+          <w:lang w:val="fr-CH"/>
+        </w:rPr>
+      </w:pPr>
+      <w:r>
+        <w:rPr>
+          <w:b/>
+          <w:lang w:val="fr-CH"/>
+        </w:rPr>
+        <w:t xml:space="preserve">Initialisation par défaut : </w:t>
+      </w:r>
+      <w:r>
+        <w:rPr>
+          <w:lang w:val="fr-CH"/>
+        </w:rPr>
+        <w:t>Vérifie que le joueur possède des points de vie initiaux valides et une position de départ correcte (</w:t>
+      </w:r>
+      <w:proofErr w:type="spellStart"/>
+      <w:r>
+        <w:rPr>
+          <w:lang w:val="fr-CH"/>
+        </w:rPr>
+        <w:t>Player_Initialisation_DoitAvoirValeursParDefaut</w:t>
+      </w:r>
+      <w:proofErr w:type="spellEnd"/>
+      <w:r>
+        <w:rPr>
+          <w:lang w:val="fr-CH"/>
+        </w:rPr>
+        <w:t>).</w:t>
+      </w:r>
+    </w:p>
+    <w:p>
+      <w:pPr>
+        <w:pStyle w:val="Listepuces"/>
+        <w:numPr>
+          <w:ilvl w:val="0"/>
+          <w:numId w:val="37"/>
+        </w:numPr>
+        <w:tabs>
+          <w:tab w:val="clear" w:pos="360"/>
+          <w:tab w:val="num" w:pos="1428"/>
+        </w:tabs>
+        <w:ind w:left="1428"/>
+        <w:rPr>
+          <w:lang w:val="fr-CH"/>
+        </w:rPr>
+      </w:pPr>
+      <w:r>
+        <w:rPr>
+          <w:b/>
+          <w:lang w:val="fr-CH"/>
+        </w:rPr>
+        <w:t xml:space="preserve">Gestion des dégâts : </w:t>
+      </w:r>
+      <w:r>
+        <w:rPr>
+          <w:lang w:val="fr-CH"/>
+        </w:rPr>
+        <w:t>S'assure que la réduction des points de vie s'effectue correctement lorsqu'il subit des dégâts (</w:t>
+      </w:r>
+      <w:proofErr w:type="spellStart"/>
+      <w:r>
+        <w:rPr>
+          <w:lang w:val="fr-CH"/>
+        </w:rPr>
+        <w:t>Player_TakeDamage_DoitReduireLaSante</w:t>
+      </w:r>
+      <w:proofErr w:type="spellEnd"/>
+      <w:r>
+        <w:rPr>
+          <w:lang w:val="fr-CH"/>
+        </w:rPr>
+        <w:t>).</w:t>
+      </w:r>
+    </w:p>
+    <w:p>
+      <w:pPr>
+        <w:pStyle w:val="Listepuces"/>
+        <w:numPr>
+          <w:ilvl w:val="0"/>
+          <w:numId w:val="37"/>
+        </w:numPr>
+        <w:tabs>
+          <w:tab w:val="clear" w:pos="360"/>
+          <w:tab w:val="num" w:pos="1428"/>
+        </w:tabs>
+        <w:ind w:left="1428"/>
+        <w:rPr>
+          <w:lang w:val="fr-CH"/>
+        </w:rPr>
+      </w:pPr>
+      <w:r>
+        <w:rPr>
+          <w:b/>
+          <w:lang w:val="fr-CH"/>
+        </w:rPr>
+        <w:t xml:space="preserve">État critique / Mort : </w:t>
+      </w:r>
+      <w:r>
+        <w:rPr>
+          <w:lang w:val="fr-CH"/>
+        </w:rPr>
+        <w:t>Vérifie qu'un dégât fatal amène les points de vie du joueur en dessous de zéro et valide son état de mort (</w:t>
+      </w:r>
+      <w:proofErr w:type="spellStart"/>
+      <w:r>
+        <w:rPr>
+          <w:lang w:val="fr-CH"/>
+        </w:rPr>
+        <w:t>Player_TakeFatalDamage_DoitTuerLeJoueur</w:t>
+      </w:r>
+      <w:proofErr w:type="spellEnd"/>
+      <w:r>
+        <w:rPr>
+          <w:lang w:val="fr-CH"/>
+        </w:rPr>
+        <w:t>).</w:t>
+      </w:r>
+    </w:p>
+    <w:p>
+      <w:pPr>
+        <w:pStyle w:val="Titre2"/>
+      </w:pPr>
+      <w:r>
+        <w:lastRenderedPageBreak/>
+        <w:t>Déplacement des Ennemis</w:t>
+      </w:r>
+    </w:p>
+    <w:p>
+      <w:pPr>
+        <w:pStyle w:val="Listepuces"/>
+        <w:numPr>
+          <w:ilvl w:val="0"/>
+          <w:numId w:val="37"/>
+        </w:numPr>
+        <w:tabs>
+          <w:tab w:val="clear" w:pos="360"/>
+          <w:tab w:val="num" w:pos="1494"/>
+        </w:tabs>
+        <w:ind w:left="1494"/>
+        <w:rPr>
+          <w:lang w:val="fr-CH"/>
+        </w:rPr>
+      </w:pPr>
+      <w:r>
+        <w:rPr>
+          <w:b/>
+          <w:lang w:val="fr-CH"/>
+        </w:rPr>
+        <w:t xml:space="preserve">Mise à jour de la position : </w:t>
+      </w:r>
+      <w:r>
+        <w:rPr>
+          <w:lang w:val="fr-CH"/>
+        </w:rPr>
+        <w:t>Vérifie que la position de l'ennemi se met à jour correctement lors des appels de mouvement (</w:t>
+      </w:r>
+      <w:proofErr w:type="spellStart"/>
+      <w:r>
+        <w:rPr>
+          <w:lang w:val="fr-CH"/>
+        </w:rPr>
+        <w:t>Ennemie_Move_DoitMettreAJourLaPosition</w:t>
+      </w:r>
+      <w:proofErr w:type="spellEnd"/>
+      <w:r>
+        <w:rPr>
+          <w:lang w:val="fr-CH"/>
+        </w:rPr>
+        <w:t>).</w:t>
+      </w:r>
+    </w:p>
+    <w:p>
+      <w:pPr>
+        <w:pStyle w:val="Titre2"/>
+      </w:pPr>
+      <w:r>
+        <w:t>Gestion des Tirs et Projectiles</w:t>
+      </w:r>
+    </w:p>
+    <w:p>
+      <w:pPr>
+        <w:pStyle w:val="Listepuces"/>
+        <w:numPr>
+          <w:ilvl w:val="0"/>
+          <w:numId w:val="37"/>
+        </w:numPr>
+        <w:tabs>
+          <w:tab w:val="clear" w:pos="360"/>
+          <w:tab w:val="num" w:pos="1428"/>
+        </w:tabs>
+        <w:ind w:left="1428"/>
+        <w:rPr>
+          <w:lang w:val="fr-CH"/>
+        </w:rPr>
+      </w:pPr>
+      <w:r>
+        <w:rPr>
+          <w:b/>
+          <w:lang w:val="fr-CH"/>
+        </w:rPr>
+        <w:t xml:space="preserve">Avancement selon la vitesse : </w:t>
+      </w:r>
+      <w:r>
+        <w:rPr>
+          <w:lang w:val="fr-CH"/>
+        </w:rPr>
+        <w:t>S'assure qu'un tir progresse correctement selon sa vitesse (par exemple, le tir du joueur monte et sa position Y diminue) (</w:t>
+      </w:r>
+      <w:proofErr w:type="spellStart"/>
+      <w:r>
+        <w:rPr>
+          <w:lang w:val="fr-CH"/>
+        </w:rPr>
+        <w:t>Tir_Update_DoitAvancerSelonSaVitesse</w:t>
+      </w:r>
+      <w:proofErr w:type="spellEnd"/>
+      <w:r>
+        <w:rPr>
+          <w:lang w:val="fr-CH"/>
+        </w:rPr>
+        <w:t>).</w:t>
+      </w:r>
+    </w:p>
+    <w:p>
+      <w:pPr>
+        <w:pStyle w:val="Listepuces"/>
+        <w:numPr>
+          <w:ilvl w:val="0"/>
+          <w:numId w:val="37"/>
+        </w:numPr>
+        <w:tabs>
+          <w:tab w:val="clear" w:pos="360"/>
+          <w:tab w:val="num" w:pos="1428"/>
+        </w:tabs>
+        <w:ind w:left="1428"/>
+        <w:rPr>
+          <w:lang w:val="fr-CH"/>
+        </w:rPr>
+      </w:pPr>
+      <w:r>
+        <w:rPr>
+          <w:b/>
+          <w:lang w:val="fr-CH"/>
+        </w:rPr>
+        <w:t>Sortie de zone (</w:t>
+      </w:r>
+      <w:proofErr w:type="spellStart"/>
+      <w:r>
+        <w:rPr>
+          <w:b/>
+          <w:lang w:val="fr-CH"/>
+        </w:rPr>
+        <w:t>outofspace</w:t>
+      </w:r>
+      <w:proofErr w:type="spellEnd"/>
+      <w:r>
+        <w:rPr>
+          <w:b/>
+          <w:lang w:val="fr-CH"/>
+        </w:rPr>
+        <w:t xml:space="preserve">) : </w:t>
+      </w:r>
+      <w:r>
+        <w:rPr>
+          <w:lang w:val="fr-CH"/>
+        </w:rPr>
+        <w:t>Vérifie qu'un tir sortant des limites de l'écran est correctement détecté (</w:t>
+      </w:r>
+      <w:proofErr w:type="spellStart"/>
+      <w:r>
+        <w:rPr>
+          <w:lang w:val="fr-CH"/>
+        </w:rPr>
+        <w:t>Tir_IsOutOfBounds_DoitRetournerVraiIsHorsEcran</w:t>
+      </w:r>
+      <w:proofErr w:type="spellEnd"/>
+      <w:r>
+        <w:rPr>
+          <w:lang w:val="fr-CH"/>
+        </w:rPr>
+        <w:t>).</w:t>
+      </w:r>
+    </w:p>
+    <w:p>
+      <w:pPr>
+        <w:pStyle w:val="Titre2"/>
+      </w:pPr>
+      <w:r>
+        <w:t>Détection des Collisions</w:t>
+      </w:r>
+    </w:p>
+    <w:p>
+      <w:pPr>
+        <w:pStyle w:val="Listepuces"/>
+        <w:numPr>
+          <w:ilvl w:val="0"/>
+          <w:numId w:val="37"/>
+        </w:numPr>
+        <w:tabs>
+          <w:tab w:val="clear" w:pos="360"/>
+          <w:tab w:val="num" w:pos="1494"/>
+        </w:tabs>
+        <w:ind w:left="1494"/>
+        <w:rPr>
+          <w:lang w:val="fr-CH"/>
+        </w:rPr>
+      </w:pPr>
+      <w:r>
+        <w:rPr>
+          <w:b/>
+          <w:lang w:val="fr-CH"/>
+        </w:rPr>
+        <w:t xml:space="preserve">Superposition entre entités et tirs : </w:t>
+      </w:r>
+      <w:r>
+        <w:rPr>
+          <w:lang w:val="fr-CH"/>
+        </w:rPr>
+        <w:t xml:space="preserve">S'assure de la bonne détection de collision (via </w:t>
+      </w:r>
+      <w:proofErr w:type="spellStart"/>
+      <w:r>
+        <w:rPr>
+          <w:lang w:val="fr-CH"/>
+        </w:rPr>
+        <w:t>MathHelpers.Distance</w:t>
+      </w:r>
+      <w:proofErr w:type="spellEnd"/>
+      <w:r>
+        <w:rPr>
+          <w:lang w:val="fr-CH"/>
+        </w:rPr>
+        <w:t>) lorsque la distance entre un ennemi et un tir franchit le seuil requis (</w:t>
+      </w:r>
+      <w:proofErr w:type="spellStart"/>
+      <w:r>
+        <w:rPr>
+          <w:lang w:val="fr-CH"/>
+        </w:rPr>
+        <w:t>Ennemie_Collision_DoitRetournerVraiSiSuperposition</w:t>
+      </w:r>
+      <w:proofErr w:type="spellEnd"/>
+      <w:r>
+        <w:rPr>
+          <w:lang w:val="fr-CH"/>
+        </w:rPr>
+        <w:t>).</w:t>
+      </w:r>
+    </w:p>
+    <w:p>
+      <w:pPr>
+        <w:pStyle w:val="Titre2"/>
+      </w:pPr>
+      <w:r>
+        <w:t>Fonctions Utilitaires</w:t>
+      </w:r>
+    </w:p>
+    <w:p>
+      <w:pPr>
+        <w:pStyle w:val="Listepuces"/>
+        <w:numPr>
+          <w:ilvl w:val="0"/>
+          <w:numId w:val="37"/>
+        </w:numPr>
+        <w:tabs>
+          <w:tab w:val="clear" w:pos="360"/>
+          <w:tab w:val="num" w:pos="1494"/>
+        </w:tabs>
+        <w:ind w:left="1494"/>
+        <w:rPr>
+          <w:lang w:val="fr-CH"/>
+        </w:rPr>
+      </w:pPr>
+      <w:r>
+        <w:rPr>
+          <w:b/>
+          <w:lang w:val="fr-CH"/>
+        </w:rPr>
+        <w:t xml:space="preserve">Calcul de distance euclidienne : </w:t>
+      </w:r>
+      <w:r>
+        <w:rPr>
+          <w:lang w:val="fr-CH"/>
+        </w:rPr>
+        <w:t xml:space="preserve">Vérifie que la fonction </w:t>
+      </w:r>
+      <w:proofErr w:type="spellStart"/>
+      <w:r>
+        <w:rPr>
+          <w:lang w:val="fr-CH"/>
+        </w:rPr>
+        <w:t>MathHelpers.Distance</w:t>
+      </w:r>
+      <w:proofErr w:type="spellEnd"/>
+      <w:r>
+        <w:rPr>
+          <w:lang w:val="fr-CH"/>
+        </w:rPr>
+        <w:t xml:space="preserve"> retourne un résultat exact, validé par exemple sur un triangle de dimensions 3-4-5 (</w:t>
+      </w:r>
+      <w:proofErr w:type="spellStart"/>
+      <w:r>
+        <w:rPr>
+          <w:lang w:val="fr-CH"/>
+        </w:rPr>
+        <w:t>CalculateDistance_DoitRetournerLaBonneDistance</w:t>
+      </w:r>
+      <w:proofErr w:type="spellEnd"/>
+      <w:r>
+        <w:rPr>
+          <w:lang w:val="fr-CH"/>
+        </w:rPr>
+        <w:t>).</w:t>
+      </w:r>
+    </w:p>
+    <w:p>
+      <w:pPr>
+        <w:pStyle w:val="Titre1"/>
+      </w:pPr>
+      <w:r>
+        <w:t>CONCEPTION</w:t>
+      </w:r>
+    </w:p>
+    <w:p>
+      <w:pPr>
+        <w:pStyle w:val="Titre2"/>
+      </w:pPr>
+      <w:r>
+        <w:t>Avant le codage</w:t>
+      </w:r>
+    </w:p>
+    <w:p>
+      <w:pPr>
+        <w:ind w:left="1134"/>
+      </w:pPr>
+      <w:r>
+        <w:t xml:space="preserve">J’ai tout d’abord écrit des user stories qui répondait </w:t>
+      </w:r>
+      <w:proofErr w:type="gramStart"/>
+      <w:r>
+        <w:t>au demande</w:t>
+      </w:r>
+      <w:proofErr w:type="gramEnd"/>
+      <w:r>
+        <w:t xml:space="preserve"> du CDC </w:t>
+      </w:r>
+    </w:p>
+    <w:p>
+      <w:pPr>
+        <w:pStyle w:val="Titre2"/>
+      </w:pPr>
+      <w:r>
+        <w:t>Pendant le codage</w:t>
+      </w:r>
+    </w:p>
+    <w:p>
+      <w:pPr>
+        <w:ind w:left="1134"/>
+      </w:pPr>
+      <w:r>
+        <w:t>J'ai aussi essayé de respecter au plus le principe DRY en réutilisant des méthodes et fonctions afin de ne pas me répéter inutilement.</w:t>
+      </w:r>
+    </w:p>
+    <w:p>
+      <w:pPr>
+        <w:pStyle w:val="Titre1"/>
+      </w:pPr>
+      <w:r>
+        <w:t>EXPLICATION DE L'USAGE FAIT DE L'IA DANS CE PROJET</w:t>
+      </w:r>
+    </w:p>
+    <w:p>
+      <w:pPr>
+        <w:pStyle w:val="Titre2"/>
+      </w:pPr>
+      <w:r>
+        <w:t>Dans le code</w:t>
+      </w:r>
+    </w:p>
+    <w:p>
+      <w:pPr>
+        <w:ind w:left="1134"/>
+      </w:pPr>
+      <w:r>
+        <w:t>Durant le projet, l'IA m'a orienté quand j'ai été bloqué sur l'implémentation de mes US (gestion de l'affichage double buffer, structuration des classes Player, Ennemie, Tir, Barriere).</w:t>
+      </w:r>
+    </w:p>
+    <w:p>
+      <w:pPr>
+        <w:pStyle w:val="Titre2"/>
+      </w:pPr>
+      <w:r>
+        <w:t>Hors code</w:t>
+      </w:r>
+    </w:p>
+    <w:p>
+      <w:pPr>
+        <w:ind w:left="1134"/>
+      </w:pPr>
+      <w:r>
+        <w:t>J'ai utilisé l'aide externe et l'IA afin de résoudre des erreurs avec le compilateur et Visual Studio 2022.</w:t>
+      </w:r>
+    </w:p>
+    <w:p>
+      <w:pPr>
+        <w:pStyle w:val="Titre1"/>
+      </w:pPr>
+      <w:r>
+        <w:t>BILAN DU DÉROULEMENT DU PROJET</w:t>
+      </w:r>
+    </w:p>
+    <w:p>
       <w:pPr>
         <w:ind w:left="567"/>
       </w:pPr>
       <w:r>
-        <w:t>Dans le cahier des charges aucun minimum de test unitaire n'a été demandé, j'ai donc décidé de mettre en place plusieurs tests unitaires (via MS Test). Ces tests permettent de vérifier que la logique principale du jeu fonctionne comme prévu :</w:t>
-      </w:r>
-    </w:p>
-    <w:p>
-      <w:pPr>
-        <w:pStyle w:val="Heading2"/>
-      </w:pPr>
-      <w:r>
-        <w:t>Tir du joueur</w:t>
-      </w:r>
-    </w:p>
-    <w:p>
-      <w:pPr>
-        <w:ind w:left="1134"/>
-      </w:pPr>
-      <w:r>
-        <w:t>Vérifie que lorsque le joueur tire ou que les classes gèrent les tirs, les projectiles se comportent correctement et avancent selon leur vitesse.</w:t>
-      </w:r>
-    </w:p>
-    <w:p>
-      <w:pPr>
-        <w:pStyle w:val="Heading2"/>
-      </w:pPr>
-      <w:r>
-        <w:t>Disparition des balles</w:t>
-      </w:r>
-    </w:p>
-    <w:p>
-      <w:pPr>
-        <w:ind w:left="1134"/>
-      </w:pPr>
-      <w:r>
-        <w:t>S'assure qu'une balle se supprime d'elle-même ou devient hors de l'espace de jeu (</w:t>
-      </w:r>
-      <w:proofErr w:type="spellStart"/>
-      <w:r>
-        <w:t>outofspace</w:t>
-      </w:r>
-      <w:proofErr w:type="spellEnd"/>
-      <w:r>
-        <w:t>) après un certain parcours.</w:t>
-      </w:r>
-    </w:p>
-    <w:p>
-      <w:pPr>
-        <w:pStyle w:val="Heading2"/>
-      </w:pPr>
-      <w:r>
-        <w:t>Augmentation du score</w:t>
-      </w:r>
-    </w:p>
-    <w:p>
-      <w:pPr>
-        <w:ind w:left="426" w:firstLine="708"/>
-      </w:pPr>
-      <w:r>
-        <w:t>Vérifie que le score augmente bien lorsqu'un ennemi est vaincu.</w:t>
-      </w:r>
-    </w:p>
-    <w:p>
-      <w:pPr>
-        <w:pStyle w:val="Heading2"/>
-      </w:pPr>
-      <w:r>
-        <w:t>Limites de zone d'écran</w:t>
-      </w:r>
-    </w:p>
-    <w:p>
-      <w:pPr>
-        <w:ind w:left="1134"/>
-      </w:pPr>
-      <w:r>
-        <w:t>S'assure que le joueur reste confiné ou gère correctement les limites de l'espace de jeu défini dans Config.</w:t>
-      </w:r>
-    </w:p>
-    <w:p>
-      <w:pPr>
-        <w:pStyle w:val="Heading2"/>
-      </w:pPr>
+        <w:t xml:space="preserve">Sur le début du projet je bloquais énormément car j'avais du mal à comprendre la programmation orientée objet, mais par la suite, le projet s'est majoritairement bien </w:t>
+      </w:r>
       <w:r>
         <w:lastRenderedPageBreak/>
-        <w:t>Collision avec les protections</w:t>
-      </w:r>
-    </w:p>
-    <w:p>
-      <w:pPr>
-        <w:ind w:left="1134"/>
-      </w:pPr>
-      <w:r>
-        <w:t xml:space="preserve">S'assure de la bonne détection de distance (via </w:t>
-      </w:r>
-      <w:proofErr w:type="spellStart"/>
-      <w:r>
-        <w:t>MathHelpers.Distance</w:t>
-      </w:r>
-      <w:proofErr w:type="spellEnd"/>
-      <w:r>
-        <w:t>) pour les collisions entre entités, tirs et barrières.</w:t>
-      </w:r>
-    </w:p>
-    <w:p>
-      <w:pPr>
-        <w:pStyle w:val="Heading1"/>
-      </w:pPr>
-      <w:r>
-        <w:t>CONCEPTION</w:t>
-      </w:r>
-    </w:p>
-    <w:p>
-      <w:pPr>
-        <w:pStyle w:val="Heading2"/>
-      </w:pPr>
-      <w:r>
-        <w:t>Avant le codage</w:t>
-      </w:r>
-    </w:p>
-    <w:p>
-      <w:pPr>
-        <w:ind w:left="1134"/>
-      </w:pPr>
-      <w:r>
-        <w:t>J'ai commencé par créer les différentes User Stories pour organiser l'ensemble des fonctionnalités à coder et estimer le temps nécessaire.</w:t>
-      </w:r>
-    </w:p>
-    <w:p>
-      <w:pPr>
-        <w:pStyle w:val="Heading2"/>
-      </w:pPr>
-      <w:r>
-        <w:t>Pendant le codage</w:t>
-      </w:r>
-    </w:p>
-    <w:p>
-      <w:pPr>
-        <w:ind w:left="1134"/>
-      </w:pPr>
-      <w:r>
-        <w:t>J'ai aussi essayé de respecter au plus le principe DRY en réutilisant des méthodes et fonctions afin de ne pas me répéter inutilement.</w:t>
-      </w:r>
-    </w:p>
-    <w:p>
-      <w:pPr>
-        <w:pStyle w:val="Heading1"/>
-      </w:pPr>
-      <w:r>
-        <w:t>EXPLICATION DE L'USAGE FAIT DE L'IA DANS CE PROJET</w:t>
-      </w:r>
-    </w:p>
-    <w:p>
-      <w:pPr>
-        <w:pStyle w:val="Heading2"/>
-      </w:pPr>
-      <w:r>
-        <w:t>Dans le code</w:t>
-      </w:r>
-    </w:p>
-    <w:p>
-      <w:pPr>
-        <w:ind w:left="1134"/>
-      </w:pPr>
-      <w:r>
-        <w:t>Durant le projet, l'IA m'a orienté quand j'ai été bloqué sur l'implémentation de mes US (gestion de l'affichage double buffer, structuration des classes Player, Ennemie, Tir, Barriere).</w:t>
-      </w:r>
-    </w:p>
-    <w:p>
-      <w:pPr>
-        <w:pStyle w:val="Heading2"/>
-      </w:pPr>
-      <w:r>
-        <w:t>Hors code</w:t>
-      </w:r>
-    </w:p>
-    <w:p>
-      <w:pPr>
-        <w:ind w:left="1134"/>
-      </w:pPr>
-      <w:r>
-        <w:t>J'ai utilisé l'aide externe et l'IA afin de résoudre des erreurs avec le compilateur et Visual Studio 2022.</w:t>
-      </w:r>
-    </w:p>
-    <w:p>
-      <w:pPr>
-        <w:pStyle w:val="Heading1"/>
-      </w:pPr>
-      <w:r>
-        <w:t>BILAN DU DÉROULEMENT DU PROJET</w:t>
+        <w:t>passé. J'ai réussi à coder les fonctionnalités du cahier des charge</w:t>
+      </w:r>
+      <w:r>
+        <w:t>s</w:t>
+      </w:r>
+      <w:r>
+        <w:t>. J'ai quand même rencontré quelques difficultés, notamment pour l'affichage fluide, mais j'ai réussi à tout régler au fur et à mesure.</w:t>
+      </w:r>
+    </w:p>
+    <w:p>
+      <w:pPr>
+        <w:pStyle w:val="Titre1"/>
+      </w:pPr>
+      <w:r>
+        <w:t>BILAN PRODUIT</w:t>
       </w:r>
     </w:p>
     <w:p>
@@ -4202,28 +4573,12 @@
         <w:ind w:left="567"/>
       </w:pPr>
       <w:r>
-        <w:t>Sur le début du projet je bloquais énormément car j'avais du mal à comprendre la programmation orientée objet, mais par la suite, le projet s'est majoritairement bien passé. J'ai réussi à coder les fonctionnalités du cahier des charges et aussi d'autres options en plus. J'ai quand même rencontré quelques difficultés, notamment pour gérer les collisions et l'affichage fluide, mais j'ai réussi à tout régler au fur et à mesure.</w:t>
-      </w:r>
-    </w:p>
-    <w:p>
-      <w:pPr>
-        <w:pStyle w:val="Heading1"/>
-      </w:pPr>
-      <w:r>
-        <w:t>BILAN PRODUIT</w:t>
-      </w:r>
-    </w:p>
-    <w:p>
-      <w:pPr>
-        <w:ind w:left="567"/>
-      </w:pPr>
-      <w:r>
-        <w:t>Le résultat final correspond à ce que je voulais faire. Le jeu est fonctionnel, jouable et reprend bien le style demandé dans le cahier des charges. Ce projet m'a permis d'en apprendre beaucoup en programmation orientée objet et en Windows Forms.</w:t>
-      </w:r>
-    </w:p>
-    <w:p>
-      <w:pPr>
-        <w:pStyle w:val="Heading1"/>
+        <w:t>Le résultat final correspond à ce que je voulais faire. Le jeu est fonctionnel, jouable et reprend bien le style demandé dans le cahier des charges. Ce projet m'a permis d'en apprendre beaucoup en programmation orientée objet.</w:t>
+      </w:r>
+    </w:p>
+    <w:p>
+      <w:pPr>
+        <w:pStyle w:val="Titre1"/>
       </w:pPr>
       <w:r>
         <w:t>CONCLUSION</w:t>
@@ -4273,7 +4628,7 @@
 <w:ftr xmlns:wpc="http://schemas.microsoft.com/office/word/2010/wordprocessingCanvas" xmlns:cx="http://schemas.microsoft.com/office/drawing/2014/chartex" xmlns:cx1="http://schemas.microsoft.com/office/drawing/2015/9/8/chartex" xmlns:cx2="http://schemas.microsoft.com/office/drawing/2015/10/21/chartex" xmlns:cx3="http://schemas.microsoft.com/office/drawing/2016/5/9/chartex" xmlns:cx4="http://schemas.microsoft.com/office/drawing/2016/5/10/chartex" xmlns:cx5="http://schemas.microsoft.com/office/drawing/2016/5/11/chartex" xmlns:cx6="http://schemas.microsoft.com/office/drawing/2016/5/12/chartex" xmlns:cx7="http://schemas.microsoft.com/office/drawing/2016/5/13/chartex" xmlns:cx8="http://schemas.microsoft.com/office/drawing/2016/5/14/chartex" xmlns:mc="http://schemas.openxmlformats.org/markup-compatibility/2006" xmlns:aink="http://schemas.microsoft.com/office/drawing/2016/ink" xmlns:am3d="http://schemas.microsoft.com/office/drawing/2017/model3d" xmlns:o="urn:schemas-microsoft-com:office:office" xmlns:oel="http://schemas.microsoft.com/office/2019/extlst" xmlns:r="http://schemas.openxmlformats.org/officeDocument/2006/relationships" xmlns:m="http://schemas.openxmlformats.org/officeDocument/2006/math" xmlns:v="urn:schemas-microsoft-com:vml" xmlns:wp14="http://schemas.microsoft.com/office/word/2010/wordprocessingDrawing" xmlns:wp="http://schemas.openxmlformats.org/drawingml/2006/wordprocessingDrawing" xmlns:w10="urn:schemas-microsoft-com:office:word" xmlns:w="http://schemas.openxmlformats.org/wordprocessingml/2006/main" xmlns:w14="http://schemas.microsoft.com/office/word/2010/wordml" xmlns:w15="http://schemas.microsoft.com/office/word/2012/wordml" xmlns:w16cex="http://schemas.microsoft.com/office/word/2018/wordml/cex" xmlns:w16cid="http://schemas.microsoft.com/office/word/2016/wordml/cid" xmlns:w16="http://schemas.microsoft.com/office/word/2018/wordml" xmlns:w16du="http://schemas.microsoft.com/office/word/2023/wordml/word16du" xmlns:w16sdtdh="http://schemas.microsoft.com/office/word/2020/wordml/sdtdatahash" xmlns:w16sdtfl="http://schemas.microsoft.com/office/word/2024/wordml/sdtformatlock" xmlns:w16se="http://schemas.microsoft.com/office/word/2015/wordml/symex" xmlns:wpg="http://schemas.microsoft.com/office/word/2010/wordprocessingGroup" xmlns:wpi="http://schemas.microsoft.com/office/word/2010/wordprocessingInk" xmlns:wne="http://schemas.microsoft.com/office/word/2006/wordml" xmlns:wps="http://schemas.microsoft.com/office/word/2010/wordprocessingShape" mc:Ignorable="w14 w15 w16se w16cid w16 w16cex w16sdtdh w16sdtfl w16du wp14">
   <w:tbl>
     <w:tblPr>
-      <w:tblStyle w:val="TableGrid"/>
+      <w:tblStyle w:val="Grilledutableau"/>
       <w:tblW w:w="5000" w:type="pct"/>
       <w:jc w:val="center"/>
       <w:tblBorders>
@@ -4490,7 +4845,7 @@
           </w:r>
           <w:r>
             <w:rPr>
-              <w:rStyle w:val="PageNumber"/>
+              <w:rStyle w:val="Numrodepage"/>
               <w:rFonts w:cs="Arial"/>
               <w:szCs w:val="16"/>
             </w:rPr>
@@ -4498,7 +4853,7 @@
           </w:r>
           <w:r>
             <w:rPr>
-              <w:rStyle w:val="PageNumber"/>
+              <w:rStyle w:val="Numrodepage"/>
               <w:rFonts w:cs="Arial"/>
               <w:szCs w:val="16"/>
             </w:rPr>
@@ -4506,7 +4861,7 @@
           </w:r>
           <w:r>
             <w:rPr>
-              <w:rStyle w:val="PageNumber"/>
+              <w:rStyle w:val="Numrodepage"/>
               <w:rFonts w:cs="Arial"/>
               <w:szCs w:val="16"/>
             </w:rPr>
@@ -4514,7 +4869,7 @@
           </w:r>
           <w:r>
             <w:rPr>
-              <w:rStyle w:val="PageNumber"/>
+              <w:rStyle w:val="Numrodepage"/>
               <w:rFonts w:cs="Arial"/>
               <w:noProof/>
               <w:szCs w:val="16"/>
@@ -4523,7 +4878,7 @@
           </w:r>
           <w:r>
             <w:rPr>
-              <w:rStyle w:val="PageNumber"/>
+              <w:rStyle w:val="Numrodepage"/>
               <w:rFonts w:cs="Arial"/>
               <w:szCs w:val="16"/>
             </w:rPr>
@@ -4531,7 +4886,7 @@
           </w:r>
           <w:r>
             <w:rPr>
-              <w:rStyle w:val="PageNumber"/>
+              <w:rStyle w:val="Numrodepage"/>
               <w:rFonts w:cs="Arial"/>
               <w:szCs w:val="16"/>
             </w:rPr>
@@ -4539,7 +4894,7 @@
           </w:r>
           <w:r>
             <w:rPr>
-              <w:rStyle w:val="PageNumber"/>
+              <w:rStyle w:val="Numrodepage"/>
               <w:rFonts w:cs="Arial"/>
               <w:szCs w:val="16"/>
             </w:rPr>
@@ -4547,7 +4902,7 @@
           </w:r>
           <w:r>
             <w:rPr>
-              <w:rStyle w:val="PageNumber"/>
+              <w:rStyle w:val="Numrodepage"/>
               <w:rFonts w:cs="Arial"/>
               <w:szCs w:val="16"/>
             </w:rPr>
@@ -4555,7 +4910,7 @@
           </w:r>
           <w:r>
             <w:rPr>
-              <w:rStyle w:val="PageNumber"/>
+              <w:rStyle w:val="Numrodepage"/>
               <w:rFonts w:cs="Arial"/>
               <w:szCs w:val="16"/>
             </w:rPr>
@@ -4563,7 +4918,7 @@
           </w:r>
           <w:r>
             <w:rPr>
-              <w:rStyle w:val="PageNumber"/>
+              <w:rStyle w:val="Numrodepage"/>
               <w:rFonts w:cs="Arial"/>
               <w:noProof/>
               <w:szCs w:val="16"/>
@@ -4572,7 +4927,7 @@
           </w:r>
           <w:r>
             <w:rPr>
-              <w:rStyle w:val="PageNumber"/>
+              <w:rStyle w:val="Numrodepage"/>
               <w:rFonts w:cs="Arial"/>
               <w:szCs w:val="16"/>
             </w:rPr>
@@ -4724,7 +5079,7 @@
               <w:noProof/>
               <w:szCs w:val="16"/>
             </w:rPr>
-            <w:t>11.09.2026 16:34</w:t>
+            <w:t>29.10.2026 20:11</w:t>
           </w:r>
           <w:r>
             <w:rPr>
@@ -4772,7 +5127,7 @@
   </w:tbl>
   <w:p>
     <w:pPr>
-      <w:pStyle w:val="Footer"/>
+      <w:pStyle w:val="Pieddepage"/>
       <w:rPr>
         <w:sz w:val="2"/>
         <w:szCs w:val="2"/>
@@ -4805,7 +5160,7 @@
 <w:hdr xmlns:wpc="http://schemas.microsoft.com/office/word/2010/wordprocessingCanvas" xmlns:cx="http://schemas.microsoft.com/office/drawing/2014/chartex" xmlns:cx1="http://schemas.microsoft.com/office/drawing/2015/9/8/chartex" xmlns:cx2="http://schemas.microsoft.com/office/drawing/2015/10/21/chartex" xmlns:cx3="http://schemas.microsoft.com/office/drawing/2016/5/9/chartex" xmlns:cx4="http://schemas.microsoft.com/office/drawing/2016/5/10/chartex" xmlns:cx5="http://schemas.microsoft.com/office/drawing/2016/5/11/chartex" xmlns:cx6="http://schemas.microsoft.com/office/drawing/2016/5/12/chartex" xmlns:cx7="http://schemas.microsoft.com/office/drawing/2016/5/13/chartex" xmlns:cx8="http://schemas.microsoft.com/office/drawing/2016/5/14/chartex" xmlns:mc="http://schemas.openxmlformats.org/markup-compatibility/2006" xmlns:aink="http://schemas.microsoft.com/office/drawing/2016/ink" xmlns:am3d="http://schemas.microsoft.com/office/drawing/2017/model3d" xmlns:o="urn:schemas-microsoft-com:office:office" xmlns:oel="http://schemas.microsoft.com/office/2019/extlst" xmlns:r="http://schemas.openxmlformats.org/officeDocument/2006/relationships" xmlns:m="http://schemas.openxmlformats.org/officeDocument/2006/math" xmlns:v="urn:schemas-microsoft-com:vml" xmlns:wp14="http://schemas.microsoft.com/office/word/2010/wordprocessingDrawing" xmlns:wp="http://schemas.openxmlformats.org/drawingml/2006/wordprocessingDrawing" xmlns:w10="urn:schemas-microsoft-com:office:word" xmlns:w="http://schemas.openxmlformats.org/wordprocessingml/2006/main" xmlns:w14="http://schemas.microsoft.com/office/word/2010/wordml" xmlns:w15="http://schemas.microsoft.com/office/word/2012/wordml" xmlns:w16cex="http://schemas.microsoft.com/office/word/2018/wordml/cex" xmlns:w16cid="http://schemas.microsoft.com/office/word/2016/wordml/cid" xmlns:w16="http://schemas.microsoft.com/office/word/2018/wordml" xmlns:w16du="http://schemas.microsoft.com/office/word/2023/wordml/word16du" xmlns:w16sdtdh="http://schemas.microsoft.com/office/word/2020/wordml/sdtdatahash" xmlns:w16sdtfl="http://schemas.microsoft.com/office/word/2024/wordml/sdtformatlock" xmlns:w16se="http://schemas.microsoft.com/office/word/2015/wordml/symex" xmlns:wpg="http://schemas.microsoft.com/office/word/2010/wordprocessingGroup" xmlns:wpi="http://schemas.microsoft.com/office/word/2010/wordprocessingInk" xmlns:wne="http://schemas.microsoft.com/office/word/2006/wordml" xmlns:wps="http://schemas.microsoft.com/office/word/2010/wordprocessingShape" mc:Ignorable="w14 w15 w16se w16cid w16 w16cex w16sdtdh w16sdtfl w16du wp14">
   <w:tbl>
     <w:tblPr>
-      <w:tblStyle w:val="TableGrid"/>
+      <w:tblStyle w:val="Grilledutableau"/>
       <w:tblW w:w="5000" w:type="pct"/>
       <w:jc w:val="center"/>
       <w:tblBorders>
@@ -4817,9 +5172,9 @@
       <w:tblLook w:val="01E0" w:firstRow="1" w:lastRow="1" w:firstColumn="1" w:lastColumn="1" w:noHBand="0" w:noVBand="0"/>
     </w:tblPr>
     <w:tblGrid>
-      <w:gridCol w:w="2390"/>
-      <w:gridCol w:w="4411"/>
-      <w:gridCol w:w="2269"/>
+      <w:gridCol w:w="2402"/>
+      <w:gridCol w:w="4400"/>
+      <w:gridCol w:w="2268"/>
     </w:tblGrid>
     <w:tr>
       <w:trPr>
@@ -4854,7 +5209,7 @@
         </w:tcPr>
         <w:p>
           <w:pPr>
-            <w:pStyle w:val="Header"/>
+            <w:pStyle w:val="En-tte"/>
             <w:jc w:val="right"/>
           </w:pPr>
           <w:r>
@@ -4913,7 +5268,7 @@
   </w:tbl>
   <w:p>
     <w:pPr>
-      <w:pStyle w:val="Header"/>
+      <w:pStyle w:val="En-tte"/>
     </w:pPr>
   </w:p>
 </w:hdr>
@@ -5115,7 +5470,7 @@
   <w:abstractNum w:abstractNumId="9" w15:restartNumberingAfterBreak="0">
     <w:nsid w:val="FFFFFF89"/>
     <w:multiLevelType w:val="singleLevel"/>
-    <w:tmpl w:val="2FD089B0"/>
+    <w:tmpl w:val="0A8023FA"/>
     <w:lvl w:ilvl="0">
       <w:start w:val="1"/>
       <w:numFmt w:val="bullet"/>
@@ -5312,7 +5667,7 @@
     <w:lvl w:ilvl="4">
       <w:start w:val="1"/>
       <w:numFmt w:val="decimal"/>
-      <w:pStyle w:val="Heading5"/>
+      <w:pStyle w:val="Titre5"/>
       <w:lvlText w:val="%1.%2.%3.%4.%5"/>
       <w:lvlJc w:val="left"/>
       <w:pPr>
@@ -5328,7 +5683,7 @@
     <w:lvl w:ilvl="5">
       <w:start w:val="1"/>
       <w:numFmt w:val="decimal"/>
-      <w:pStyle w:val="Heading6"/>
+      <w:pStyle w:val="Titre6"/>
       <w:lvlText w:val="%1.%2.%3.%4.%5.%6"/>
       <w:lvlJc w:val="left"/>
       <w:pPr>
@@ -5344,7 +5699,7 @@
     <w:lvl w:ilvl="6">
       <w:start w:val="1"/>
       <w:numFmt w:val="decimal"/>
-      <w:pStyle w:val="Heading7"/>
+      <w:pStyle w:val="Titre7"/>
       <w:lvlText w:val="%1.%2.%3.%4.%5.%6.%7"/>
       <w:lvlJc w:val="left"/>
       <w:pPr>
@@ -5360,7 +5715,7 @@
     <w:lvl w:ilvl="7">
       <w:start w:val="1"/>
       <w:numFmt w:val="decimal"/>
-      <w:pStyle w:val="Heading8"/>
+      <w:pStyle w:val="Titre8"/>
       <w:lvlText w:val="%1.%2.%3.%4.%5.%6.%7.%8"/>
       <w:lvlJc w:val="left"/>
       <w:pPr>
@@ -5376,7 +5731,7 @@
     <w:lvl w:ilvl="8">
       <w:start w:val="1"/>
       <w:numFmt w:val="decimal"/>
-      <w:pStyle w:val="Heading9"/>
+      <w:pStyle w:val="Titre9"/>
       <w:lvlText w:val="%1.%2.%3.%4.%5.%6.%7.%8.%9"/>
       <w:lvlJc w:val="left"/>
       <w:pPr>
@@ -6239,7 +6594,7 @@
     <w:lvl w:ilvl="0">
       <w:start w:val="1"/>
       <w:numFmt w:val="decimal"/>
-      <w:pStyle w:val="Heading1"/>
+      <w:pStyle w:val="Titre1"/>
       <w:lvlText w:val="%1"/>
       <w:lvlJc w:val="left"/>
       <w:pPr>
@@ -6255,7 +6610,7 @@
     <w:lvl w:ilvl="1">
       <w:start w:val="1"/>
       <w:numFmt w:val="decimal"/>
-      <w:pStyle w:val="Heading2"/>
+      <w:pStyle w:val="Titre2"/>
       <w:lvlText w:val="%1.%2"/>
       <w:lvlJc w:val="left"/>
       <w:pPr>
@@ -6271,7 +6626,7 @@
     <w:lvl w:ilvl="2">
       <w:start w:val="1"/>
       <w:numFmt w:val="decimal"/>
-      <w:pStyle w:val="Heading3"/>
+      <w:pStyle w:val="Titre3"/>
       <w:lvlText w:val="%1.%2.%3"/>
       <w:lvlJc w:val="left"/>
       <w:pPr>
@@ -8587,6 +8942,7 @@
     <w:lsdException w:name="toc 2" w:uiPriority="39"/>
     <w:lsdException w:name="toc 3" w:uiPriority="39"/>
     <w:lsdException w:name="caption" w:semiHidden="1" w:unhideWhenUsed="1" w:qFormat="1"/>
+    <w:lsdException w:name="List Bullet" w:uiPriority="99"/>
     <w:lsdException w:name="Title" w:qFormat="1"/>
     <w:lsdException w:name="Subtitle" w:qFormat="1"/>
     <w:lsdException w:name="Hyperlink" w:uiPriority="99"/>
@@ -8862,10 +9218,10 @@
     <w:qFormat/>
     <w:rsid w:val="00615583"/>
   </w:style>
-  <w:style w:type="paragraph" w:styleId="Heading1">
+  <w:style w:type="paragraph" w:styleId="Titre1">
     <w:name w:val="heading 1"/>
     <w:basedOn w:val="Normal"/>
-    <w:next w:val="BodyText"/>
+    <w:next w:val="Corpsdetexte"/>
     <w:autoRedefine/>
     <w:qFormat/>
     <w:rsid w:val="00AA4393"/>
@@ -8888,10 +9244,10 @@
       <w:szCs w:val="32"/>
     </w:rPr>
   </w:style>
-  <w:style w:type="paragraph" w:styleId="Heading2">
+  <w:style w:type="paragraph" w:styleId="Titre2">
     <w:name w:val="heading 2"/>
     <w:basedOn w:val="Normal"/>
-    <w:next w:val="BodyTextIndent"/>
+    <w:next w:val="Retraitcorpsdetexte"/>
     <w:autoRedefine/>
     <w:qFormat/>
     <w:rsid w:val="00AA4393"/>
@@ -8913,10 +9269,10 @@
       <w:szCs w:val="28"/>
     </w:rPr>
   </w:style>
-  <w:style w:type="paragraph" w:styleId="Heading3">
+  <w:style w:type="paragraph" w:styleId="Titre3">
     <w:name w:val="heading 3"/>
     <w:basedOn w:val="Normal"/>
-    <w:next w:val="BodyTextIndent3"/>
+    <w:next w:val="Retraitcorpsdetexte3"/>
     <w:qFormat/>
     <w:rsid w:val="00AA4393"/>
     <w:pPr>
@@ -8936,7 +9292,7 @@
       <w:szCs w:val="26"/>
     </w:rPr>
   </w:style>
-  <w:style w:type="paragraph" w:styleId="Heading4">
+  <w:style w:type="paragraph" w:styleId="Titre4">
     <w:name w:val="heading 4"/>
     <w:basedOn w:val="Normal"/>
     <w:next w:val="Normal"/>
@@ -8955,7 +9311,7 @@
       <w:szCs w:val="28"/>
     </w:rPr>
   </w:style>
-  <w:style w:type="paragraph" w:styleId="Heading5">
+  <w:style w:type="paragraph" w:styleId="Titre5">
     <w:name w:val="heading 5"/>
     <w:basedOn w:val="Normal"/>
     <w:next w:val="Normal"/>
@@ -8979,7 +9335,7 @@
       <w:szCs w:val="26"/>
     </w:rPr>
   </w:style>
-  <w:style w:type="paragraph" w:styleId="Heading6">
+  <w:style w:type="paragraph" w:styleId="Titre6">
     <w:name w:val="heading 6"/>
     <w:basedOn w:val="Normal"/>
     <w:next w:val="Normal"/>
@@ -9001,7 +9357,7 @@
       <w:szCs w:val="22"/>
     </w:rPr>
   </w:style>
-  <w:style w:type="paragraph" w:styleId="Heading7">
+  <w:style w:type="paragraph" w:styleId="Titre7">
     <w:name w:val="heading 7"/>
     <w:basedOn w:val="Normal"/>
     <w:next w:val="Normal"/>
@@ -9019,7 +9375,7 @@
       <w:rFonts w:asciiTheme="majorHAnsi" w:hAnsiTheme="majorHAnsi"/>
     </w:rPr>
   </w:style>
-  <w:style w:type="paragraph" w:styleId="Heading8">
+  <w:style w:type="paragraph" w:styleId="Titre8">
     <w:name w:val="heading 8"/>
     <w:basedOn w:val="Normal"/>
     <w:next w:val="Normal"/>
@@ -9039,7 +9395,7 @@
       <w:iCs/>
     </w:rPr>
   </w:style>
-  <w:style w:type="paragraph" w:styleId="Heading9">
+  <w:style w:type="paragraph" w:styleId="Titre9">
     <w:name w:val="heading 9"/>
     <w:basedOn w:val="Normal"/>
     <w:next w:val="Normal"/>
@@ -9059,13 +9415,13 @@
       <w:szCs w:val="22"/>
     </w:rPr>
   </w:style>
-  <w:style w:type="character" w:default="1" w:styleId="DefaultParagraphFont">
+  <w:style w:type="character" w:default="1" w:styleId="Policepardfaut">
     <w:name w:val="Default Paragraph Font"/>
     <w:uiPriority w:val="1"/>
     <w:semiHidden/>
     <w:unhideWhenUsed/>
   </w:style>
-  <w:style w:type="table" w:default="1" w:styleId="TableNormal">
+  <w:style w:type="table" w:default="1" w:styleId="TableauNormal">
     <w:name w:val="Normal Table"/>
     <w:uiPriority w:val="99"/>
     <w:semiHidden/>
@@ -9080,13 +9436,13 @@
       </w:tblCellMar>
     </w:tblPr>
   </w:style>
-  <w:style w:type="numbering" w:default="1" w:styleId="NoList">
+  <w:style w:type="numbering" w:default="1" w:styleId="Aucuneliste">
     <w:name w:val="No List"/>
     <w:uiPriority w:val="99"/>
     <w:semiHidden/>
     <w:unhideWhenUsed/>
   </w:style>
-  <w:style w:type="paragraph" w:styleId="Header">
+  <w:style w:type="paragraph" w:styleId="En-tte">
     <w:name w:val="header"/>
     <w:basedOn w:val="Normal"/>
     <w:semiHidden/>
@@ -9098,7 +9454,7 @@
       </w:tabs>
     </w:pPr>
   </w:style>
-  <w:style w:type="paragraph" w:styleId="Footer">
+  <w:style w:type="paragraph" w:styleId="Pieddepage">
     <w:name w:val="footer"/>
     <w:basedOn w:val="Normal"/>
     <w:semiHidden/>
@@ -9110,9 +9466,9 @@
       </w:tabs>
     </w:pPr>
   </w:style>
-  <w:style w:type="table" w:styleId="TableGrid">
+  <w:style w:type="table" w:styleId="Grilledutableau">
     <w:name w:val="Table Grid"/>
-    <w:basedOn w:val="TableNormal"/>
+    <w:basedOn w:val="TableauNormal"/>
     <w:semiHidden/>
     <w:rsid w:val="00AE282D"/>
     <w:tblPr>
@@ -9126,9 +9482,9 @@
       </w:tblBorders>
     </w:tblPr>
   </w:style>
-  <w:style w:type="character" w:styleId="PageNumber">
+  <w:style w:type="character" w:styleId="Numrodepage">
     <w:name w:val="page number"/>
-    <w:basedOn w:val="DefaultParagraphFont"/>
+    <w:basedOn w:val="Policepardfaut"/>
     <w:semiHidden/>
     <w:rsid w:val="005E6192"/>
   </w:style>
@@ -9157,10 +9513,10 @@
       <w:spacing w:line="360" w:lineRule="auto"/>
     </w:pPr>
   </w:style>
-  <w:style w:type="paragraph" w:styleId="BodyText">
+  <w:style w:type="paragraph" w:styleId="Corpsdetexte">
     <w:name w:val="Body Text"/>
     <w:basedOn w:val="Normal"/>
-    <w:link w:val="BodyTextChar"/>
+    <w:link w:val="CorpsdetexteCar"/>
     <w:rsid w:val="008E53F9"/>
     <w:pPr>
       <w:tabs>
@@ -9244,7 +9600,7 @@
       <w:sz w:val="28"/>
     </w:rPr>
   </w:style>
-  <w:style w:type="paragraph" w:styleId="TOC1">
+  <w:style w:type="paragraph" w:styleId="TM10">
     <w:name w:val="toc 1"/>
     <w:basedOn w:val="Normal"/>
     <w:next w:val="Normal"/>
@@ -9260,7 +9616,7 @@
       <w:caps/>
     </w:rPr>
   </w:style>
-  <w:style w:type="paragraph" w:styleId="TOC2">
+  <w:style w:type="paragraph" w:styleId="TM2">
     <w:name w:val="toc 2"/>
     <w:basedOn w:val="Normal"/>
     <w:next w:val="Normal"/>
@@ -9274,7 +9630,7 @@
       <w:smallCaps/>
     </w:rPr>
   </w:style>
-  <w:style w:type="paragraph" w:styleId="TOC3">
+  <w:style w:type="paragraph" w:styleId="TM3">
     <w:name w:val="toc 3"/>
     <w:basedOn w:val="Normal"/>
     <w:next w:val="Normal"/>
@@ -9290,7 +9646,7 @@
       <w:iCs/>
     </w:rPr>
   </w:style>
-  <w:style w:type="paragraph" w:styleId="TOC4">
+  <w:style w:type="paragraph" w:styleId="TM4">
     <w:name w:val="toc 4"/>
     <w:basedOn w:val="Normal"/>
     <w:next w:val="Normal"/>
@@ -9307,7 +9663,7 @@
   </w:style>
   <w:style w:type="character" w:customStyle="1" w:styleId="TM1Car">
     <w:name w:val="TM1 Car"/>
-    <w:basedOn w:val="DefaultParagraphFont"/>
+    <w:basedOn w:val="Policepardfaut"/>
     <w:link w:val="TM1"/>
     <w:rsid w:val="007F30AE"/>
     <w:rPr>
@@ -9319,9 +9675,9 @@
       <w:lang w:val="fr-FR" w:eastAsia="fr-FR" w:bidi="ar-SA"/>
     </w:rPr>
   </w:style>
-  <w:style w:type="character" w:styleId="Hyperlink">
+  <w:style w:type="character" w:styleId="Lienhypertexte">
     <w:name w:val="Hyperlink"/>
-    <w:basedOn w:val="DefaultParagraphFont"/>
+    <w:basedOn w:val="Policepardfaut"/>
     <w:uiPriority w:val="99"/>
     <w:rsid w:val="00932149"/>
     <w:rPr>
@@ -9329,10 +9685,10 @@
       <w:u w:val="single"/>
     </w:rPr>
   </w:style>
-  <w:style w:type="paragraph" w:styleId="BalloonText">
+  <w:style w:type="paragraph" w:styleId="Textedebulles">
     <w:name w:val="Balloon Text"/>
     <w:basedOn w:val="Normal"/>
-    <w:link w:val="BalloonTextChar"/>
+    <w:link w:val="TextedebullesCar"/>
     <w:rsid w:val="00B64C66"/>
     <w:rPr>
       <w:rFonts w:ascii="Tahoma" w:hAnsi="Tahoma" w:cs="Tahoma"/>
@@ -9340,10 +9696,10 @@
       <w:szCs w:val="16"/>
     </w:rPr>
   </w:style>
-  <w:style w:type="character" w:customStyle="1" w:styleId="BalloonTextChar">
-    <w:name w:val="Balloon Text Char"/>
-    <w:basedOn w:val="DefaultParagraphFont"/>
-    <w:link w:val="BalloonText"/>
+  <w:style w:type="character" w:customStyle="1" w:styleId="TextedebullesCar">
+    <w:name w:val="Texte de bulles Car"/>
+    <w:basedOn w:val="Policepardfaut"/>
+    <w:link w:val="Textedebulles"/>
     <w:rsid w:val="00B64C66"/>
     <w:rPr>
       <w:rFonts w:ascii="Tahoma" w:hAnsi="Tahoma" w:cs="Tahoma"/>
@@ -9376,16 +9732,16 @@
   </w:style>
   <w:style w:type="character" w:customStyle="1" w:styleId="paragraphe2Car">
     <w:name w:val="paragraphe2 Car"/>
-    <w:basedOn w:val="DefaultParagraphFont"/>
+    <w:basedOn w:val="Policepardfaut"/>
     <w:link w:val="paragraphe2"/>
     <w:rsid w:val="00753A51"/>
     <w:rPr>
       <w:rFonts w:asciiTheme="minorHAnsi" w:hAnsiTheme="minorHAnsi"/>
     </w:rPr>
   </w:style>
-  <w:style w:type="character" w:styleId="Strong">
+  <w:style w:type="character" w:styleId="lev">
     <w:name w:val="Strong"/>
-    <w:basedOn w:val="DefaultParagraphFont"/>
+    <w:basedOn w:val="Policepardfaut"/>
     <w:qFormat/>
     <w:rsid w:val="0037071E"/>
     <w:rPr>
@@ -9393,26 +9749,26 @@
       <w:bCs/>
     </w:rPr>
   </w:style>
-  <w:style w:type="paragraph" w:styleId="BodyTextIndent">
+  <w:style w:type="paragraph" w:styleId="Retraitcorpsdetexte">
     <w:name w:val="Body Text Indent"/>
-    <w:basedOn w:val="BodyText"/>
-    <w:link w:val="BodyTextIndentChar"/>
+    <w:basedOn w:val="Corpsdetexte"/>
+    <w:link w:val="RetraitcorpsdetexteCar"/>
     <w:rsid w:val="00AA4393"/>
     <w:pPr>
       <w:ind w:left="1134"/>
       <w:contextualSpacing/>
     </w:pPr>
   </w:style>
-  <w:style w:type="character" w:customStyle="1" w:styleId="BodyTextIndentChar">
-    <w:name w:val="Body Text Indent Char"/>
-    <w:basedOn w:val="DefaultParagraphFont"/>
-    <w:link w:val="BodyTextIndent"/>
+  <w:style w:type="character" w:customStyle="1" w:styleId="RetraitcorpsdetexteCar">
+    <w:name w:val="Retrait corps de texte Car"/>
+    <w:basedOn w:val="Policepardfaut"/>
+    <w:link w:val="Retraitcorpsdetexte"/>
     <w:rsid w:val="00AA4393"/>
   </w:style>
-  <w:style w:type="paragraph" w:styleId="BodyTextIndent3">
+  <w:style w:type="paragraph" w:styleId="Retraitcorpsdetexte3">
     <w:name w:val="Body Text Indent 3"/>
-    <w:basedOn w:val="BodyText"/>
-    <w:link w:val="BodyTextIndent3Char"/>
+    <w:basedOn w:val="Corpsdetexte"/>
+    <w:link w:val="Retraitcorpsdetexte3Car"/>
     <w:rsid w:val="00AA4393"/>
     <w:pPr>
       <w:ind w:left="1814"/>
@@ -9421,20 +9777,20 @@
       <w:szCs w:val="16"/>
     </w:rPr>
   </w:style>
-  <w:style w:type="character" w:customStyle="1" w:styleId="BodyTextIndent3Char">
-    <w:name w:val="Body Text Indent 3 Char"/>
-    <w:basedOn w:val="DefaultParagraphFont"/>
-    <w:link w:val="BodyTextIndent3"/>
+  <w:style w:type="character" w:customStyle="1" w:styleId="Retraitcorpsdetexte3Car">
+    <w:name w:val="Retrait corps de texte 3 Car"/>
+    <w:basedOn w:val="Policepardfaut"/>
+    <w:link w:val="Retraitcorpsdetexte3"/>
     <w:rsid w:val="00AA4393"/>
     <w:rPr>
       <w:szCs w:val="16"/>
     </w:rPr>
   </w:style>
-  <w:style w:type="paragraph" w:styleId="Title">
+  <w:style w:type="paragraph" w:styleId="Titre">
     <w:name w:val="Title"/>
     <w:basedOn w:val="Normal"/>
     <w:next w:val="Normal"/>
-    <w:link w:val="TitleChar"/>
+    <w:link w:val="TitreCar"/>
     <w:qFormat/>
     <w:rsid w:val="000E7483"/>
     <w:pPr>
@@ -9454,10 +9810,10 @@
       <w:szCs w:val="52"/>
     </w:rPr>
   </w:style>
-  <w:style w:type="character" w:customStyle="1" w:styleId="TitleChar">
-    <w:name w:val="Title Char"/>
-    <w:basedOn w:val="DefaultParagraphFont"/>
-    <w:link w:val="Title"/>
+  <w:style w:type="character" w:customStyle="1" w:styleId="TitreCar">
+    <w:name w:val="Titre Car"/>
+    <w:basedOn w:val="Policepardfaut"/>
+    <w:link w:val="Titre"/>
     <w:rsid w:val="000E7483"/>
     <w:rPr>
       <w:rFonts w:asciiTheme="majorHAnsi" w:eastAsiaTheme="majorEastAsia" w:hAnsiTheme="majorHAnsi" w:cstheme="majorBidi"/>
@@ -9470,7 +9826,7 @@
   </w:style>
   <w:style w:type="paragraph" w:customStyle="1" w:styleId="Informations">
     <w:name w:val="Informations"/>
-    <w:basedOn w:val="BodyTextIndent"/>
+    <w:basedOn w:val="Retraitcorpsdetexte"/>
     <w:qFormat/>
     <w:rsid w:val="00645760"/>
     <w:pPr>
@@ -9481,7 +9837,7 @@
       <w:sz w:val="16"/>
     </w:rPr>
   </w:style>
-  <w:style w:type="paragraph" w:styleId="TOC5">
+  <w:style w:type="paragraph" w:styleId="TM5">
     <w:name w:val="toc 5"/>
     <w:basedOn w:val="Normal"/>
     <w:next w:val="Normal"/>
@@ -9496,7 +9852,7 @@
       <w:szCs w:val="18"/>
     </w:rPr>
   </w:style>
-  <w:style w:type="paragraph" w:styleId="TOC6">
+  <w:style w:type="paragraph" w:styleId="TM6">
     <w:name w:val="toc 6"/>
     <w:basedOn w:val="Normal"/>
     <w:next w:val="Normal"/>
@@ -9511,7 +9867,7 @@
       <w:szCs w:val="18"/>
     </w:rPr>
   </w:style>
-  <w:style w:type="paragraph" w:styleId="TOC7">
+  <w:style w:type="paragraph" w:styleId="TM7">
     <w:name w:val="toc 7"/>
     <w:basedOn w:val="Normal"/>
     <w:next w:val="Normal"/>
@@ -9526,7 +9882,7 @@
       <w:szCs w:val="18"/>
     </w:rPr>
   </w:style>
-  <w:style w:type="paragraph" w:styleId="TOC8">
+  <w:style w:type="paragraph" w:styleId="TM8">
     <w:name w:val="toc 8"/>
     <w:basedOn w:val="Normal"/>
     <w:next w:val="Normal"/>
@@ -9541,7 +9897,7 @@
       <w:szCs w:val="18"/>
     </w:rPr>
   </w:style>
-  <w:style w:type="paragraph" w:styleId="TOC9">
+  <w:style w:type="paragraph" w:styleId="TM9">
     <w:name w:val="toc 9"/>
     <w:basedOn w:val="Normal"/>
     <w:next w:val="Normal"/>
@@ -9556,29 +9912,50 @@
       <w:szCs w:val="18"/>
     </w:rPr>
   </w:style>
-  <w:style w:type="paragraph" w:styleId="NoteHeading">
+  <w:style w:type="paragraph" w:styleId="Titredenote">
     <w:name w:val="Note Heading"/>
     <w:basedOn w:val="Normal"/>
     <w:next w:val="Normal"/>
-    <w:link w:val="NoteHeadingChar"/>
+    <w:link w:val="TitredenoteCar"/>
     <w:rsid w:val="00AA4393"/>
     <w:rPr>
       <w:rFonts w:asciiTheme="majorHAnsi" w:hAnsiTheme="majorHAnsi"/>
     </w:rPr>
   </w:style>
-  <w:style w:type="character" w:customStyle="1" w:styleId="BodyTextChar">
-    <w:name w:val="Body Text Char"/>
-    <w:basedOn w:val="DefaultParagraphFont"/>
-    <w:link w:val="BodyText"/>
+  <w:style w:type="character" w:customStyle="1" w:styleId="CorpsdetexteCar">
+    <w:name w:val="Corps de texte Car"/>
+    <w:basedOn w:val="Policepardfaut"/>
+    <w:link w:val="Corpsdetexte"/>
     <w:rsid w:val="00AA4393"/>
   </w:style>
-  <w:style w:type="character" w:customStyle="1" w:styleId="NoteHeadingChar">
-    <w:name w:val="Note Heading Char"/>
-    <w:basedOn w:val="DefaultParagraphFont"/>
-    <w:link w:val="NoteHeading"/>
+  <w:style w:type="character" w:customStyle="1" w:styleId="TitredenoteCar">
+    <w:name w:val="Titre de note Car"/>
+    <w:basedOn w:val="Policepardfaut"/>
+    <w:link w:val="Titredenote"/>
     <w:rsid w:val="00AA4393"/>
     <w:rPr>
       <w:rFonts w:asciiTheme="majorHAnsi" w:hAnsiTheme="majorHAnsi"/>
+    </w:rPr>
+  </w:style>
+  <w:style w:type="paragraph" w:styleId="Listepuces">
+    <w:name w:val="List Bullet"/>
+    <w:basedOn w:val="Normal"/>
+    <w:uiPriority w:val="99"/>
+    <w:unhideWhenUsed/>
+    <w:rsid w:val="004B78BF"/>
+    <w:pPr>
+      <w:tabs>
+        <w:tab w:val="num" w:pos="360"/>
+      </w:tabs>
+      <w:spacing w:after="200" w:line="276" w:lineRule="auto"/>
+      <w:ind w:left="360" w:hanging="360"/>
+      <w:contextualSpacing/>
+    </w:pPr>
+    <w:rPr>
+      <w:rFonts w:eastAsiaTheme="minorEastAsia" w:cstheme="minorBidi"/>
+      <w:sz w:val="22"/>
+      <w:szCs w:val="22"/>
+      <w:lang w:val="en-US" w:eastAsia="en-US"/>
     </w:rPr>
   </w:style>
 </w:styles>
@@ -9871,15 +10248,6 @@
 </file>
 
 <file path=customXml/item1.xml><?xml version="1.0" encoding="utf-8"?>
-<?mso-contentType ?>
-<FormTemplates xmlns="http://schemas.microsoft.com/sharepoint/v3/contenttype/forms">
-  <Display>DocumentLibraryForm</Display>
-  <Edit>DocumentLibraryForm</Edit>
-  <New>DocumentLibraryForm</New>
-</FormTemplates>
-</file>
-
-<file path=customXml/item2.xml><?xml version="1.0" encoding="utf-8"?>
 <ct:contentTypeSchema xmlns:ct="http://schemas.microsoft.com/office/2006/metadata/contentType" xmlns:ma="http://schemas.microsoft.com/office/2006/metadata/properties/metaAttributes" ct:_="" ma:_="" ma:contentTypeName="Document" ma:contentTypeID="0x0101005A5B8F5EAAC22C48A11F5D9A60E6F21D" ma:contentTypeVersion="16" ma:contentTypeDescription="Crée un document." ma:contentTypeScope="" ma:versionID="f2b963976306cc54294b7f4545a3c6c4">
   <xsd:schema xmlns:xsd="http://www.w3.org/2001/XMLSchema" xmlns:xs="http://www.w3.org/2001/XMLSchema" xmlns:p="http://schemas.microsoft.com/office/2006/metadata/properties" xmlns:ns2="a1b10758-7132-46a4-a2fe-7a2cf46f51f4" xmlns:ns3="f7d9f5a6-831d-4621-8c77-cbcaf993e406" targetNamespace="http://schemas.microsoft.com/office/2006/metadata/properties" ma:root="true" ma:fieldsID="e5e135fa2fc1295e1586ddcd9c1a8904" ns2:_="" ns3:_="">
     <xsd:import namespace="a1b10758-7132-46a4-a2fe-7a2cf46f51f4"/>
@@ -10122,7 +10490,20 @@
 </ct:contentTypeSchema>
 </file>
 
+<file path=customXml/item2.xml><?xml version="1.0" encoding="utf-8"?>
+<?mso-contentType ?>
+<FormTemplates xmlns="http://schemas.microsoft.com/sharepoint/v3/contenttype/forms">
+  <Display>DocumentLibraryForm</Display>
+  <Edit>DocumentLibraryForm</Edit>
+  <New>DocumentLibraryForm</New>
+</FormTemplates>
+</file>
+
 <file path=customXml/item3.xml><?xml version="1.0" encoding="utf-8"?>
+<b:Sources xmlns:b="http://schemas.openxmlformats.org/officeDocument/2006/bibliography" xmlns="http://schemas.openxmlformats.org/officeDocument/2006/bibliography" SelectedStyle="\APA.XSL" StyleName="APA"/>
+</file>
+
+<file path=customXml/item4.xml><?xml version="1.0" encoding="utf-8"?>
 <p:properties xmlns:p="http://schemas.microsoft.com/office/2006/metadata/properties" xmlns:xsi="http://www.w3.org/2001/XMLSchema-instance" xmlns:pc="http://schemas.microsoft.com/office/infopath/2007/PartnerControls">
   <documentManagement>
     <lcf76f155ced4ddcb4097134ff3c332f xmlns="a1b10758-7132-46a4-a2fe-7a2cf46f51f4">
@@ -10133,19 +10514,7 @@
 </p:properties>
 </file>
 
-<file path=customXml/item4.xml><?xml version="1.0" encoding="utf-8"?>
-<b:Sources xmlns:b="http://schemas.openxmlformats.org/officeDocument/2006/bibliography" xmlns="http://schemas.openxmlformats.org/officeDocument/2006/bibliography" SelectedStyle="\APA.XSL" StyleName="APA"/>
-</file>
-
 <file path=customXml/itemProps1.xml><?xml version="1.0" encoding="utf-8"?>
-<ds:datastoreItem xmlns:ds="http://schemas.openxmlformats.org/officeDocument/2006/customXml" ds:itemID="{6C3F7A66-EDE3-46FD-83EB-3C265E5D2669}">
-  <ds:schemaRefs>
-    <ds:schemaRef ds:uri="http://schemas.microsoft.com/sharepoint/v3/contenttype/forms"/>
-  </ds:schemaRefs>
-</ds:datastoreItem>
-</file>
-
-<file path=customXml/itemProps2.xml><?xml version="1.0" encoding="utf-8"?>
 <ds:datastoreItem xmlns:ds="http://schemas.openxmlformats.org/officeDocument/2006/customXml" ds:itemID="{41546E4A-837A-4BEF-A4B8-FFD4EAB4E855}">
   <ds:schemaRefs>
     <ds:schemaRef ds:uri="http://schemas.microsoft.com/office/2006/metadata/contentType"/>
@@ -10164,7 +10533,23 @@
 </ds:datastoreItem>
 </file>
 
+<file path=customXml/itemProps2.xml><?xml version="1.0" encoding="utf-8"?>
+<ds:datastoreItem xmlns:ds="http://schemas.openxmlformats.org/officeDocument/2006/customXml" ds:itemID="{6C3F7A66-EDE3-46FD-83EB-3C265E5D2669}">
+  <ds:schemaRefs>
+    <ds:schemaRef ds:uri="http://schemas.microsoft.com/sharepoint/v3/contenttype/forms"/>
+  </ds:schemaRefs>
+</ds:datastoreItem>
+</file>
+
 <file path=customXml/itemProps3.xml><?xml version="1.0" encoding="utf-8"?>
+<ds:datastoreItem xmlns:ds="http://schemas.openxmlformats.org/officeDocument/2006/customXml" ds:itemID="{C8C35155-3E6A-4058-B6E4-303717845E3B}">
+  <ds:schemaRefs>
+    <ds:schemaRef ds:uri="http://schemas.openxmlformats.org/officeDocument/2006/bibliography"/>
+  </ds:schemaRefs>
+</ds:datastoreItem>
+</file>
+
+<file path=customXml/itemProps4.xml><?xml version="1.0" encoding="utf-8"?>
 <ds:datastoreItem xmlns:ds="http://schemas.openxmlformats.org/officeDocument/2006/customXml" ds:itemID="{2319CDB8-A2CD-412D-8359-13E6B4DF1FF4}">
   <ds:schemaRefs>
     <ds:schemaRef ds:uri="http://schemas.microsoft.com/office/2006/metadata/properties"/>
@@ -10173,12 +10558,4 @@
     <ds:schemaRef ds:uri="f7d9f5a6-831d-4621-8c77-cbcaf993e406"/>
   </ds:schemaRefs>
 </ds:datastoreItem>
-</file>
-
-<file path=customXml/itemProps4.xml><?xml version="1.0" encoding="utf-8"?>
-<ds:datastoreItem xmlns:ds="http://schemas.openxmlformats.org/officeDocument/2006/customXml" ds:itemID="{C8C35155-3E6A-4058-B6E4-303717845E3B}">
-  <ds:schemaRefs>
-    <ds:schemaRef ds:uri="http://schemas.openxmlformats.org/officeDocument/2006/bibliography"/>
-  </ds:schemaRefs>
-</ds:datastoreItem>
 </file>
</xml_diff>

<commit_message>
chore(rapport): finir le rapport
[120]/[Done]
</commit_message>
<xml_diff>
--- a/doc/I320-RapportProjet.docx
+++ b/doc/I320-RapportProjet.docx
@@ -9,6 +9,14 @@
       <w:r>
         <w:t>I320 Projet</w:t>
       </w:r>
+      <w:r>
+        <w:t xml:space="preserve"> </w:t>
+      </w:r>
+      <w:proofErr w:type="spellStart"/>
+      <w:r>
+        <w:t>ShootEmUp</w:t>
+      </w:r>
+      <w:proofErr w:type="spellEnd"/>
     </w:p>
     <w:p>
       <w:pPr>
@@ -23,15 +31,14 @@
       <w:r>
         <w:rPr>
           <w:rFonts w:cs="Arial"/>
-          <w:noProof/>
           <w:sz w:val="22"/>
           <w:szCs w:val="22"/>
         </w:rPr>
         <w:drawing>
-          <wp:inline distT="0" distB="0" distL="0" distR="0" wp14:anchorId="45103C9A" wp14:editId="1AF1BCC9">
-            <wp:extent cx="3134995" cy="2558415"/>
-            <wp:effectExtent l="19050" t="0" r="8255" b="0"/>
-            <wp:docPr id="3" name="Image 3"/>
+          <wp:inline distT="0" distB="0" distL="0" distR="0" wp14:anchorId="3768A90C" wp14:editId="314EACDC">
+            <wp:extent cx="6099455" cy="3189605"/>
+            <wp:effectExtent l="0" t="0" r="0" b="0"/>
+            <wp:docPr id="1793128492" name="Image 1"/>
             <wp:cNvGraphicFramePr>
               <a:graphicFrameLocks xmlns:a="http://schemas.openxmlformats.org/drawingml/2006/main" noChangeAspect="1"/>
             </wp:cNvGraphicFramePr>
@@ -39,33 +46,23 @@
               <a:graphicData uri="http://schemas.openxmlformats.org/drawingml/2006/picture">
                 <pic:pic xmlns:pic="http://schemas.openxmlformats.org/drawingml/2006/picture">
                   <pic:nvPicPr>
-                    <pic:cNvPr id="0" name="Picture 3"/>
-                    <pic:cNvPicPr>
-                      <a:picLocks noChangeAspect="1" noChangeArrowheads="1"/>
-                    </pic:cNvPicPr>
+                    <pic:cNvPr id="1793128492" name=""/>
+                    <pic:cNvPicPr/>
                   </pic:nvPicPr>
                   <pic:blipFill>
-                    <a:blip r:embed="rId11" cstate="print"/>
-                    <a:srcRect/>
+                    <a:blip r:embed="rId11"/>
                     <a:stretch>
                       <a:fillRect/>
                     </a:stretch>
                   </pic:blipFill>
-                  <pic:spPr bwMode="auto">
+                  <pic:spPr>
                     <a:xfrm>
                       <a:off x="0" y="0"/>
-                      <a:ext cx="3134995" cy="2558415"/>
+                      <a:ext cx="6101610" cy="3190732"/>
                     </a:xfrm>
                     <a:prstGeom prst="rect">
                       <a:avLst/>
                     </a:prstGeom>
-                    <a:noFill/>
-                    <a:ln w="9525">
-                      <a:noFill/>
-                      <a:miter lim="800000"/>
-                      <a:headEnd/>
-                      <a:tailEnd/>
-                    </a:ln>
                   </pic:spPr>
                 </pic:pic>
               </a:graphicData>
@@ -79,13 +76,7 @@
         <w:jc w:val="center"/>
       </w:pPr>
       <w:r>
-        <w:t>(</w:t>
-      </w:r>
-      <w:r>
-        <w:t>Une</w:t>
-      </w:r>
-      <w:r>
-        <w:t xml:space="preserve"> image originale représentant le projet)</w:t>
+        <w:t>Image du jeu finale</w:t>
       </w:r>
     </w:p>
     <w:p>
@@ -138,7 +129,10 @@
         <w:jc w:val="center"/>
       </w:pPr>
       <w:r>
-        <w:t>(Nom et adresse du mandant)</w:t>
+        <w:t>x</w:t>
+      </w:r>
+      <w:r>
+        <w:t>avier.carrel@eduvaud.ch</w:t>
       </w:r>
     </w:p>
     <w:p>
@@ -205,7 +199,7 @@
         </w:rPr>
         <w:fldChar w:fldCharType="separate"/>
       </w:r>
-      <w:hyperlink w:anchor="_Toc240025452" w:history="1">
+      <w:hyperlink w:anchor="_Toc244269430" w:history="1">
         <w:r>
           <w:rPr>
             <w:rStyle w:val="Lienhypertexte"/>
@@ -253,7 +247,7 @@
             <w:noProof/>
             <w:webHidden/>
           </w:rPr>
-          <w:instrText xml:space="preserve"> PAGEREF _Toc240025452 \h </w:instrText>
+          <w:instrText xml:space="preserve"> PAGEREF _Toc244269430 \h </w:instrText>
         </w:r>
         <w:r>
           <w:rPr>
@@ -301,7 +295,7 @@
           <w14:ligatures w14:val="standardContextual"/>
         </w:rPr>
       </w:pPr>
-      <w:hyperlink w:anchor="_Toc240025453" w:history="1">
+      <w:hyperlink w:anchor="_Toc244269431" w:history="1">
         <w:r>
           <w:rPr>
             <w:rStyle w:val="Lienhypertexte"/>
@@ -347,7 +341,7 @@
             <w:noProof/>
             <w:webHidden/>
           </w:rPr>
-          <w:instrText xml:space="preserve"> PAGEREF _Toc240025453 \h </w:instrText>
+          <w:instrText xml:space="preserve"> PAGEREF _Toc244269431 \h </w:instrText>
         </w:r>
         <w:r>
           <w:rPr>
@@ -395,7 +389,7 @@
           <w14:ligatures w14:val="standardContextual"/>
         </w:rPr>
       </w:pPr>
-      <w:hyperlink w:anchor="_Toc240025454" w:history="1">
+      <w:hyperlink w:anchor="_Toc244269432" w:history="1">
         <w:r>
           <w:rPr>
             <w:rStyle w:val="Lienhypertexte"/>
@@ -441,7 +435,7 @@
             <w:noProof/>
             <w:webHidden/>
           </w:rPr>
-          <w:instrText xml:space="preserve"> PAGEREF _Toc240025454 \h </w:instrText>
+          <w:instrText xml:space="preserve"> PAGEREF _Toc244269432 \h </w:instrText>
         </w:r>
         <w:r>
           <w:rPr>
@@ -489,7 +483,7 @@
           <w14:ligatures w14:val="standardContextual"/>
         </w:rPr>
       </w:pPr>
-      <w:hyperlink w:anchor="_Toc240025455" w:history="1">
+      <w:hyperlink w:anchor="_Toc244269433" w:history="1">
         <w:r>
           <w:rPr>
             <w:rStyle w:val="Lienhypertexte"/>
@@ -535,7 +529,7 @@
             <w:noProof/>
             <w:webHidden/>
           </w:rPr>
-          <w:instrText xml:space="preserve"> PAGEREF _Toc240025455 \h </w:instrText>
+          <w:instrText xml:space="preserve"> PAGEREF _Toc244269433 \h </w:instrText>
         </w:r>
         <w:r>
           <w:rPr>
@@ -585,7 +579,7 @@
           <w14:ligatures w14:val="standardContextual"/>
         </w:rPr>
       </w:pPr>
-      <w:hyperlink w:anchor="_Toc240025456" w:history="1">
+      <w:hyperlink w:anchor="_Toc244269434" w:history="1">
         <w:r>
           <w:rPr>
             <w:rStyle w:val="Lienhypertexte"/>
@@ -633,7 +627,7 @@
             <w:noProof/>
             <w:webHidden/>
           </w:rPr>
-          <w:instrText xml:space="preserve"> PAGEREF _Toc240025456 \h </w:instrText>
+          <w:instrText xml:space="preserve"> PAGEREF _Toc244269434 \h </w:instrText>
         </w:r>
         <w:r>
           <w:rPr>
@@ -683,7 +677,7 @@
           <w14:ligatures w14:val="standardContextual"/>
         </w:rPr>
       </w:pPr>
-      <w:hyperlink w:anchor="_Toc240025457" w:history="1">
+      <w:hyperlink w:anchor="_Toc244269435" w:history="1">
         <w:r>
           <w:rPr>
             <w:rStyle w:val="Lienhypertexte"/>
@@ -731,7 +725,7 @@
             <w:noProof/>
             <w:webHidden/>
           </w:rPr>
-          <w:instrText xml:space="preserve"> PAGEREF _Toc240025457 \h </w:instrText>
+          <w:instrText xml:space="preserve"> PAGEREF _Toc244269435 \h </w:instrText>
         </w:r>
         <w:r>
           <w:rPr>
@@ -779,7 +773,7 @@
           <w14:ligatures w14:val="standardContextual"/>
         </w:rPr>
       </w:pPr>
-      <w:hyperlink w:anchor="_Toc240025458" w:history="1">
+      <w:hyperlink w:anchor="_Toc244269436" w:history="1">
         <w:r>
           <w:rPr>
             <w:rStyle w:val="Lienhypertexte"/>
@@ -825,7 +819,7 @@
             <w:noProof/>
             <w:webHidden/>
           </w:rPr>
-          <w:instrText xml:space="preserve"> PAGEREF _Toc240025458 \h </w:instrText>
+          <w:instrText xml:space="preserve"> PAGEREF _Toc244269436 \h </w:instrText>
         </w:r>
         <w:r>
           <w:rPr>
@@ -874,7 +868,7 @@
           <w14:ligatures w14:val="standardContextual"/>
         </w:rPr>
       </w:pPr>
-      <w:hyperlink w:anchor="_Toc240025459" w:history="1">
+      <w:hyperlink w:anchor="_Toc244269437" w:history="1">
         <w:r>
           <w:rPr>
             <w:rStyle w:val="Lienhypertexte"/>
@@ -901,7 +895,7 @@
             <w:noProof/>
             <w:webHidden/>
           </w:rPr>
-          <w:instrText xml:space="preserve"> PAGEREF _Toc240025459 \h </w:instrText>
+          <w:instrText xml:space="preserve"> PAGEREF _Toc244269437 \h </w:instrText>
         </w:r>
         <w:r>
           <w:rPr>
@@ -950,7 +944,7 @@
           <w14:ligatures w14:val="standardContextual"/>
         </w:rPr>
       </w:pPr>
-      <w:hyperlink w:anchor="_Toc240025460" w:history="1">
+      <w:hyperlink w:anchor="_Toc244269438" w:history="1">
         <w:r>
           <w:rPr>
             <w:rStyle w:val="Lienhypertexte"/>
@@ -977,7 +971,7 @@
             <w:noProof/>
             <w:webHidden/>
           </w:rPr>
-          <w:instrText xml:space="preserve"> PAGEREF _Toc240025460 \h </w:instrText>
+          <w:instrText xml:space="preserve"> PAGEREF _Toc244269438 \h </w:instrText>
         </w:r>
         <w:r>
           <w:rPr>
@@ -1026,7 +1020,7 @@
           <w14:ligatures w14:val="standardContextual"/>
         </w:rPr>
       </w:pPr>
-      <w:hyperlink w:anchor="_Toc240025461" w:history="1">
+      <w:hyperlink w:anchor="_Toc244269439" w:history="1">
         <w:r>
           <w:rPr>
             <w:rStyle w:val="Lienhypertexte"/>
@@ -1053,7 +1047,7 @@
             <w:noProof/>
             <w:webHidden/>
           </w:rPr>
-          <w:instrText xml:space="preserve"> PAGEREF _Toc240025461 \h </w:instrText>
+          <w:instrText xml:space="preserve"> PAGEREF _Toc244269439 \h </w:instrText>
         </w:r>
         <w:r>
           <w:rPr>
@@ -1102,7 +1096,7 @@
           <w14:ligatures w14:val="standardContextual"/>
         </w:rPr>
       </w:pPr>
-      <w:hyperlink w:anchor="_Toc240025462" w:history="1">
+      <w:hyperlink w:anchor="_Toc244269440" w:history="1">
         <w:r>
           <w:rPr>
             <w:rStyle w:val="Lienhypertexte"/>
@@ -1129,7 +1123,7 @@
             <w:noProof/>
             <w:webHidden/>
           </w:rPr>
-          <w:instrText xml:space="preserve"> PAGEREF _Toc240025462 \h </w:instrText>
+          <w:instrText xml:space="preserve"> PAGEREF _Toc244269440 \h </w:instrText>
         </w:r>
         <w:r>
           <w:rPr>
@@ -1178,7 +1172,7 @@
           <w14:ligatures w14:val="standardContextual"/>
         </w:rPr>
       </w:pPr>
-      <w:hyperlink w:anchor="_Toc240025463" w:history="1">
+      <w:hyperlink w:anchor="_Toc244269441" w:history="1">
         <w:r>
           <w:rPr>
             <w:rStyle w:val="Lienhypertexte"/>
@@ -1205,7 +1199,7 @@
             <w:noProof/>
             <w:webHidden/>
           </w:rPr>
-          <w:instrText xml:space="preserve"> PAGEREF _Toc240025463 \h </w:instrText>
+          <w:instrText xml:space="preserve"> PAGEREF _Toc244269441 \h </w:instrText>
         </w:r>
         <w:r>
           <w:rPr>
@@ -1254,7 +1248,7 @@
           <w14:ligatures w14:val="standardContextual"/>
         </w:rPr>
       </w:pPr>
-      <w:hyperlink w:anchor="_Toc240025464" w:history="1">
+      <w:hyperlink w:anchor="_Toc244269442" w:history="1">
         <w:r>
           <w:rPr>
             <w:rStyle w:val="Lienhypertexte"/>
@@ -1281,7 +1275,7 @@
             <w:noProof/>
             <w:webHidden/>
           </w:rPr>
-          <w:instrText xml:space="preserve"> PAGEREF _Toc240025464 \h </w:instrText>
+          <w:instrText xml:space="preserve"> PAGEREF _Toc244269442 \h </w:instrText>
         </w:r>
         <w:r>
           <w:rPr>
@@ -1331,7 +1325,7 @@
           <w14:ligatures w14:val="standardContextual"/>
         </w:rPr>
       </w:pPr>
-      <w:hyperlink w:anchor="_Toc240025465" w:history="1">
+      <w:hyperlink w:anchor="_Toc244269443" w:history="1">
         <w:r>
           <w:rPr>
             <w:rStyle w:val="Lienhypertexte"/>
@@ -1358,7 +1352,7 @@
             <w:rStyle w:val="Lienhypertexte"/>
             <w:noProof/>
           </w:rPr>
-          <w:t>Réalisation</w:t>
+          <w:t>RAPPORT DE TESTS</w:t>
         </w:r>
         <w:r>
           <w:rPr>
@@ -1379,7 +1373,7 @@
             <w:noProof/>
             <w:webHidden/>
           </w:rPr>
-          <w:instrText xml:space="preserve"> PAGEREF _Toc240025465 \h </w:instrText>
+          <w:instrText xml:space="preserve"> PAGEREF _Toc244269443 \h </w:instrText>
         </w:r>
         <w:r>
           <w:rPr>
@@ -1427,7 +1421,7 @@
           <w14:ligatures w14:val="standardContextual"/>
         </w:rPr>
       </w:pPr>
-      <w:hyperlink w:anchor="_Toc240025466" w:history="1">
+      <w:hyperlink w:anchor="_Toc244269444" w:history="1">
         <w:r>
           <w:rPr>
             <w:rStyle w:val="Lienhypertexte"/>
@@ -1452,7 +1446,7 @@
             <w:rStyle w:val="Lienhypertexte"/>
             <w:noProof/>
           </w:rPr>
-          <w:t>Dossier de Réalisation</w:t>
+          <w:t>Gestion du Joueur</w:t>
         </w:r>
         <w:r>
           <w:rPr>
@@ -1473,7 +1467,7 @@
             <w:noProof/>
             <w:webHidden/>
           </w:rPr>
-          <w:instrText xml:space="preserve"> PAGEREF _Toc240025466 \h </w:instrText>
+          <w:instrText xml:space="preserve"> PAGEREF _Toc244269444 \h </w:instrText>
         </w:r>
         <w:r>
           <w:rPr>
@@ -1521,7 +1515,7 @@
           <w14:ligatures w14:val="standardContextual"/>
         </w:rPr>
       </w:pPr>
-      <w:hyperlink w:anchor="_Toc240025467" w:history="1">
+      <w:hyperlink w:anchor="_Toc244269445" w:history="1">
         <w:r>
           <w:rPr>
             <w:rStyle w:val="Lienhypertexte"/>
@@ -1546,7 +1540,7 @@
             <w:rStyle w:val="Lienhypertexte"/>
             <w:noProof/>
           </w:rPr>
-          <w:t>Modifications</w:t>
+          <w:t>Déplacement des Ennemis</w:t>
         </w:r>
         <w:r>
           <w:rPr>
@@ -1567,7 +1561,7 @@
             <w:noProof/>
             <w:webHidden/>
           </w:rPr>
-          <w:instrText xml:space="preserve"> PAGEREF _Toc240025467 \h </w:instrText>
+          <w:instrText xml:space="preserve"> PAGEREF _Toc244269445 \h </w:instrText>
         </w:r>
         <w:r>
           <w:rPr>
@@ -1587,7 +1581,289 @@
             <w:noProof/>
             <w:webHidden/>
           </w:rPr>
-          <w:t>9</w:t>
+          <w:t>10</w:t>
+        </w:r>
+        <w:r>
+          <w:rPr>
+            <w:noProof/>
+            <w:webHidden/>
+          </w:rPr>
+          <w:fldChar w:fldCharType="end"/>
+        </w:r>
+      </w:hyperlink>
+    </w:p>
+    <w:p>
+      <w:pPr>
+        <w:pStyle w:val="TM2"/>
+        <w:tabs>
+          <w:tab w:val="left" w:pos="800"/>
+          <w:tab w:val="right" w:leader="dot" w:pos="9060"/>
+        </w:tabs>
+        <w:rPr>
+          <w:rFonts w:eastAsiaTheme="minorEastAsia" w:cstheme="minorBidi"/>
+          <w:smallCaps w:val="0"/>
+          <w:noProof/>
+          <w:kern w:val="2"/>
+          <w:sz w:val="24"/>
+          <w:szCs w:val="24"/>
+          <w14:ligatures w14:val="standardContextual"/>
+        </w:rPr>
+      </w:pPr>
+      <w:hyperlink w:anchor="_Toc244269446" w:history="1">
+        <w:r>
+          <w:rPr>
+            <w:rStyle w:val="Lienhypertexte"/>
+            <w:noProof/>
+          </w:rPr>
+          <w:t>4.3</w:t>
+        </w:r>
+        <w:r>
+          <w:rPr>
+            <w:rFonts w:eastAsiaTheme="minorEastAsia" w:cstheme="minorBidi"/>
+            <w:smallCaps w:val="0"/>
+            <w:noProof/>
+            <w:kern w:val="2"/>
+            <w:sz w:val="24"/>
+            <w:szCs w:val="24"/>
+            <w14:ligatures w14:val="standardContextual"/>
+          </w:rPr>
+          <w:tab/>
+        </w:r>
+        <w:r>
+          <w:rPr>
+            <w:rStyle w:val="Lienhypertexte"/>
+            <w:noProof/>
+          </w:rPr>
+          <w:t>Gestion des Tirs et Projectiles</w:t>
+        </w:r>
+        <w:r>
+          <w:rPr>
+            <w:noProof/>
+            <w:webHidden/>
+          </w:rPr>
+          <w:tab/>
+        </w:r>
+        <w:r>
+          <w:rPr>
+            <w:noProof/>
+            <w:webHidden/>
+          </w:rPr>
+          <w:fldChar w:fldCharType="begin"/>
+        </w:r>
+        <w:r>
+          <w:rPr>
+            <w:noProof/>
+            <w:webHidden/>
+          </w:rPr>
+          <w:instrText xml:space="preserve"> PAGEREF _Toc244269446 \h </w:instrText>
+        </w:r>
+        <w:r>
+          <w:rPr>
+            <w:noProof/>
+            <w:webHidden/>
+          </w:rPr>
+        </w:r>
+        <w:r>
+          <w:rPr>
+            <w:noProof/>
+            <w:webHidden/>
+          </w:rPr>
+          <w:fldChar w:fldCharType="separate"/>
+        </w:r>
+        <w:r>
+          <w:rPr>
+            <w:noProof/>
+            <w:webHidden/>
+          </w:rPr>
+          <w:t>10</w:t>
+        </w:r>
+        <w:r>
+          <w:rPr>
+            <w:noProof/>
+            <w:webHidden/>
+          </w:rPr>
+          <w:fldChar w:fldCharType="end"/>
+        </w:r>
+      </w:hyperlink>
+    </w:p>
+    <w:p>
+      <w:pPr>
+        <w:pStyle w:val="TM2"/>
+        <w:tabs>
+          <w:tab w:val="left" w:pos="800"/>
+          <w:tab w:val="right" w:leader="dot" w:pos="9060"/>
+        </w:tabs>
+        <w:rPr>
+          <w:rFonts w:eastAsiaTheme="minorEastAsia" w:cstheme="minorBidi"/>
+          <w:smallCaps w:val="0"/>
+          <w:noProof/>
+          <w:kern w:val="2"/>
+          <w:sz w:val="24"/>
+          <w:szCs w:val="24"/>
+          <w14:ligatures w14:val="standardContextual"/>
+        </w:rPr>
+      </w:pPr>
+      <w:hyperlink w:anchor="_Toc244269447" w:history="1">
+        <w:r>
+          <w:rPr>
+            <w:rStyle w:val="Lienhypertexte"/>
+            <w:noProof/>
+          </w:rPr>
+          <w:t>4.4</w:t>
+        </w:r>
+        <w:r>
+          <w:rPr>
+            <w:rFonts w:eastAsiaTheme="minorEastAsia" w:cstheme="minorBidi"/>
+            <w:smallCaps w:val="0"/>
+            <w:noProof/>
+            <w:kern w:val="2"/>
+            <w:sz w:val="24"/>
+            <w:szCs w:val="24"/>
+            <w14:ligatures w14:val="standardContextual"/>
+          </w:rPr>
+          <w:tab/>
+        </w:r>
+        <w:r>
+          <w:rPr>
+            <w:rStyle w:val="Lienhypertexte"/>
+            <w:noProof/>
+          </w:rPr>
+          <w:t>Détection des Collisions</w:t>
+        </w:r>
+        <w:r>
+          <w:rPr>
+            <w:noProof/>
+            <w:webHidden/>
+          </w:rPr>
+          <w:tab/>
+        </w:r>
+        <w:r>
+          <w:rPr>
+            <w:noProof/>
+            <w:webHidden/>
+          </w:rPr>
+          <w:fldChar w:fldCharType="begin"/>
+        </w:r>
+        <w:r>
+          <w:rPr>
+            <w:noProof/>
+            <w:webHidden/>
+          </w:rPr>
+          <w:instrText xml:space="preserve"> PAGEREF _Toc244269447 \h </w:instrText>
+        </w:r>
+        <w:r>
+          <w:rPr>
+            <w:noProof/>
+            <w:webHidden/>
+          </w:rPr>
+        </w:r>
+        <w:r>
+          <w:rPr>
+            <w:noProof/>
+            <w:webHidden/>
+          </w:rPr>
+          <w:fldChar w:fldCharType="separate"/>
+        </w:r>
+        <w:r>
+          <w:rPr>
+            <w:noProof/>
+            <w:webHidden/>
+          </w:rPr>
+          <w:t>10</w:t>
+        </w:r>
+        <w:r>
+          <w:rPr>
+            <w:noProof/>
+            <w:webHidden/>
+          </w:rPr>
+          <w:fldChar w:fldCharType="end"/>
+        </w:r>
+      </w:hyperlink>
+    </w:p>
+    <w:p>
+      <w:pPr>
+        <w:pStyle w:val="TM2"/>
+        <w:tabs>
+          <w:tab w:val="left" w:pos="800"/>
+          <w:tab w:val="right" w:leader="dot" w:pos="9060"/>
+        </w:tabs>
+        <w:rPr>
+          <w:rFonts w:eastAsiaTheme="minorEastAsia" w:cstheme="minorBidi"/>
+          <w:smallCaps w:val="0"/>
+          <w:noProof/>
+          <w:kern w:val="2"/>
+          <w:sz w:val="24"/>
+          <w:szCs w:val="24"/>
+          <w14:ligatures w14:val="standardContextual"/>
+        </w:rPr>
+      </w:pPr>
+      <w:hyperlink w:anchor="_Toc244269448" w:history="1">
+        <w:r>
+          <w:rPr>
+            <w:rStyle w:val="Lienhypertexte"/>
+            <w:noProof/>
+          </w:rPr>
+          <w:t>4.5</w:t>
+        </w:r>
+        <w:r>
+          <w:rPr>
+            <w:rFonts w:eastAsiaTheme="minorEastAsia" w:cstheme="minorBidi"/>
+            <w:smallCaps w:val="0"/>
+            <w:noProof/>
+            <w:kern w:val="2"/>
+            <w:sz w:val="24"/>
+            <w:szCs w:val="24"/>
+            <w14:ligatures w14:val="standardContextual"/>
+          </w:rPr>
+          <w:tab/>
+        </w:r>
+        <w:r>
+          <w:rPr>
+            <w:rStyle w:val="Lienhypertexte"/>
+            <w:noProof/>
+          </w:rPr>
+          <w:t>Fonctions Utilitaires</w:t>
+        </w:r>
+        <w:r>
+          <w:rPr>
+            <w:noProof/>
+            <w:webHidden/>
+          </w:rPr>
+          <w:tab/>
+        </w:r>
+        <w:r>
+          <w:rPr>
+            <w:noProof/>
+            <w:webHidden/>
+          </w:rPr>
+          <w:fldChar w:fldCharType="begin"/>
+        </w:r>
+        <w:r>
+          <w:rPr>
+            <w:noProof/>
+            <w:webHidden/>
+          </w:rPr>
+          <w:instrText xml:space="preserve"> PAGEREF _Toc244269448 \h </w:instrText>
+        </w:r>
+        <w:r>
+          <w:rPr>
+            <w:noProof/>
+            <w:webHidden/>
+          </w:rPr>
+        </w:r>
+        <w:r>
+          <w:rPr>
+            <w:noProof/>
+            <w:webHidden/>
+          </w:rPr>
+          <w:fldChar w:fldCharType="separate"/>
+        </w:r>
+        <w:r>
+          <w:rPr>
+            <w:noProof/>
+            <w:webHidden/>
+          </w:rPr>
+          <w:t>10</w:t>
         </w:r>
         <w:r>
           <w:rPr>
@@ -1617,7 +1893,7 @@
           <w14:ligatures w14:val="standardContextual"/>
         </w:rPr>
       </w:pPr>
-      <w:hyperlink w:anchor="_Toc240025468" w:history="1">
+      <w:hyperlink w:anchor="_Toc244269449" w:history="1">
         <w:r>
           <w:rPr>
             <w:rStyle w:val="Lienhypertexte"/>
@@ -1644,7 +1920,7 @@
             <w:rStyle w:val="Lienhypertexte"/>
             <w:noProof/>
           </w:rPr>
-          <w:t>Tests</w:t>
+          <w:t>CONCEPTION</w:t>
         </w:r>
         <w:r>
           <w:rPr>
@@ -1665,7 +1941,7 @@
             <w:noProof/>
             <w:webHidden/>
           </w:rPr>
-          <w:instrText xml:space="preserve"> PAGEREF _Toc240025468 \h </w:instrText>
+          <w:instrText xml:space="preserve"> PAGEREF _Toc244269449 \h </w:instrText>
         </w:r>
         <w:r>
           <w:rPr>
@@ -1685,7 +1961,7 @@
             <w:noProof/>
             <w:webHidden/>
           </w:rPr>
-          <w:t>9</w:t>
+          <w:t>11</w:t>
         </w:r>
         <w:r>
           <w:rPr>
@@ -1713,7 +1989,7 @@
           <w14:ligatures w14:val="standardContextual"/>
         </w:rPr>
       </w:pPr>
-      <w:hyperlink w:anchor="_Toc240025469" w:history="1">
+      <w:hyperlink w:anchor="_Toc244269450" w:history="1">
         <w:r>
           <w:rPr>
             <w:rStyle w:val="Lienhypertexte"/>
@@ -1738,7 +2014,7 @@
             <w:rStyle w:val="Lienhypertexte"/>
             <w:noProof/>
           </w:rPr>
-          <w:t>Dossier des tests</w:t>
+          <w:t>Avant le codage</w:t>
         </w:r>
         <w:r>
           <w:rPr>
@@ -1759,7 +2035,7 @@
             <w:noProof/>
             <w:webHidden/>
           </w:rPr>
-          <w:instrText xml:space="preserve"> PAGEREF _Toc240025469 \h </w:instrText>
+          <w:instrText xml:space="preserve"> PAGEREF _Toc244269450 \h </w:instrText>
         </w:r>
         <w:r>
           <w:rPr>
@@ -1779,7 +2055,101 @@
             <w:noProof/>
             <w:webHidden/>
           </w:rPr>
-          <w:t>9</w:t>
+          <w:t>11</w:t>
+        </w:r>
+        <w:r>
+          <w:rPr>
+            <w:noProof/>
+            <w:webHidden/>
+          </w:rPr>
+          <w:fldChar w:fldCharType="end"/>
+        </w:r>
+      </w:hyperlink>
+    </w:p>
+    <w:p>
+      <w:pPr>
+        <w:pStyle w:val="TM2"/>
+        <w:tabs>
+          <w:tab w:val="left" w:pos="800"/>
+          <w:tab w:val="right" w:leader="dot" w:pos="9060"/>
+        </w:tabs>
+        <w:rPr>
+          <w:rFonts w:eastAsiaTheme="minorEastAsia" w:cstheme="minorBidi"/>
+          <w:smallCaps w:val="0"/>
+          <w:noProof/>
+          <w:kern w:val="2"/>
+          <w:sz w:val="24"/>
+          <w:szCs w:val="24"/>
+          <w14:ligatures w14:val="standardContextual"/>
+        </w:rPr>
+      </w:pPr>
+      <w:hyperlink w:anchor="_Toc244269451" w:history="1">
+        <w:r>
+          <w:rPr>
+            <w:rStyle w:val="Lienhypertexte"/>
+            <w:noProof/>
+          </w:rPr>
+          <w:t>5.2</w:t>
+        </w:r>
+        <w:r>
+          <w:rPr>
+            <w:rFonts w:eastAsiaTheme="minorEastAsia" w:cstheme="minorBidi"/>
+            <w:smallCaps w:val="0"/>
+            <w:noProof/>
+            <w:kern w:val="2"/>
+            <w:sz w:val="24"/>
+            <w:szCs w:val="24"/>
+            <w14:ligatures w14:val="standardContextual"/>
+          </w:rPr>
+          <w:tab/>
+        </w:r>
+        <w:r>
+          <w:rPr>
+            <w:rStyle w:val="Lienhypertexte"/>
+            <w:noProof/>
+          </w:rPr>
+          <w:t>Pendant le codage</w:t>
+        </w:r>
+        <w:r>
+          <w:rPr>
+            <w:noProof/>
+            <w:webHidden/>
+          </w:rPr>
+          <w:tab/>
+        </w:r>
+        <w:r>
+          <w:rPr>
+            <w:noProof/>
+            <w:webHidden/>
+          </w:rPr>
+          <w:fldChar w:fldCharType="begin"/>
+        </w:r>
+        <w:r>
+          <w:rPr>
+            <w:noProof/>
+            <w:webHidden/>
+          </w:rPr>
+          <w:instrText xml:space="preserve"> PAGEREF _Toc244269451 \h </w:instrText>
+        </w:r>
+        <w:r>
+          <w:rPr>
+            <w:noProof/>
+            <w:webHidden/>
+          </w:rPr>
+        </w:r>
+        <w:r>
+          <w:rPr>
+            <w:noProof/>
+            <w:webHidden/>
+          </w:rPr>
+          <w:fldChar w:fldCharType="separate"/>
+        </w:r>
+        <w:r>
+          <w:rPr>
+            <w:noProof/>
+            <w:webHidden/>
+          </w:rPr>
+          <w:t>11</w:t>
         </w:r>
         <w:r>
           <w:rPr>
@@ -1809,7 +2179,7 @@
           <w14:ligatures w14:val="standardContextual"/>
         </w:rPr>
       </w:pPr>
-      <w:hyperlink w:anchor="_Toc240025470" w:history="1">
+      <w:hyperlink w:anchor="_Toc244269452" w:history="1">
         <w:r>
           <w:rPr>
             <w:rStyle w:val="Lienhypertexte"/>
@@ -1836,7 +2206,7 @@
             <w:rStyle w:val="Lienhypertexte"/>
             <w:noProof/>
           </w:rPr>
-          <w:t>Conclusion</w:t>
+          <w:t>EXPLICATION DE L'USAGE FAIT DE L'IA DANS CE PROJET</w:t>
         </w:r>
         <w:r>
           <w:rPr>
@@ -1857,7 +2227,7 @@
             <w:noProof/>
             <w:webHidden/>
           </w:rPr>
-          <w:instrText xml:space="preserve"> PAGEREF _Toc240025470 \h </w:instrText>
+          <w:instrText xml:space="preserve"> PAGEREF _Toc244269452 \h </w:instrText>
         </w:r>
         <w:r>
           <w:rPr>
@@ -1877,7 +2247,7 @@
             <w:noProof/>
             <w:webHidden/>
           </w:rPr>
-          <w:t>10</w:t>
+          <w:t>12</w:t>
         </w:r>
         <w:r>
           <w:rPr>
@@ -1905,7 +2275,7 @@
           <w14:ligatures w14:val="standardContextual"/>
         </w:rPr>
       </w:pPr>
-      <w:hyperlink w:anchor="_Toc240025471" w:history="1">
+      <w:hyperlink w:anchor="_Toc244269453" w:history="1">
         <w:r>
           <w:rPr>
             <w:rStyle w:val="Lienhypertexte"/>
@@ -1930,7 +2300,7 @@
             <w:rStyle w:val="Lienhypertexte"/>
             <w:noProof/>
           </w:rPr>
-          <w:t>Bilan des fonctionnalités demandées</w:t>
+          <w:t>Dans le code</w:t>
         </w:r>
         <w:r>
           <w:rPr>
@@ -1951,7 +2321,7 @@
             <w:noProof/>
             <w:webHidden/>
           </w:rPr>
-          <w:instrText xml:space="preserve"> PAGEREF _Toc240025471 \h </w:instrText>
+          <w:instrText xml:space="preserve"> PAGEREF _Toc244269453 \h </w:instrText>
         </w:r>
         <w:r>
           <w:rPr>
@@ -1971,7 +2341,7 @@
             <w:noProof/>
             <w:webHidden/>
           </w:rPr>
-          <w:t>10</w:t>
+          <w:t>12</w:t>
         </w:r>
         <w:r>
           <w:rPr>
@@ -1999,7 +2369,7 @@
           <w14:ligatures w14:val="standardContextual"/>
         </w:rPr>
       </w:pPr>
-      <w:hyperlink w:anchor="_Toc240025472" w:history="1">
+      <w:hyperlink w:anchor="_Toc244269454" w:history="1">
         <w:r>
           <w:rPr>
             <w:rStyle w:val="Lienhypertexte"/>
@@ -2024,7 +2394,7 @@
             <w:rStyle w:val="Lienhypertexte"/>
             <w:noProof/>
           </w:rPr>
-          <w:t>Bilan de la planification</w:t>
+          <w:t>Hors code</w:t>
         </w:r>
         <w:r>
           <w:rPr>
@@ -2045,7 +2415,7 @@
             <w:noProof/>
             <w:webHidden/>
           </w:rPr>
-          <w:instrText xml:space="preserve"> PAGEREF _Toc240025472 \h </w:instrText>
+          <w:instrText xml:space="preserve"> PAGEREF _Toc244269454 \h </w:instrText>
         </w:r>
         <w:r>
           <w:rPr>
@@ -2065,101 +2435,7 @@
             <w:noProof/>
             <w:webHidden/>
           </w:rPr>
-          <w:t>10</w:t>
-        </w:r>
-        <w:r>
-          <w:rPr>
-            <w:noProof/>
-            <w:webHidden/>
-          </w:rPr>
-          <w:fldChar w:fldCharType="end"/>
-        </w:r>
-      </w:hyperlink>
-    </w:p>
-    <w:p>
-      <w:pPr>
-        <w:pStyle w:val="TM2"/>
-        <w:tabs>
-          <w:tab w:val="left" w:pos="800"/>
-          <w:tab w:val="right" w:leader="dot" w:pos="9060"/>
-        </w:tabs>
-        <w:rPr>
-          <w:rFonts w:eastAsiaTheme="minorEastAsia" w:cstheme="minorBidi"/>
-          <w:smallCaps w:val="0"/>
-          <w:noProof/>
-          <w:kern w:val="2"/>
-          <w:sz w:val="24"/>
-          <w:szCs w:val="24"/>
-          <w14:ligatures w14:val="standardContextual"/>
-        </w:rPr>
-      </w:pPr>
-      <w:hyperlink w:anchor="_Toc240025473" w:history="1">
-        <w:r>
-          <w:rPr>
-            <w:rStyle w:val="Lienhypertexte"/>
-            <w:noProof/>
-          </w:rPr>
-          <w:t>6.3</w:t>
-        </w:r>
-        <w:r>
-          <w:rPr>
-            <w:rFonts w:eastAsiaTheme="minorEastAsia" w:cstheme="minorBidi"/>
-            <w:smallCaps w:val="0"/>
-            <w:noProof/>
-            <w:kern w:val="2"/>
-            <w:sz w:val="24"/>
-            <w:szCs w:val="24"/>
-            <w14:ligatures w14:val="standardContextual"/>
-          </w:rPr>
-          <w:tab/>
-        </w:r>
-        <w:r>
-          <w:rPr>
-            <w:rStyle w:val="Lienhypertexte"/>
-            <w:noProof/>
-          </w:rPr>
-          <w:t>Bilan personnel</w:t>
-        </w:r>
-        <w:r>
-          <w:rPr>
-            <w:noProof/>
-            <w:webHidden/>
-          </w:rPr>
-          <w:tab/>
-        </w:r>
-        <w:r>
-          <w:rPr>
-            <w:noProof/>
-            <w:webHidden/>
-          </w:rPr>
-          <w:fldChar w:fldCharType="begin"/>
-        </w:r>
-        <w:r>
-          <w:rPr>
-            <w:noProof/>
-            <w:webHidden/>
-          </w:rPr>
-          <w:instrText xml:space="preserve"> PAGEREF _Toc240025473 \h </w:instrText>
-        </w:r>
-        <w:r>
-          <w:rPr>
-            <w:noProof/>
-            <w:webHidden/>
-          </w:rPr>
-        </w:r>
-        <w:r>
-          <w:rPr>
-            <w:noProof/>
-            <w:webHidden/>
-          </w:rPr>
-          <w:fldChar w:fldCharType="separate"/>
-        </w:r>
-        <w:r>
-          <w:rPr>
-            <w:noProof/>
-            <w:webHidden/>
-          </w:rPr>
-          <w:t>10</w:t>
+          <w:t>12</w:t>
         </w:r>
         <w:r>
           <w:rPr>
@@ -2189,7 +2465,7 @@
           <w14:ligatures w14:val="standardContextual"/>
         </w:rPr>
       </w:pPr>
-      <w:hyperlink w:anchor="_Toc240025474" w:history="1">
+      <w:hyperlink w:anchor="_Toc244269455" w:history="1">
         <w:r>
           <w:rPr>
             <w:rStyle w:val="Lienhypertexte"/>
@@ -2216,7 +2492,7 @@
             <w:rStyle w:val="Lienhypertexte"/>
             <w:noProof/>
           </w:rPr>
-          <w:t>Divers</w:t>
+          <w:t>BILAN DU DÉROULEMENT DU PROJET</w:t>
         </w:r>
         <w:r>
           <w:rPr>
@@ -2237,7 +2513,7 @@
             <w:noProof/>
             <w:webHidden/>
           </w:rPr>
-          <w:instrText xml:space="preserve"> PAGEREF _Toc240025474 \h </w:instrText>
+          <w:instrText xml:space="preserve"> PAGEREF _Toc244269455 \h </w:instrText>
         </w:r>
         <w:r>
           <w:rPr>
@@ -2257,289 +2533,7 @@
             <w:noProof/>
             <w:webHidden/>
           </w:rPr>
-          <w:t>10</w:t>
-        </w:r>
-        <w:r>
-          <w:rPr>
-            <w:noProof/>
-            <w:webHidden/>
-          </w:rPr>
-          <w:fldChar w:fldCharType="end"/>
-        </w:r>
-      </w:hyperlink>
-    </w:p>
-    <w:p>
-      <w:pPr>
-        <w:pStyle w:val="TM2"/>
-        <w:tabs>
-          <w:tab w:val="left" w:pos="800"/>
-          <w:tab w:val="right" w:leader="dot" w:pos="9060"/>
-        </w:tabs>
-        <w:rPr>
-          <w:rFonts w:eastAsiaTheme="minorEastAsia" w:cstheme="minorBidi"/>
-          <w:smallCaps w:val="0"/>
-          <w:noProof/>
-          <w:kern w:val="2"/>
-          <w:sz w:val="24"/>
-          <w:szCs w:val="24"/>
-          <w14:ligatures w14:val="standardContextual"/>
-        </w:rPr>
-      </w:pPr>
-      <w:hyperlink w:anchor="_Toc240025475" w:history="1">
-        <w:r>
-          <w:rPr>
-            <w:rStyle w:val="Lienhypertexte"/>
-            <w:noProof/>
-          </w:rPr>
-          <w:t>7.1</w:t>
-        </w:r>
-        <w:r>
-          <w:rPr>
-            <w:rFonts w:eastAsiaTheme="minorEastAsia" w:cstheme="minorBidi"/>
-            <w:smallCaps w:val="0"/>
-            <w:noProof/>
-            <w:kern w:val="2"/>
-            <w:sz w:val="24"/>
-            <w:szCs w:val="24"/>
-            <w14:ligatures w14:val="standardContextual"/>
-          </w:rPr>
-          <w:tab/>
-        </w:r>
-        <w:r>
-          <w:rPr>
-            <w:rStyle w:val="Lienhypertexte"/>
-            <w:noProof/>
-          </w:rPr>
-          <w:t>Journal de travail</w:t>
-        </w:r>
-        <w:r>
-          <w:rPr>
-            <w:noProof/>
-            <w:webHidden/>
-          </w:rPr>
-          <w:tab/>
-        </w:r>
-        <w:r>
-          <w:rPr>
-            <w:noProof/>
-            <w:webHidden/>
-          </w:rPr>
-          <w:fldChar w:fldCharType="begin"/>
-        </w:r>
-        <w:r>
-          <w:rPr>
-            <w:noProof/>
-            <w:webHidden/>
-          </w:rPr>
-          <w:instrText xml:space="preserve"> PAGEREF _Toc240025475 \h </w:instrText>
-        </w:r>
-        <w:r>
-          <w:rPr>
-            <w:noProof/>
-            <w:webHidden/>
-          </w:rPr>
-        </w:r>
-        <w:r>
-          <w:rPr>
-            <w:noProof/>
-            <w:webHidden/>
-          </w:rPr>
-          <w:fldChar w:fldCharType="separate"/>
-        </w:r>
-        <w:r>
-          <w:rPr>
-            <w:noProof/>
-            <w:webHidden/>
-          </w:rPr>
-          <w:t>10</w:t>
-        </w:r>
-        <w:r>
-          <w:rPr>
-            <w:noProof/>
-            <w:webHidden/>
-          </w:rPr>
-          <w:fldChar w:fldCharType="end"/>
-        </w:r>
-      </w:hyperlink>
-    </w:p>
-    <w:p>
-      <w:pPr>
-        <w:pStyle w:val="TM2"/>
-        <w:tabs>
-          <w:tab w:val="left" w:pos="800"/>
-          <w:tab w:val="right" w:leader="dot" w:pos="9060"/>
-        </w:tabs>
-        <w:rPr>
-          <w:rFonts w:eastAsiaTheme="minorEastAsia" w:cstheme="minorBidi"/>
-          <w:smallCaps w:val="0"/>
-          <w:noProof/>
-          <w:kern w:val="2"/>
-          <w:sz w:val="24"/>
-          <w:szCs w:val="24"/>
-          <w14:ligatures w14:val="standardContextual"/>
-        </w:rPr>
-      </w:pPr>
-      <w:hyperlink w:anchor="_Toc240025476" w:history="1">
-        <w:r>
-          <w:rPr>
-            <w:rStyle w:val="Lienhypertexte"/>
-            <w:noProof/>
-          </w:rPr>
-          <w:t>7.2</w:t>
-        </w:r>
-        <w:r>
-          <w:rPr>
-            <w:rFonts w:eastAsiaTheme="minorEastAsia" w:cstheme="minorBidi"/>
-            <w:smallCaps w:val="0"/>
-            <w:noProof/>
-            <w:kern w:val="2"/>
-            <w:sz w:val="24"/>
-            <w:szCs w:val="24"/>
-            <w14:ligatures w14:val="standardContextual"/>
-          </w:rPr>
-          <w:tab/>
-        </w:r>
-        <w:r>
-          <w:rPr>
-            <w:rStyle w:val="Lienhypertexte"/>
-            <w:noProof/>
-          </w:rPr>
-          <w:t>Bibliographie</w:t>
-        </w:r>
-        <w:r>
-          <w:rPr>
-            <w:noProof/>
-            <w:webHidden/>
-          </w:rPr>
-          <w:tab/>
-        </w:r>
-        <w:r>
-          <w:rPr>
-            <w:noProof/>
-            <w:webHidden/>
-          </w:rPr>
-          <w:fldChar w:fldCharType="begin"/>
-        </w:r>
-        <w:r>
-          <w:rPr>
-            <w:noProof/>
-            <w:webHidden/>
-          </w:rPr>
-          <w:instrText xml:space="preserve"> PAGEREF _Toc240025476 \h </w:instrText>
-        </w:r>
-        <w:r>
-          <w:rPr>
-            <w:noProof/>
-            <w:webHidden/>
-          </w:rPr>
-        </w:r>
-        <w:r>
-          <w:rPr>
-            <w:noProof/>
-            <w:webHidden/>
-          </w:rPr>
-          <w:fldChar w:fldCharType="separate"/>
-        </w:r>
-        <w:r>
-          <w:rPr>
-            <w:noProof/>
-            <w:webHidden/>
-          </w:rPr>
-          <w:t>10</w:t>
-        </w:r>
-        <w:r>
-          <w:rPr>
-            <w:noProof/>
-            <w:webHidden/>
-          </w:rPr>
-          <w:fldChar w:fldCharType="end"/>
-        </w:r>
-      </w:hyperlink>
-    </w:p>
-    <w:p>
-      <w:pPr>
-        <w:pStyle w:val="TM2"/>
-        <w:tabs>
-          <w:tab w:val="left" w:pos="800"/>
-          <w:tab w:val="right" w:leader="dot" w:pos="9060"/>
-        </w:tabs>
-        <w:rPr>
-          <w:rFonts w:eastAsiaTheme="minorEastAsia" w:cstheme="minorBidi"/>
-          <w:smallCaps w:val="0"/>
-          <w:noProof/>
-          <w:kern w:val="2"/>
-          <w:sz w:val="24"/>
-          <w:szCs w:val="24"/>
-          <w14:ligatures w14:val="standardContextual"/>
-        </w:rPr>
-      </w:pPr>
-      <w:hyperlink w:anchor="_Toc240025477" w:history="1">
-        <w:r>
-          <w:rPr>
-            <w:rStyle w:val="Lienhypertexte"/>
-            <w:noProof/>
-          </w:rPr>
-          <w:t>7.3</w:t>
-        </w:r>
-        <w:r>
-          <w:rPr>
-            <w:rFonts w:eastAsiaTheme="minorEastAsia" w:cstheme="minorBidi"/>
-            <w:smallCaps w:val="0"/>
-            <w:noProof/>
-            <w:kern w:val="2"/>
-            <w:sz w:val="24"/>
-            <w:szCs w:val="24"/>
-            <w14:ligatures w14:val="standardContextual"/>
-          </w:rPr>
-          <w:tab/>
-        </w:r>
-        <w:r>
-          <w:rPr>
-            <w:rStyle w:val="Lienhypertexte"/>
-            <w:noProof/>
-          </w:rPr>
-          <w:t>Webographie</w:t>
-        </w:r>
-        <w:r>
-          <w:rPr>
-            <w:noProof/>
-            <w:webHidden/>
-          </w:rPr>
-          <w:tab/>
-        </w:r>
-        <w:r>
-          <w:rPr>
-            <w:noProof/>
-            <w:webHidden/>
-          </w:rPr>
-          <w:fldChar w:fldCharType="begin"/>
-        </w:r>
-        <w:r>
-          <w:rPr>
-            <w:noProof/>
-            <w:webHidden/>
-          </w:rPr>
-          <w:instrText xml:space="preserve"> PAGEREF _Toc240025477 \h </w:instrText>
-        </w:r>
-        <w:r>
-          <w:rPr>
-            <w:noProof/>
-            <w:webHidden/>
-          </w:rPr>
-        </w:r>
-        <w:r>
-          <w:rPr>
-            <w:noProof/>
-            <w:webHidden/>
-          </w:rPr>
-          <w:fldChar w:fldCharType="separate"/>
-        </w:r>
-        <w:r>
-          <w:rPr>
-            <w:noProof/>
-            <w:webHidden/>
-          </w:rPr>
-          <w:t>10</w:t>
+          <w:t>12</w:t>
         </w:r>
         <w:r>
           <w:rPr>
@@ -2569,7 +2563,7 @@
           <w14:ligatures w14:val="standardContextual"/>
         </w:rPr>
       </w:pPr>
-      <w:hyperlink w:anchor="_Toc240025478" w:history="1">
+      <w:hyperlink w:anchor="_Toc244269456" w:history="1">
         <w:r>
           <w:rPr>
             <w:rStyle w:val="Lienhypertexte"/>
@@ -2596,7 +2590,7 @@
             <w:rStyle w:val="Lienhypertexte"/>
             <w:noProof/>
           </w:rPr>
-          <w:t>Annexes</w:t>
+          <w:t>BILAN PRODUIT</w:t>
         </w:r>
         <w:r>
           <w:rPr>
@@ -2617,7 +2611,7 @@
             <w:noProof/>
             <w:webHidden/>
           </w:rPr>
-          <w:instrText xml:space="preserve"> PAGEREF _Toc240025478 \h </w:instrText>
+          <w:instrText xml:space="preserve"> PAGEREF _Toc244269456 \h </w:instrText>
         </w:r>
         <w:r>
           <w:rPr>
@@ -2637,7 +2631,105 @@
             <w:noProof/>
             <w:webHidden/>
           </w:rPr>
-          <w:t>10</w:t>
+          <w:t>12</w:t>
+        </w:r>
+        <w:r>
+          <w:rPr>
+            <w:noProof/>
+            <w:webHidden/>
+          </w:rPr>
+          <w:fldChar w:fldCharType="end"/>
+        </w:r>
+      </w:hyperlink>
+    </w:p>
+    <w:p>
+      <w:pPr>
+        <w:pStyle w:val="TM10"/>
+        <w:tabs>
+          <w:tab w:val="left" w:pos="400"/>
+          <w:tab w:val="right" w:leader="dot" w:pos="9060"/>
+        </w:tabs>
+        <w:rPr>
+          <w:rFonts w:eastAsiaTheme="minorEastAsia" w:cstheme="minorBidi"/>
+          <w:b w:val="0"/>
+          <w:bCs w:val="0"/>
+          <w:caps w:val="0"/>
+          <w:noProof/>
+          <w:kern w:val="2"/>
+          <w:sz w:val="24"/>
+          <w:szCs w:val="24"/>
+          <w14:ligatures w14:val="standardContextual"/>
+        </w:rPr>
+      </w:pPr>
+      <w:hyperlink w:anchor="_Toc244269457" w:history="1">
+        <w:r>
+          <w:rPr>
+            <w:rStyle w:val="Lienhypertexte"/>
+            <w:noProof/>
+          </w:rPr>
+          <w:t>9</w:t>
+        </w:r>
+        <w:r>
+          <w:rPr>
+            <w:rFonts w:eastAsiaTheme="minorEastAsia" w:cstheme="minorBidi"/>
+            <w:b w:val="0"/>
+            <w:bCs w:val="0"/>
+            <w:caps w:val="0"/>
+            <w:noProof/>
+            <w:kern w:val="2"/>
+            <w:sz w:val="24"/>
+            <w:szCs w:val="24"/>
+            <w14:ligatures w14:val="standardContextual"/>
+          </w:rPr>
+          <w:tab/>
+        </w:r>
+        <w:r>
+          <w:rPr>
+            <w:rStyle w:val="Lienhypertexte"/>
+            <w:noProof/>
+          </w:rPr>
+          <w:t>CONCLUSION</w:t>
+        </w:r>
+        <w:r>
+          <w:rPr>
+            <w:noProof/>
+            <w:webHidden/>
+          </w:rPr>
+          <w:tab/>
+        </w:r>
+        <w:r>
+          <w:rPr>
+            <w:noProof/>
+            <w:webHidden/>
+          </w:rPr>
+          <w:fldChar w:fldCharType="begin"/>
+        </w:r>
+        <w:r>
+          <w:rPr>
+            <w:noProof/>
+            <w:webHidden/>
+          </w:rPr>
+          <w:instrText xml:space="preserve"> PAGEREF _Toc244269457 \h </w:instrText>
+        </w:r>
+        <w:r>
+          <w:rPr>
+            <w:noProof/>
+            <w:webHidden/>
+          </w:rPr>
+        </w:r>
+        <w:r>
+          <w:rPr>
+            <w:noProof/>
+            <w:webHidden/>
+          </w:rPr>
+          <w:fldChar w:fldCharType="separate"/>
+        </w:r>
+        <w:r>
+          <w:rPr>
+            <w:noProof/>
+            <w:webHidden/>
+          </w:rPr>
+          <w:t>12</w:t>
         </w:r>
         <w:r>
           <w:rPr>
@@ -2668,7 +2760,7 @@
       <w:pPr>
         <w:pStyle w:val="Titre1"/>
       </w:pPr>
-      <w:bookmarkStart w:id="0" w:name="_Toc240025452"/>
+      <w:bookmarkStart w:id="0" w:name="_Toc244269430"/>
       <w:r>
         <w:lastRenderedPageBreak/>
         <w:t>Introduction</w:t>
@@ -2684,9 +2776,9 @@
       <w:pPr>
         <w:pStyle w:val="Titre2"/>
       </w:pPr>
-      <w:bookmarkStart w:id="1" w:name="_Toc240025453"/>
-      <w:bookmarkStart w:id="2" w:name="_Toc532179969"/>
-      <w:bookmarkStart w:id="3" w:name="_Toc165969639"/>
+      <w:bookmarkStart w:id="1" w:name="_Toc532179969"/>
+      <w:bookmarkStart w:id="2" w:name="_Toc165969639"/>
+      <w:bookmarkStart w:id="3" w:name="_Toc244269431"/>
       <w:r>
         <w:t>T</w:t>
       </w:r>
@@ -2696,139 +2788,139 @@
       <w:r>
         <w:t>e</w:t>
       </w:r>
+      <w:bookmarkEnd w:id="3"/>
+    </w:p>
+    <w:p>
+      <w:pPr>
+        <w:pStyle w:val="Retraitcorpsdetexte"/>
+      </w:pPr>
+    </w:p>
+    <w:p>
+      <w:pPr>
+        <w:ind w:left="1134"/>
+      </w:pPr>
+      <w:proofErr w:type="spellStart"/>
+      <w:r>
+        <w:t>Shoot’em</w:t>
+      </w:r>
+      <w:proofErr w:type="spellEnd"/>
+      <w:r>
+        <w:t xml:space="preserve"> up</w:t>
+      </w:r>
+    </w:p>
+    <w:p>
+      <w:pPr>
+        <w:pStyle w:val="Retraitcorpsdetexte"/>
+      </w:pPr>
+    </w:p>
+    <w:p>
+      <w:pPr>
+        <w:pStyle w:val="Titre2"/>
+      </w:pPr>
+      <w:bookmarkStart w:id="4" w:name="_Toc244269432"/>
+      <w:r>
+        <w:t>Objectifs produit</w:t>
+      </w:r>
+      <w:bookmarkEnd w:id="4"/>
+    </w:p>
+    <w:p>
+      <w:pPr>
+        <w:pStyle w:val="Retraitcorpsdetexte"/>
+      </w:pPr>
+    </w:p>
+    <w:p>
+      <w:pPr>
+        <w:ind w:left="1134"/>
+      </w:pPr>
+      <w:r>
+        <w:t xml:space="preserve">Durant ce projet je devrai </w:t>
+      </w:r>
+      <w:r>
+        <w:t>créer</w:t>
+      </w:r>
+      <w:r>
+        <w:t xml:space="preserve"> un jeu dans le genre shoot ‘</w:t>
+      </w:r>
+      <w:proofErr w:type="spellStart"/>
+      <w:r>
+        <w:t>em</w:t>
+      </w:r>
+      <w:proofErr w:type="spellEnd"/>
+      <w:r>
+        <w:t xml:space="preserve"> up. J’ai </w:t>
+      </w:r>
+      <w:r>
+        <w:t>choisi</w:t>
+      </w:r>
+      <w:r>
+        <w:t xml:space="preserve"> le thème de l’anime </w:t>
+      </w:r>
+      <w:proofErr w:type="spellStart"/>
+      <w:r>
+        <w:t>tensura</w:t>
+      </w:r>
+      <w:proofErr w:type="spellEnd"/>
+      <w:r>
+        <w:t xml:space="preserve">. Le jeu se déroulera avec le joueur en tant que </w:t>
+      </w:r>
+      <w:proofErr w:type="spellStart"/>
+      <w:r>
+        <w:t>slime</w:t>
+      </w:r>
+      <w:proofErr w:type="spellEnd"/>
+      <w:r>
+        <w:t xml:space="preserve"> tirant des</w:t>
+      </w:r>
+      <w:r>
+        <w:t xml:space="preserve"> projectiles sur des loups pour les tués. Il pourra se protéger à l’aide de barricade présente sur le terrain. Il mourra après un certain nombre de fois qu’il aura été touché par les loups. Le joueur gagnera après avoir battu 3 vagues de loup avec une puissance exponentiel.</w:t>
+      </w:r>
+    </w:p>
+    <w:p>
+      <w:pPr>
+        <w:pStyle w:val="Retraitcorpsdetexte"/>
+      </w:pPr>
+    </w:p>
+    <w:p>
+      <w:pPr>
+        <w:pStyle w:val="Titre2"/>
+      </w:pPr>
+      <w:bookmarkStart w:id="5" w:name="_Toc244269433"/>
+      <w:r>
+        <w:t>Objectifs pédagogiques</w:t>
+      </w:r>
+      <w:bookmarkEnd w:id="5"/>
+    </w:p>
+    <w:p>
+      <w:pPr>
+        <w:pStyle w:val="Retraitcorpsdetexte"/>
+      </w:pPr>
+    </w:p>
+    <w:p>
+      <w:pPr>
+        <w:ind w:left="1134"/>
+      </w:pPr>
+      <w:r>
+        <w:t>Le projet a pour but de nous mettre en situation réel d’une entreprise et permettant également de mettre en pratique les connaissances que nous avons acquis durant le module I320 sur la programmation orientée objet.</w:t>
+      </w:r>
+      <w:r>
+        <w:t xml:space="preserve"> Il nous servira également à apprendre à utiliser GitHub dans le cadre d’un projet.</w:t>
+      </w:r>
+    </w:p>
+    <w:p>
+      <w:pPr>
+        <w:pStyle w:val="Retraitcorpsdetexte"/>
+      </w:pPr>
+    </w:p>
+    <w:p>
+      <w:pPr>
+        <w:pStyle w:val="Titre1"/>
+      </w:pPr>
+      <w:bookmarkStart w:id="6" w:name="_Toc244269434"/>
+      <w:r>
+        <w:t>Planification</w:t>
+      </w:r>
       <w:bookmarkEnd w:id="1"/>
-    </w:p>
-    <w:p>
-      <w:pPr>
-        <w:pStyle w:val="Retraitcorpsdetexte"/>
-      </w:pPr>
-    </w:p>
-    <w:p>
-      <w:pPr>
-        <w:ind w:left="1134"/>
-      </w:pPr>
-      <w:proofErr w:type="spellStart"/>
-      <w:r>
-        <w:t>Shoot’em</w:t>
-      </w:r>
-      <w:proofErr w:type="spellEnd"/>
-      <w:r>
-        <w:t xml:space="preserve"> up</w:t>
-      </w:r>
-    </w:p>
-    <w:p>
-      <w:pPr>
-        <w:pStyle w:val="Retraitcorpsdetexte"/>
-      </w:pPr>
-    </w:p>
-    <w:p>
-      <w:pPr>
-        <w:pStyle w:val="Titre2"/>
-      </w:pPr>
-      <w:bookmarkStart w:id="4" w:name="_Toc240025454"/>
-      <w:r>
-        <w:t>Objectifs produit</w:t>
-      </w:r>
-      <w:bookmarkEnd w:id="4"/>
-    </w:p>
-    <w:p>
-      <w:pPr>
-        <w:pStyle w:val="Retraitcorpsdetexte"/>
-      </w:pPr>
-    </w:p>
-    <w:p>
-      <w:pPr>
-        <w:ind w:left="1134"/>
-      </w:pPr>
-      <w:r>
-        <w:t xml:space="preserve">Durant ce projet je devrai </w:t>
-      </w:r>
-      <w:r>
-        <w:t>créer</w:t>
-      </w:r>
-      <w:r>
-        <w:t xml:space="preserve"> un jeu dans le genre shoot ‘</w:t>
-      </w:r>
-      <w:proofErr w:type="spellStart"/>
-      <w:r>
-        <w:t>em</w:t>
-      </w:r>
-      <w:proofErr w:type="spellEnd"/>
-      <w:r>
-        <w:t xml:space="preserve"> up. J’ai </w:t>
-      </w:r>
-      <w:r>
-        <w:t>choisi</w:t>
-      </w:r>
-      <w:r>
-        <w:t xml:space="preserve"> le thème de l’anime </w:t>
-      </w:r>
-      <w:proofErr w:type="spellStart"/>
-      <w:r>
-        <w:t>tensura</w:t>
-      </w:r>
-      <w:proofErr w:type="spellEnd"/>
-      <w:r>
-        <w:t xml:space="preserve">. Le jeu se déroulera avec le joueur en tant que </w:t>
-      </w:r>
-      <w:proofErr w:type="spellStart"/>
-      <w:r>
-        <w:t>slime</w:t>
-      </w:r>
-      <w:proofErr w:type="spellEnd"/>
-      <w:r>
-        <w:t xml:space="preserve"> tirant des</w:t>
-      </w:r>
-      <w:r>
-        <w:t xml:space="preserve"> projectiles sur des loups pour les tués. Il pourra se protéger à l’aide de barricade présente sur le terrain. Il mourra après un certain nombre de fois qu’il aura été touché par les loups. Le joueur gagnera après avoir battu 3 vagues de loup avec une puissance exponentiel.</w:t>
-      </w:r>
-    </w:p>
-    <w:p>
-      <w:pPr>
-        <w:pStyle w:val="Retraitcorpsdetexte"/>
-      </w:pPr>
-    </w:p>
-    <w:p>
-      <w:pPr>
-        <w:pStyle w:val="Titre2"/>
-      </w:pPr>
-      <w:bookmarkStart w:id="5" w:name="_Toc240025455"/>
-      <w:r>
-        <w:t>Objectifs pédagogiques</w:t>
-      </w:r>
-      <w:bookmarkEnd w:id="5"/>
-    </w:p>
-    <w:p>
-      <w:pPr>
-        <w:pStyle w:val="Retraitcorpsdetexte"/>
-      </w:pPr>
-    </w:p>
-    <w:p>
-      <w:pPr>
-        <w:ind w:left="1134"/>
-      </w:pPr>
-      <w:r>
-        <w:t>Le projet a pour but de nous mettre en situation réel d’une entreprise et permettant également de mettre en pratique les connaissances que nous avons acquis durant le module I320 sur la programmation orientée objet.</w:t>
-      </w:r>
-      <w:r>
-        <w:t xml:space="preserve"> Il nous servira également à apprendre à utiliser GitHub dans le cadre d’un projet.</w:t>
-      </w:r>
-    </w:p>
-    <w:p>
-      <w:pPr>
-        <w:pStyle w:val="Retraitcorpsdetexte"/>
-      </w:pPr>
-    </w:p>
-    <w:p>
-      <w:pPr>
-        <w:pStyle w:val="Titre1"/>
-      </w:pPr>
-      <w:bookmarkStart w:id="6" w:name="_Toc240025456"/>
-      <w:r>
-        <w:t>Planification</w:t>
-      </w:r>
       <w:bookmarkEnd w:id="2"/>
-      <w:bookmarkEnd w:id="3"/>
       <w:r>
         <w:t xml:space="preserve"> Initiale</w:t>
       </w:r>
@@ -3048,7 +3140,7 @@
       </w:pPr>
       <w:bookmarkStart w:id="7" w:name="_Toc532179957"/>
       <w:bookmarkStart w:id="8" w:name="_Toc165969641"/>
-      <w:bookmarkStart w:id="9" w:name="_Toc240025457"/>
+      <w:bookmarkStart w:id="9" w:name="_Toc244269435"/>
       <w:r>
         <w:t>Analyse</w:t>
       </w:r>
@@ -3060,7 +3152,7 @@
       <w:pPr>
         <w:pStyle w:val="Titre2"/>
       </w:pPr>
-      <w:bookmarkStart w:id="10" w:name="_Toc240025458"/>
+      <w:bookmarkStart w:id="10" w:name="_Toc244269436"/>
       <w:r>
         <w:t>User story</w:t>
       </w:r>
@@ -3078,7 +3170,7 @@
         </w:numPr>
         <w:ind w:left="567"/>
       </w:pPr>
-      <w:bookmarkStart w:id="12" w:name="_Toc240025459"/>
+      <w:bookmarkStart w:id="12" w:name="_Toc244269437"/>
       <w:r>
         <w:t xml:space="preserve">#1 — US </w:t>
       </w:r>
@@ -3255,7 +3347,7 @@
         </w:numPr>
         <w:ind w:left="567"/>
       </w:pPr>
-      <w:bookmarkStart w:id="13" w:name="_Toc240025460"/>
+      <w:bookmarkStart w:id="13" w:name="_Toc244269438"/>
       <w:r>
         <w:t xml:space="preserve">#2 — US </w:t>
       </w:r>
@@ -3400,7 +3492,7 @@
         </w:numPr>
         <w:ind w:left="567"/>
       </w:pPr>
-      <w:bookmarkStart w:id="14" w:name="_Toc240025461"/>
+      <w:bookmarkStart w:id="14" w:name="_Toc244269439"/>
       <w:r>
         <w:t xml:space="preserve">#3 — US </w:t>
       </w:r>
@@ -3541,7 +3633,7 @@
         </w:numPr>
         <w:ind w:left="567"/>
       </w:pPr>
-      <w:bookmarkStart w:id="15" w:name="_Toc240025462"/>
+      <w:bookmarkStart w:id="15" w:name="_Toc244269440"/>
       <w:r>
         <w:t xml:space="preserve">#4 — US </w:t>
       </w:r>
@@ -3718,7 +3810,7 @@
         </w:numPr>
         <w:ind w:left="567"/>
       </w:pPr>
-      <w:bookmarkStart w:id="16" w:name="_Toc240025463"/>
+      <w:bookmarkStart w:id="16" w:name="_Toc244269441"/>
       <w:r>
         <w:lastRenderedPageBreak/>
         <w:t xml:space="preserve">#5 — US </w:t>
@@ -3849,7 +3941,7 @@
         </w:numPr>
         <w:ind w:left="567" w:hanging="567"/>
       </w:pPr>
-      <w:bookmarkStart w:id="17" w:name="_Toc240025464"/>
+      <w:bookmarkStart w:id="17" w:name="_Toc244269442"/>
       <w:r>
         <w:lastRenderedPageBreak/>
         <w:t xml:space="preserve">#6 — US </w:t>
@@ -3995,14 +4087,16 @@
     </w:p>
     <w:p/>
     <w:p/>
-    <w:bookmarkEnd w:id="11"/>
     <w:p>
       <w:pPr>
         <w:pStyle w:val="Titre1"/>
       </w:pPr>
+      <w:bookmarkStart w:id="18" w:name="_Toc244269443"/>
+      <w:bookmarkEnd w:id="11"/>
       <w:r>
         <w:t>RAPPORT DE TESTS</w:t>
       </w:r>
+      <w:bookmarkEnd w:id="18"/>
     </w:p>
     <w:p>
       <w:r>
@@ -4013,9 +4107,11 @@
       <w:pPr>
         <w:pStyle w:val="Titre2"/>
       </w:pPr>
+      <w:bookmarkStart w:id="19" w:name="_Toc244269444"/>
       <w:r>
         <w:t>Gestion du Joueur</w:t>
       </w:r>
+      <w:bookmarkEnd w:id="19"/>
     </w:p>
     <w:p>
       <w:pPr>
@@ -4153,10 +4249,12 @@
       <w:pPr>
         <w:pStyle w:val="Titre2"/>
       </w:pPr>
+      <w:bookmarkStart w:id="20" w:name="_Toc244269445"/>
       <w:r>
         <w:lastRenderedPageBreak/>
         <w:t>Déplacement des Ennemis</w:t>
       </w:r>
+      <w:bookmarkEnd w:id="20"/>
     </w:p>
     <w:p>
       <w:pPr>
@@ -4206,9 +4304,11 @@
       <w:pPr>
         <w:pStyle w:val="Titre2"/>
       </w:pPr>
+      <w:bookmarkStart w:id="21" w:name="_Toc244269446"/>
       <w:r>
         <w:t>Gestion des Tirs et Projectiles</w:t>
       </w:r>
+      <w:bookmarkEnd w:id="21"/>
     </w:p>
     <w:p>
       <w:pPr>
@@ -4318,9 +4418,11 @@
       <w:pPr>
         <w:pStyle w:val="Titre2"/>
       </w:pPr>
+      <w:bookmarkStart w:id="22" w:name="_Toc244269447"/>
       <w:r>
         <w:t>Détection des Collisions</w:t>
       </w:r>
+      <w:bookmarkEnd w:id="22"/>
     </w:p>
     <w:p>
       <w:pPr>
@@ -4384,9 +4486,11 @@
       <w:pPr>
         <w:pStyle w:val="Titre2"/>
       </w:pPr>
+      <w:bookmarkStart w:id="23" w:name="_Toc244269448"/>
       <w:r>
         <w:t>Fonctions Utilitaires</w:t>
       </w:r>
+      <w:bookmarkEnd w:id="23"/>
     </w:p>
     <w:p>
       <w:pPr>
@@ -4448,153 +4552,384 @@
     </w:p>
     <w:p>
       <w:pPr>
+        <w:rPr>
+          <w:rFonts w:eastAsiaTheme="minorEastAsia" w:cstheme="minorBidi"/>
+          <w:sz w:val="22"/>
+          <w:szCs w:val="22"/>
+          <w:lang w:eastAsia="en-US"/>
+        </w:rPr>
+      </w:pPr>
+      <w:r>
+        <w:br w:type="page"/>
+      </w:r>
+    </w:p>
+    <w:p>
+      <w:pPr>
         <w:pStyle w:val="Titre1"/>
       </w:pPr>
-      <w:r>
+      <w:bookmarkStart w:id="24" w:name="_Toc244269449"/>
+      <w:r>
+        <w:lastRenderedPageBreak/>
         <w:t>CONCEPTION</w:t>
       </w:r>
+      <w:bookmarkEnd w:id="24"/>
     </w:p>
     <w:p>
       <w:pPr>
         <w:pStyle w:val="Titre2"/>
       </w:pPr>
+      <w:bookmarkStart w:id="25" w:name="_Toc244269450"/>
       <w:r>
         <w:t>Avant le codage</w:t>
       </w:r>
+      <w:bookmarkEnd w:id="25"/>
     </w:p>
     <w:p>
       <w:pPr>
         <w:ind w:left="1134"/>
+        <w:rPr>
+          <w:noProof/>
+        </w:rPr>
       </w:pPr>
       <w:r>
         <w:t xml:space="preserve">J’ai tout d’abord écrit des user stories qui répondait </w:t>
       </w:r>
-      <w:proofErr w:type="gramStart"/>
-      <w:r>
-        <w:t>au demande</w:t>
-      </w:r>
-      <w:proofErr w:type="gramEnd"/>
+      <w:r>
+        <w:t>aux demandes</w:t>
+      </w:r>
       <w:r>
         <w:t xml:space="preserve"> du CDC </w:t>
       </w:r>
+      <w:r>
+        <w:t>tous en y intégrant mes idées en rapport avec mon thème.</w:t>
+      </w:r>
+      <w:r>
+        <w:rPr>
+          <w:noProof/>
+        </w:rPr>
+        <w:t xml:space="preserve"> </w:t>
+      </w:r>
+    </w:p>
+    <w:p>
+      <w:pPr>
+        <w:ind w:left="1134"/>
+        <w:rPr>
+          <w:noProof/>
+        </w:rPr>
+      </w:pPr>
+      <w:r>
+        <w:rPr>
+          <w:noProof/>
+        </w:rPr>
+        <w:t>Le diagramme de classe sert dans mon cas à expliquer la composition de mes classes tel que : les attributs des classes et les méthodes.</w:t>
+      </w:r>
+    </w:p>
+    <w:p>
+      <w:pPr>
+        <w:ind w:left="1134"/>
+        <w:rPr>
+          <w:noProof/>
+        </w:rPr>
+      </w:pPr>
+      <w:r>
+        <w:rPr>
+          <w:noProof/>
+        </w:rPr>
+        <w:t xml:space="preserve">Ma méthode </w:t>
+      </w:r>
+      <w:r>
+        <w:rPr>
+          <w:noProof/>
+        </w:rPr>
+        <w:t>gamespace_KeyDown</w:t>
+      </w:r>
+      <w:r>
+        <w:rPr>
+          <w:noProof/>
+        </w:rPr>
+        <w:t xml:space="preserve"> sert à recupperer la direction vers laquelle le joueur veut aller.</w:t>
+      </w:r>
+    </w:p>
+    <w:p>
+      <w:pPr>
+        <w:ind w:left="1134"/>
+        <w:rPr>
+          <w:noProof/>
+        </w:rPr>
+      </w:pPr>
+      <w:r>
+        <w:rPr>
+          <w:noProof/>
+        </w:rPr>
+        <w:t xml:space="preserve">Ma méthode addshoot sert à ajouter les tirs créer dans </w:t>
+      </w:r>
+      <w:r>
+        <w:rPr>
+          <w:noProof/>
+        </w:rPr>
+        <w:t xml:space="preserve">une liste </w:t>
+      </w:r>
+      <w:r>
+        <w:rPr>
+          <w:noProof/>
+        </w:rPr>
+        <w:t>où sont regouper tous les tirs qui sont encore en jeu.</w:t>
+      </w:r>
+    </w:p>
+    <w:p>
+      <w:pPr>
+        <w:ind w:left="1134"/>
+        <w:rPr>
+          <w:noProof/>
+        </w:rPr>
+      </w:pPr>
+      <w:r>
+        <w:rPr>
+          <w:noProof/>
+        </w:rPr>
+        <w:t>Mon attribut explode sert à savoir si le tir à exploser ou non et donc qu’il doit être supprimer.</w:t>
+      </w:r>
+    </w:p>
+    <w:p>
+      <w:pPr>
+        <w:ind w:left="1134"/>
+        <w:rPr>
+          <w:noProof/>
+        </w:rPr>
+      </w:pPr>
+    </w:p>
+    <w:p>
+      <w:pPr>
+        <w:ind w:left="1134"/>
+        <w:rPr>
+          <w:noProof/>
+        </w:rPr>
+      </w:pPr>
+    </w:p>
+    <w:p>
+      <w:pPr>
+        <w:ind w:left="1134"/>
+      </w:pPr>
+      <w:r>
+        <w:rPr>
+          <w:noProof/>
+        </w:rPr>
+        <w:drawing>
+          <wp:inline distT="0" distB="0" distL="0" distR="0" wp14:anchorId="783AE375" wp14:editId="74D58442">
+            <wp:extent cx="5757545" cy="4717415"/>
+            <wp:effectExtent l="0" t="0" r="0" b="6985"/>
+            <wp:docPr id="740314934" name="Image 4"/>
+            <wp:cNvGraphicFramePr>
+              <a:graphicFrameLocks xmlns:a="http://schemas.openxmlformats.org/drawingml/2006/main" noChangeAspect="1"/>
+            </wp:cNvGraphicFramePr>
+            <a:graphic xmlns:a="http://schemas.openxmlformats.org/drawingml/2006/main">
+              <a:graphicData uri="http://schemas.openxmlformats.org/drawingml/2006/picture">
+                <pic:pic xmlns:pic="http://schemas.openxmlformats.org/drawingml/2006/picture">
+                  <pic:nvPicPr>
+                    <pic:cNvPr id="0" name="Picture 5"/>
+                    <pic:cNvPicPr>
+                      <a:picLocks noChangeAspect="1" noChangeArrowheads="1"/>
+                    </pic:cNvPicPr>
+                  </pic:nvPicPr>
+                  <pic:blipFill>
+                    <a:blip r:embed="rId13">
+                      <a:extLst>
+                        <a:ext uri="{28A0092B-C50C-407E-A947-70E740481C1C}">
+                          <a14:useLocalDpi xmlns:a14="http://schemas.microsoft.com/office/drawing/2010/main" val="0"/>
+                        </a:ext>
+                      </a:extLst>
+                    </a:blip>
+                    <a:srcRect/>
+                    <a:stretch>
+                      <a:fillRect/>
+                    </a:stretch>
+                  </pic:blipFill>
+                  <pic:spPr bwMode="auto">
+                    <a:xfrm>
+                      <a:off x="0" y="0"/>
+                      <a:ext cx="5757545" cy="4717415"/>
+                    </a:xfrm>
+                    <a:prstGeom prst="rect">
+                      <a:avLst/>
+                    </a:prstGeom>
+                    <a:noFill/>
+                    <a:ln>
+                      <a:noFill/>
+                    </a:ln>
+                  </pic:spPr>
+                </pic:pic>
+              </a:graphicData>
+            </a:graphic>
+          </wp:inline>
+        </w:drawing>
+      </w:r>
     </w:p>
     <w:p>
       <w:pPr>
         <w:pStyle w:val="Titre2"/>
       </w:pPr>
+      <w:bookmarkStart w:id="26" w:name="_Toc244269451"/>
       <w:r>
         <w:t>Pendant le codage</w:t>
       </w:r>
+      <w:bookmarkEnd w:id="26"/>
     </w:p>
     <w:p>
       <w:pPr>
         <w:ind w:left="1134"/>
       </w:pPr>
       <w:r>
-        <w:t>J'ai aussi essayé de respecter au plus le principe DRY en réutilisant des méthodes et fonctions afin de ne pas me répéter inutilement.</w:t>
+        <w:t xml:space="preserve">J’ai </w:t>
+      </w:r>
+      <w:r>
+        <w:t>tenté</w:t>
+      </w:r>
+      <w:r>
+        <w:t xml:space="preserve"> de </w:t>
+      </w:r>
+      <w:r>
+        <w:t xml:space="preserve">me </w:t>
+      </w:r>
+      <w:r>
+        <w:t xml:space="preserve">servir de l’IA le moins possible pour réellement </w:t>
+      </w:r>
+      <w:r>
+        <w:t xml:space="preserve">mettre en pratique ce que nous avions fait et l’adapter aux situations. Malgré </w:t>
+      </w:r>
+      <w:r>
+        <w:t>des blocages</w:t>
+      </w:r>
+      <w:r>
+        <w:t xml:space="preserve"> j’ai toujours trouvé une solution même si </w:t>
+      </w:r>
+      <w:r>
+        <w:t>parfois</w:t>
+      </w:r>
+      <w:r>
+        <w:t xml:space="preserve">, il m’a fallu de l’aide extérieur. </w:t>
+      </w:r>
+    </w:p>
+    <w:p>
+      <w:r>
+        <w:br w:type="page"/>
       </w:r>
     </w:p>
     <w:p>
       <w:pPr>
         <w:pStyle w:val="Titre1"/>
       </w:pPr>
-      <w:r>
+      <w:bookmarkStart w:id="27" w:name="_Toc244269452"/>
+      <w:r>
+        <w:lastRenderedPageBreak/>
         <w:t>EXPLICATION DE L'USAGE FAIT DE L'IA DANS CE PROJET</w:t>
       </w:r>
+      <w:bookmarkEnd w:id="27"/>
     </w:p>
     <w:p>
       <w:pPr>
         <w:pStyle w:val="Titre2"/>
       </w:pPr>
+      <w:bookmarkStart w:id="28" w:name="_Toc244269453"/>
       <w:r>
         <w:t>Dans le code</w:t>
       </w:r>
+      <w:bookmarkEnd w:id="28"/>
     </w:p>
     <w:p>
       <w:pPr>
         <w:ind w:left="1134"/>
       </w:pPr>
       <w:r>
-        <w:t>Durant le projet, l'IA m'a orienté quand j'ai été bloqué sur l'implémentation de mes US (gestion de l'affichage double buffer, structuration des classes Player, Ennemie, Tir, Barriere).</w:t>
+        <w:t>Dans le cadre de ce projet, l'utilisation de l'intelligence artificielle a été strictement encadrée afin de privilégier un apprentissage autonome et une démarche personnelle de résolution de problèmes. En effet, je n'ai sollicité l'IA qu'à titre exceptionnel, lors de mes sessions de travail individuel à domicile, dans des situations bien précises où mes recherches approfondies sur Internet étaient restées infructueuses. Dans ces moments de blocage, l'outil m'a servi de guide méthodologique : je lui demandais des pistes de réflexion et des orientations pour surmonter les difficultés techniques, en veillant à ne jamais obtenir de solution toute faite ni de code directement exploitable sans réflexion.</w:t>
       </w:r>
     </w:p>
     <w:p>
       <w:pPr>
         <w:pStyle w:val="Titre2"/>
       </w:pPr>
+      <w:bookmarkStart w:id="29" w:name="_Toc244269454"/>
       <w:r>
         <w:t>Hors code</w:t>
       </w:r>
+      <w:bookmarkEnd w:id="29"/>
     </w:p>
     <w:p>
       <w:pPr>
         <w:ind w:left="1134"/>
       </w:pPr>
       <w:r>
-        <w:t>J'ai utilisé l'aide externe et l'IA afin de résoudre des erreurs avec le compilateur et Visual Studio 2022.</w:t>
+        <w:t xml:space="preserve">Par ailleurs, l'IA est intervenue comme un outil de rationalisation du temps sur des aspects secondaires du projet où mes compétences étaient plus limitées. Elle a ainsi été sollicitée pour la création intégrale des visuels et des </w:t>
+      </w:r>
+      <w:proofErr w:type="spellStart"/>
+      <w:r>
+        <w:t>sprites</w:t>
+      </w:r>
+      <w:proofErr w:type="spellEnd"/>
+      <w:r>
+        <w:t xml:space="preserve"> graphiques, une tâche chronophage pour laquelle je manque d'aisance artistique. De manière similaire, j'ai eu recours à l'IA pour générer la structure de mon diagramme de classes afin d'accélérer la phase de modélisation, tout en m'assurant que la logique globale restait conforme à mes choix de conception. En dehors de cette assistance pour la génération d'images, l'aide à la modélisation et la correction orthographique, l'ensemble du travail de développement et d'analyse a été réalisé de manière totalement indépendante.</w:t>
       </w:r>
     </w:p>
     <w:p>
       <w:pPr>
         <w:pStyle w:val="Titre1"/>
       </w:pPr>
+      <w:bookmarkStart w:id="30" w:name="_Toc244269455"/>
       <w:r>
         <w:t>BILAN DU DÉROULEMENT DU PROJET</w:t>
       </w:r>
+      <w:bookmarkEnd w:id="30"/>
     </w:p>
     <w:p>
       <w:pPr>
         <w:ind w:left="567"/>
       </w:pPr>
       <w:r>
-        <w:t xml:space="preserve">Sur le début du projet je bloquais énormément car j'avais du mal à comprendre la programmation orientée objet, mais par la suite, le projet s'est majoritairement bien </w:t>
-      </w:r>
-      <w:r>
-        <w:lastRenderedPageBreak/>
-        <w:t>passé. J'ai réussi à coder les fonctionnalités du cahier des charge</w:t>
-      </w:r>
-      <w:r>
-        <w:t>s</w:t>
-      </w:r>
-      <w:r>
-        <w:t>. J'ai quand même rencontré quelques difficultés, notamment pour l'affichage fluide, mais j'ai réussi à tout régler au fur et à mesure.</w:t>
+        <w:t xml:space="preserve">Je n’ai pas eu de gros problème durant le projet mais durant la plupart des fonctionnalités il m’est arrivé de rester bloquer car je ne savais pas comment m’y prendre mais en demandant ou cherchant de l’aide j’ai réussi à résoudre les problèmes. </w:t>
       </w:r>
     </w:p>
     <w:p>
       <w:pPr>
         <w:pStyle w:val="Titre1"/>
       </w:pPr>
+      <w:bookmarkStart w:id="31" w:name="_Toc244269456"/>
       <w:r>
         <w:t>BILAN PRODUIT</w:t>
       </w:r>
+      <w:bookmarkEnd w:id="31"/>
     </w:p>
     <w:p>
       <w:pPr>
         <w:ind w:left="567"/>
       </w:pPr>
       <w:r>
-        <w:t>Le résultat final correspond à ce que je voulais faire. Le jeu est fonctionnel, jouable et reprend bien le style demandé dans le cahier des charges. Ce projet m'a permis d'en apprendre beaucoup en programmation orientée objet.</w:t>
+        <w:t>Le résultat final correspond parfaitement à mes attentes : le jeu est jouable, fonctionnel et respecte le cahier des charges. Pour corriger des lenteurs, j'ai supprimé l'attente entre les vagues et accéléré les déplacements ainsi que les tirs. Ce projet m'a permis de développer mes compétences en programmation orientée objet.</w:t>
       </w:r>
     </w:p>
     <w:p>
       <w:pPr>
         <w:pStyle w:val="Titre1"/>
       </w:pPr>
+      <w:bookmarkStart w:id="32" w:name="_Toc244269457"/>
       <w:r>
         <w:t>CONCLUSION</w:t>
       </w:r>
+      <w:bookmarkEnd w:id="32"/>
     </w:p>
     <w:p>
       <w:pPr>
         <w:ind w:left="567"/>
       </w:pPr>
       <w:r>
-        <w:t>En conclusion, réaliser ce jeu a été une très bonne expérience. Même si le début était compliqué à cause de la programmation orientée objet, ce jeu m'a vraiment aidé à mieux comprendre cette dernière. Ce projet m'a permis d'en apprendre beaucoup en C# et je suis satisfait du produit final.</w:t>
+        <w:t>En conclusion, le fait de créer ce jeu ma permis de me rendre compte que le C* est beaucoup plus complet que je ne le pensais et de bien mettre en pratique ce que j’ai appris durant le POO. J’ai beaucoup apprécié faire ce projet car je le trouvais très intéressant.</w:t>
       </w:r>
     </w:p>
     <w:sectPr>
-      <w:headerReference w:type="default" r:id="rId13"/>
-      <w:footerReference w:type="default" r:id="rId14"/>
+      <w:headerReference w:type="even" r:id="rId14"/>
+      <w:headerReference w:type="default" r:id="rId15"/>
+      <w:footerReference w:type="even" r:id="rId16"/>
+      <w:footerReference w:type="default" r:id="rId17"/>
+      <w:headerReference w:type="first" r:id="rId18"/>
+      <w:footerReference w:type="first" r:id="rId19"/>
       <w:pgSz w:w="11906" w:h="16838" w:code="9"/>
       <w:pgMar w:top="1418" w:right="1418" w:bottom="1418" w:left="1418" w:header="709" w:footer="709" w:gutter="0"/>
       <w:cols w:space="708"/>
@@ -4625,6 +4960,16 @@
 </file>
 
 <file path=word/footer1.xml><?xml version="1.0" encoding="utf-8"?>
+<w:ftr xmlns:wpc="http://schemas.microsoft.com/office/word/2010/wordprocessingCanvas" xmlns:cx="http://schemas.microsoft.com/office/drawing/2014/chartex" xmlns:cx1="http://schemas.microsoft.com/office/drawing/2015/9/8/chartex" xmlns:cx2="http://schemas.microsoft.com/office/drawing/2015/10/21/chartex" xmlns:cx3="http://schemas.microsoft.com/office/drawing/2016/5/9/chartex" xmlns:cx4="http://schemas.microsoft.com/office/drawing/2016/5/10/chartex" xmlns:cx5="http://schemas.microsoft.com/office/drawing/2016/5/11/chartex" xmlns:cx6="http://schemas.microsoft.com/office/drawing/2016/5/12/chartex" xmlns:cx7="http://schemas.microsoft.com/office/drawing/2016/5/13/chartex" xmlns:cx8="http://schemas.microsoft.com/office/drawing/2016/5/14/chartex" xmlns:mc="http://schemas.openxmlformats.org/markup-compatibility/2006" xmlns:aink="http://schemas.microsoft.com/office/drawing/2016/ink" xmlns:am3d="http://schemas.microsoft.com/office/drawing/2017/model3d" xmlns:o="urn:schemas-microsoft-com:office:office" xmlns:oel="http://schemas.microsoft.com/office/2019/extlst" xmlns:r="http://schemas.openxmlformats.org/officeDocument/2006/relationships" xmlns:m="http://schemas.openxmlformats.org/officeDocument/2006/math" xmlns:v="urn:schemas-microsoft-com:vml" xmlns:wp14="http://schemas.microsoft.com/office/word/2010/wordprocessingDrawing" xmlns:wp="http://schemas.openxmlformats.org/drawingml/2006/wordprocessingDrawing" xmlns:w10="urn:schemas-microsoft-com:office:word" xmlns:w="http://schemas.openxmlformats.org/wordprocessingml/2006/main" xmlns:w14="http://schemas.microsoft.com/office/word/2010/wordml" xmlns:w15="http://schemas.microsoft.com/office/word/2012/wordml" xmlns:w16cex="http://schemas.microsoft.com/office/word/2018/wordml/cex" xmlns:w16cid="http://schemas.microsoft.com/office/word/2016/wordml/cid" xmlns:w16="http://schemas.microsoft.com/office/word/2018/wordml" xmlns:w16du="http://schemas.microsoft.com/office/word/2023/wordml/word16du" xmlns:w16sdtdh="http://schemas.microsoft.com/office/word/2020/wordml/sdtdatahash" xmlns:w16sdtfl="http://schemas.microsoft.com/office/word/2024/wordml/sdtformatlock" xmlns:w16se="http://schemas.microsoft.com/office/word/2015/wordml/symex" xmlns:wpg="http://schemas.microsoft.com/office/word/2010/wordprocessingGroup" xmlns:wpi="http://schemas.microsoft.com/office/word/2010/wordprocessingInk" xmlns:wne="http://schemas.microsoft.com/office/word/2006/wordml" xmlns:wps="http://schemas.microsoft.com/office/word/2010/wordprocessingShape" mc:Ignorable="w14 w15 w16se w16cid w16 w16cex w16sdtdh w16sdtfl w16du wp14">
+  <w:p>
+    <w:pPr>
+      <w:pStyle w:val="Pieddepage"/>
+    </w:pPr>
+  </w:p>
+</w:ftr>
+</file>
+
+<file path=word/footer2.xml><?xml version="1.0" encoding="utf-8"?>
 <w:ftr xmlns:wpc="http://schemas.microsoft.com/office/word/2010/wordprocessingCanvas" xmlns:cx="http://schemas.microsoft.com/office/drawing/2014/chartex" xmlns:cx1="http://schemas.microsoft.com/office/drawing/2015/9/8/chartex" xmlns:cx2="http://schemas.microsoft.com/office/drawing/2015/10/21/chartex" xmlns:cx3="http://schemas.microsoft.com/office/drawing/2016/5/9/chartex" xmlns:cx4="http://schemas.microsoft.com/office/drawing/2016/5/10/chartex" xmlns:cx5="http://schemas.microsoft.com/office/drawing/2016/5/11/chartex" xmlns:cx6="http://schemas.microsoft.com/office/drawing/2016/5/12/chartex" xmlns:cx7="http://schemas.microsoft.com/office/drawing/2016/5/13/chartex" xmlns:cx8="http://schemas.microsoft.com/office/drawing/2016/5/14/chartex" xmlns:mc="http://schemas.openxmlformats.org/markup-compatibility/2006" xmlns:aink="http://schemas.microsoft.com/office/drawing/2016/ink" xmlns:am3d="http://schemas.microsoft.com/office/drawing/2017/model3d" xmlns:o="urn:schemas-microsoft-com:office:office" xmlns:oel="http://schemas.microsoft.com/office/2019/extlst" xmlns:r="http://schemas.openxmlformats.org/officeDocument/2006/relationships" xmlns:m="http://schemas.openxmlformats.org/officeDocument/2006/math" xmlns:v="urn:schemas-microsoft-com:vml" xmlns:wp14="http://schemas.microsoft.com/office/word/2010/wordprocessingDrawing" xmlns:wp="http://schemas.openxmlformats.org/drawingml/2006/wordprocessingDrawing" xmlns:w10="urn:schemas-microsoft-com:office:word" xmlns:w="http://schemas.openxmlformats.org/wordprocessingml/2006/main" xmlns:w14="http://schemas.microsoft.com/office/word/2010/wordml" xmlns:w15="http://schemas.microsoft.com/office/word/2012/wordml" xmlns:w16cex="http://schemas.microsoft.com/office/word/2018/wordml/cex" xmlns:w16cid="http://schemas.microsoft.com/office/word/2016/wordml/cid" xmlns:w16="http://schemas.microsoft.com/office/word/2018/wordml" xmlns:w16du="http://schemas.microsoft.com/office/word/2023/wordml/word16du" xmlns:w16sdtdh="http://schemas.microsoft.com/office/word/2020/wordml/sdtdatahash" xmlns:w16sdtfl="http://schemas.microsoft.com/office/word/2024/wordml/sdtformatlock" xmlns:w16se="http://schemas.microsoft.com/office/word/2015/wordml/symex" xmlns:wpg="http://schemas.microsoft.com/office/word/2010/wordprocessingGroup" xmlns:wpi="http://schemas.microsoft.com/office/word/2010/wordprocessingInk" xmlns:wne="http://schemas.microsoft.com/office/word/2006/wordml" xmlns:wps="http://schemas.microsoft.com/office/word/2010/wordprocessingShape" mc:Ignorable="w14 w15 w16se w16cid w16 w16cex w16sdtdh w16sdtfl w16du wp14">
   <w:tbl>
     <w:tblPr>
@@ -5079,7 +5424,7 @@
               <w:noProof/>
               <w:szCs w:val="16"/>
             </w:rPr>
-            <w:t>29.10.2026 20:11</w:t>
+            <w:t>30.10.2026 16:16</w:t>
           </w:r>
           <w:r>
             <w:rPr>
@@ -5112,13 +5457,7 @@
                 <w:noProof/>
                 <w:szCs w:val="16"/>
               </w:rPr>
-              <w:t>I320-RapportProjet</w:t>
-            </w:r>
-            <w:r>
-              <w:rPr>
-                <w:noProof/>
-              </w:rPr>
-              <w:t>.docx</w:t>
+              <w:t>I320-RapportProjet.docx</w:t>
             </w:r>
           </w:fldSimple>
         </w:p>
@@ -5137,6 +5476,16 @@
 </w:ftr>
 </file>
 
+<file path=word/footer3.xml><?xml version="1.0" encoding="utf-8"?>
+<w:ftr xmlns:wpc="http://schemas.microsoft.com/office/word/2010/wordprocessingCanvas" xmlns:cx="http://schemas.microsoft.com/office/drawing/2014/chartex" xmlns:cx1="http://schemas.microsoft.com/office/drawing/2015/9/8/chartex" xmlns:cx2="http://schemas.microsoft.com/office/drawing/2015/10/21/chartex" xmlns:cx3="http://schemas.microsoft.com/office/drawing/2016/5/9/chartex" xmlns:cx4="http://schemas.microsoft.com/office/drawing/2016/5/10/chartex" xmlns:cx5="http://schemas.microsoft.com/office/drawing/2016/5/11/chartex" xmlns:cx6="http://schemas.microsoft.com/office/drawing/2016/5/12/chartex" xmlns:cx7="http://schemas.microsoft.com/office/drawing/2016/5/13/chartex" xmlns:cx8="http://schemas.microsoft.com/office/drawing/2016/5/14/chartex" xmlns:mc="http://schemas.openxmlformats.org/markup-compatibility/2006" xmlns:aink="http://schemas.microsoft.com/office/drawing/2016/ink" xmlns:am3d="http://schemas.microsoft.com/office/drawing/2017/model3d" xmlns:o="urn:schemas-microsoft-com:office:office" xmlns:oel="http://schemas.microsoft.com/office/2019/extlst" xmlns:r="http://schemas.openxmlformats.org/officeDocument/2006/relationships" xmlns:m="http://schemas.openxmlformats.org/officeDocument/2006/math" xmlns:v="urn:schemas-microsoft-com:vml" xmlns:wp14="http://schemas.microsoft.com/office/word/2010/wordprocessingDrawing" xmlns:wp="http://schemas.openxmlformats.org/drawingml/2006/wordprocessingDrawing" xmlns:w10="urn:schemas-microsoft-com:office:word" xmlns:w="http://schemas.openxmlformats.org/wordprocessingml/2006/main" xmlns:w14="http://schemas.microsoft.com/office/word/2010/wordml" xmlns:w15="http://schemas.microsoft.com/office/word/2012/wordml" xmlns:w16cex="http://schemas.microsoft.com/office/word/2018/wordml/cex" xmlns:w16cid="http://schemas.microsoft.com/office/word/2016/wordml/cid" xmlns:w16="http://schemas.microsoft.com/office/word/2018/wordml" xmlns:w16du="http://schemas.microsoft.com/office/word/2023/wordml/word16du" xmlns:w16sdtdh="http://schemas.microsoft.com/office/word/2020/wordml/sdtdatahash" xmlns:w16sdtfl="http://schemas.microsoft.com/office/word/2024/wordml/sdtformatlock" xmlns:w16se="http://schemas.microsoft.com/office/word/2015/wordml/symex" xmlns:wpg="http://schemas.microsoft.com/office/word/2010/wordprocessingGroup" xmlns:wpi="http://schemas.microsoft.com/office/word/2010/wordprocessingInk" xmlns:wne="http://schemas.microsoft.com/office/word/2006/wordml" xmlns:wps="http://schemas.microsoft.com/office/word/2010/wordprocessingShape" mc:Ignorable="w14 w15 w16se w16cid w16 w16cex w16sdtdh w16sdtfl w16du wp14">
+  <w:p>
+    <w:pPr>
+      <w:pStyle w:val="Pieddepage"/>
+    </w:pPr>
+  </w:p>
+</w:ftr>
+</file>
+
 <file path=word/footnotes.xml><?xml version="1.0" encoding="utf-8"?>
 <w:footnotes xmlns:wpc="http://schemas.microsoft.com/office/word/2010/wordprocessingCanvas" xmlns:cx="http://schemas.microsoft.com/office/drawing/2014/chartex" xmlns:cx1="http://schemas.microsoft.com/office/drawing/2015/9/8/chartex" xmlns:cx2="http://schemas.microsoft.com/office/drawing/2015/10/21/chartex" xmlns:cx3="http://schemas.microsoft.com/office/drawing/2016/5/9/chartex" xmlns:cx4="http://schemas.microsoft.com/office/drawing/2016/5/10/chartex" xmlns:cx5="http://schemas.microsoft.com/office/drawing/2016/5/11/chartex" xmlns:cx6="http://schemas.microsoft.com/office/drawing/2016/5/12/chartex" xmlns:cx7="http://schemas.microsoft.com/office/drawing/2016/5/13/chartex" xmlns:cx8="http://schemas.microsoft.com/office/drawing/2016/5/14/chartex" xmlns:mc="http://schemas.openxmlformats.org/markup-compatibility/2006" xmlns:aink="http://schemas.microsoft.com/office/drawing/2016/ink" xmlns:am3d="http://schemas.microsoft.com/office/drawing/2017/model3d" xmlns:o="urn:schemas-microsoft-com:office:office" xmlns:oel="http://schemas.microsoft.com/office/2019/extlst" xmlns:r="http://schemas.openxmlformats.org/officeDocument/2006/relationships" xmlns:m="http://schemas.openxmlformats.org/officeDocument/2006/math" xmlns:v="urn:schemas-microsoft-com:vml" xmlns:wp14="http://schemas.microsoft.com/office/word/2010/wordprocessingDrawing" xmlns:wp="http://schemas.openxmlformats.org/drawingml/2006/wordprocessingDrawing" xmlns:w10="urn:schemas-microsoft-com:office:word" xmlns:w="http://schemas.openxmlformats.org/wordprocessingml/2006/main" xmlns:w14="http://schemas.microsoft.com/office/word/2010/wordml" xmlns:w15="http://schemas.microsoft.com/office/word/2012/wordml" xmlns:w16cex="http://schemas.microsoft.com/office/word/2018/wordml/cex" xmlns:w16cid="http://schemas.microsoft.com/office/word/2016/wordml/cid" xmlns:w16="http://schemas.microsoft.com/office/word/2018/wordml" xmlns:w16du="http://schemas.microsoft.com/office/word/2023/wordml/word16du" xmlns:w16sdtdh="http://schemas.microsoft.com/office/word/2020/wordml/sdtdatahash" xmlns:w16sdtfl="http://schemas.microsoft.com/office/word/2024/wordml/sdtformatlock" xmlns:w16se="http://schemas.microsoft.com/office/word/2015/wordml/symex" xmlns:wpg="http://schemas.microsoft.com/office/word/2010/wordprocessingGroup" xmlns:wpi="http://schemas.microsoft.com/office/word/2010/wordprocessingInk" xmlns:wne="http://schemas.microsoft.com/office/word/2006/wordml" xmlns:wps="http://schemas.microsoft.com/office/word/2010/wordprocessingShape" mc:Ignorable="w14 w15 w16se w16cid w16 w16cex w16sdtdh w16sdtfl w16du wp14">
   <w:footnote w:type="separator" w:id="-1">
@@ -5157,6 +5506,16 @@
 </file>
 
 <file path=word/header1.xml><?xml version="1.0" encoding="utf-8"?>
+<w:hdr xmlns:wpc="http://schemas.microsoft.com/office/word/2010/wordprocessingCanvas" xmlns:cx="http://schemas.microsoft.com/office/drawing/2014/chartex" xmlns:cx1="http://schemas.microsoft.com/office/drawing/2015/9/8/chartex" xmlns:cx2="http://schemas.microsoft.com/office/drawing/2015/10/21/chartex" xmlns:cx3="http://schemas.microsoft.com/office/drawing/2016/5/9/chartex" xmlns:cx4="http://schemas.microsoft.com/office/drawing/2016/5/10/chartex" xmlns:cx5="http://schemas.microsoft.com/office/drawing/2016/5/11/chartex" xmlns:cx6="http://schemas.microsoft.com/office/drawing/2016/5/12/chartex" xmlns:cx7="http://schemas.microsoft.com/office/drawing/2016/5/13/chartex" xmlns:cx8="http://schemas.microsoft.com/office/drawing/2016/5/14/chartex" xmlns:mc="http://schemas.openxmlformats.org/markup-compatibility/2006" xmlns:aink="http://schemas.microsoft.com/office/drawing/2016/ink" xmlns:am3d="http://schemas.microsoft.com/office/drawing/2017/model3d" xmlns:o="urn:schemas-microsoft-com:office:office" xmlns:oel="http://schemas.microsoft.com/office/2019/extlst" xmlns:r="http://schemas.openxmlformats.org/officeDocument/2006/relationships" xmlns:m="http://schemas.openxmlformats.org/officeDocument/2006/math" xmlns:v="urn:schemas-microsoft-com:vml" xmlns:wp14="http://schemas.microsoft.com/office/word/2010/wordprocessingDrawing" xmlns:wp="http://schemas.openxmlformats.org/drawingml/2006/wordprocessingDrawing" xmlns:w10="urn:schemas-microsoft-com:office:word" xmlns:w="http://schemas.openxmlformats.org/wordprocessingml/2006/main" xmlns:w14="http://schemas.microsoft.com/office/word/2010/wordml" xmlns:w15="http://schemas.microsoft.com/office/word/2012/wordml" xmlns:w16cex="http://schemas.microsoft.com/office/word/2018/wordml/cex" xmlns:w16cid="http://schemas.microsoft.com/office/word/2016/wordml/cid" xmlns:w16="http://schemas.microsoft.com/office/word/2018/wordml" xmlns:w16du="http://schemas.microsoft.com/office/word/2023/wordml/word16du" xmlns:w16sdtdh="http://schemas.microsoft.com/office/word/2020/wordml/sdtdatahash" xmlns:w16sdtfl="http://schemas.microsoft.com/office/word/2024/wordml/sdtformatlock" xmlns:w16se="http://schemas.microsoft.com/office/word/2015/wordml/symex" xmlns:wpg="http://schemas.microsoft.com/office/word/2010/wordprocessingGroup" xmlns:wpi="http://schemas.microsoft.com/office/word/2010/wordprocessingInk" xmlns:wne="http://schemas.microsoft.com/office/word/2006/wordml" xmlns:wps="http://schemas.microsoft.com/office/word/2010/wordprocessingShape" mc:Ignorable="w14 w15 w16se w16cid w16 w16cex w16sdtdh w16sdtfl w16du wp14">
+  <w:p>
+    <w:pPr>
+      <w:pStyle w:val="En-tte"/>
+    </w:pPr>
+  </w:p>
+</w:hdr>
+</file>
+
+<file path=word/header2.xml><?xml version="1.0" encoding="utf-8"?>
 <w:hdr xmlns:wpc="http://schemas.microsoft.com/office/word/2010/wordprocessingCanvas" xmlns:cx="http://schemas.microsoft.com/office/drawing/2014/chartex" xmlns:cx1="http://schemas.microsoft.com/office/drawing/2015/9/8/chartex" xmlns:cx2="http://schemas.microsoft.com/office/drawing/2015/10/21/chartex" xmlns:cx3="http://schemas.microsoft.com/office/drawing/2016/5/9/chartex" xmlns:cx4="http://schemas.microsoft.com/office/drawing/2016/5/10/chartex" xmlns:cx5="http://schemas.microsoft.com/office/drawing/2016/5/11/chartex" xmlns:cx6="http://schemas.microsoft.com/office/drawing/2016/5/12/chartex" xmlns:cx7="http://schemas.microsoft.com/office/drawing/2016/5/13/chartex" xmlns:cx8="http://schemas.microsoft.com/office/drawing/2016/5/14/chartex" xmlns:mc="http://schemas.openxmlformats.org/markup-compatibility/2006" xmlns:aink="http://schemas.microsoft.com/office/drawing/2016/ink" xmlns:am3d="http://schemas.microsoft.com/office/drawing/2017/model3d" xmlns:o="urn:schemas-microsoft-com:office:office" xmlns:oel="http://schemas.microsoft.com/office/2019/extlst" xmlns:r="http://schemas.openxmlformats.org/officeDocument/2006/relationships" xmlns:m="http://schemas.openxmlformats.org/officeDocument/2006/math" xmlns:v="urn:schemas-microsoft-com:vml" xmlns:wp14="http://schemas.microsoft.com/office/word/2010/wordprocessingDrawing" xmlns:wp="http://schemas.openxmlformats.org/drawingml/2006/wordprocessingDrawing" xmlns:w10="urn:schemas-microsoft-com:office:word" xmlns:w="http://schemas.openxmlformats.org/wordprocessingml/2006/main" xmlns:w14="http://schemas.microsoft.com/office/word/2010/wordml" xmlns:w15="http://schemas.microsoft.com/office/word/2012/wordml" xmlns:w16cex="http://schemas.microsoft.com/office/word/2018/wordml/cex" xmlns:w16cid="http://schemas.microsoft.com/office/word/2016/wordml/cid" xmlns:w16="http://schemas.microsoft.com/office/word/2018/wordml" xmlns:w16du="http://schemas.microsoft.com/office/word/2023/wordml/word16du" xmlns:w16sdtdh="http://schemas.microsoft.com/office/word/2020/wordml/sdtdatahash" xmlns:w16sdtfl="http://schemas.microsoft.com/office/word/2024/wordml/sdtformatlock" xmlns:w16se="http://schemas.microsoft.com/office/word/2015/wordml/symex" xmlns:wpg="http://schemas.microsoft.com/office/word/2010/wordprocessingGroup" xmlns:wpi="http://schemas.microsoft.com/office/word/2010/wordprocessingInk" xmlns:wne="http://schemas.microsoft.com/office/word/2006/wordml" xmlns:wps="http://schemas.microsoft.com/office/word/2010/wordprocessingShape" mc:Ignorable="w14 w15 w16se w16cid w16 w16cex w16sdtdh w16sdtfl w16du wp14">
   <w:tbl>
     <w:tblPr>
@@ -5266,6 +5625,16 @@
       </w:tc>
     </w:tr>
   </w:tbl>
+  <w:p>
+    <w:pPr>
+      <w:pStyle w:val="En-tte"/>
+    </w:pPr>
+  </w:p>
+</w:hdr>
+</file>
+
+<file path=word/header3.xml><?xml version="1.0" encoding="utf-8"?>
+<w:hdr xmlns:wpc="http://schemas.microsoft.com/office/word/2010/wordprocessingCanvas" xmlns:cx="http://schemas.microsoft.com/office/drawing/2014/chartex" xmlns:cx1="http://schemas.microsoft.com/office/drawing/2015/9/8/chartex" xmlns:cx2="http://schemas.microsoft.com/office/drawing/2015/10/21/chartex" xmlns:cx3="http://schemas.microsoft.com/office/drawing/2016/5/9/chartex" xmlns:cx4="http://schemas.microsoft.com/office/drawing/2016/5/10/chartex" xmlns:cx5="http://schemas.microsoft.com/office/drawing/2016/5/11/chartex" xmlns:cx6="http://schemas.microsoft.com/office/drawing/2016/5/12/chartex" xmlns:cx7="http://schemas.microsoft.com/office/drawing/2016/5/13/chartex" xmlns:cx8="http://schemas.microsoft.com/office/drawing/2016/5/14/chartex" xmlns:mc="http://schemas.openxmlformats.org/markup-compatibility/2006" xmlns:aink="http://schemas.microsoft.com/office/drawing/2016/ink" xmlns:am3d="http://schemas.microsoft.com/office/drawing/2017/model3d" xmlns:o="urn:schemas-microsoft-com:office:office" xmlns:oel="http://schemas.microsoft.com/office/2019/extlst" xmlns:r="http://schemas.openxmlformats.org/officeDocument/2006/relationships" xmlns:m="http://schemas.openxmlformats.org/officeDocument/2006/math" xmlns:v="urn:schemas-microsoft-com:vml" xmlns:wp14="http://schemas.microsoft.com/office/word/2010/wordprocessingDrawing" xmlns:wp="http://schemas.openxmlformats.org/drawingml/2006/wordprocessingDrawing" xmlns:w10="urn:schemas-microsoft-com:office:word" xmlns:w="http://schemas.openxmlformats.org/wordprocessingml/2006/main" xmlns:w14="http://schemas.microsoft.com/office/word/2010/wordml" xmlns:w15="http://schemas.microsoft.com/office/word/2012/wordml" xmlns:w16cex="http://schemas.microsoft.com/office/word/2018/wordml/cex" xmlns:w16cid="http://schemas.microsoft.com/office/word/2016/wordml/cid" xmlns:w16="http://schemas.microsoft.com/office/word/2018/wordml" xmlns:w16du="http://schemas.microsoft.com/office/word/2023/wordml/word16du" xmlns:w16sdtdh="http://schemas.microsoft.com/office/word/2020/wordml/sdtdatahash" xmlns:w16sdtfl="http://schemas.microsoft.com/office/word/2024/wordml/sdtformatlock" xmlns:w16se="http://schemas.microsoft.com/office/word/2015/wordml/symex" xmlns:wpg="http://schemas.microsoft.com/office/word/2010/wordprocessingGroup" xmlns:wpi="http://schemas.microsoft.com/office/word/2010/wordprocessingInk" xmlns:wne="http://schemas.microsoft.com/office/word/2006/wordml" xmlns:wps="http://schemas.microsoft.com/office/word/2010/wordprocessingShape" mc:Ignorable="w14 w15 w16se w16cid w16 w16cex w16sdtdh w16sdtfl w16du wp14">
   <w:p>
     <w:pPr>
       <w:pStyle w:val="En-tte"/>
@@ -10248,6 +10617,17 @@
 </file>
 
 <file path=customXml/item1.xml><?xml version="1.0" encoding="utf-8"?>
+<p:properties xmlns:p="http://schemas.microsoft.com/office/2006/metadata/properties" xmlns:xsi="http://www.w3.org/2001/XMLSchema-instance" xmlns:pc="http://schemas.microsoft.com/office/infopath/2007/PartnerControls">
+  <documentManagement>
+    <lcf76f155ced4ddcb4097134ff3c332f xmlns="a1b10758-7132-46a4-a2fe-7a2cf46f51f4">
+      <Terms xmlns="http://schemas.microsoft.com/office/infopath/2007/PartnerControls"/>
+    </lcf76f155ced4ddcb4097134ff3c332f>
+    <TaxCatchAll xmlns="f7d9f5a6-831d-4621-8c77-cbcaf993e406" xsi:nil="true"/>
+  </documentManagement>
+</p:properties>
+</file>
+
+<file path=customXml/item2.xml><?xml version="1.0" encoding="utf-8"?>
 <ct:contentTypeSchema xmlns:ct="http://schemas.microsoft.com/office/2006/metadata/contentType" xmlns:ma="http://schemas.microsoft.com/office/2006/metadata/properties/metaAttributes" ct:_="" ma:_="" ma:contentTypeName="Document" ma:contentTypeID="0x0101005A5B8F5EAAC22C48A11F5D9A60E6F21D" ma:contentTypeVersion="16" ma:contentTypeDescription="Crée un document." ma:contentTypeScope="" ma:versionID="f2b963976306cc54294b7f4545a3c6c4">
   <xsd:schema xmlns:xsd="http://www.w3.org/2001/XMLSchema" xmlns:xs="http://www.w3.org/2001/XMLSchema" xmlns:p="http://schemas.microsoft.com/office/2006/metadata/properties" xmlns:ns2="a1b10758-7132-46a4-a2fe-7a2cf46f51f4" xmlns:ns3="f7d9f5a6-831d-4621-8c77-cbcaf993e406" targetNamespace="http://schemas.microsoft.com/office/2006/metadata/properties" ma:root="true" ma:fieldsID="e5e135fa2fc1295e1586ddcd9c1a8904" ns2:_="" ns3:_="">
     <xsd:import namespace="a1b10758-7132-46a4-a2fe-7a2cf46f51f4"/>
@@ -10490,7 +10870,7 @@
 </ct:contentTypeSchema>
 </file>
 
-<file path=customXml/item2.xml><?xml version="1.0" encoding="utf-8"?>
+<file path=customXml/item3.xml><?xml version="1.0" encoding="utf-8"?>
 <?mso-contentType ?>
 <FormTemplates xmlns="http://schemas.microsoft.com/sharepoint/v3/contenttype/forms">
   <Display>DocumentLibraryForm</Display>
@@ -10499,22 +10879,22 @@
 </FormTemplates>
 </file>
 
-<file path=customXml/item3.xml><?xml version="1.0" encoding="utf-8"?>
+<file path=customXml/item4.xml><?xml version="1.0" encoding="utf-8"?>
 <b:Sources xmlns:b="http://schemas.openxmlformats.org/officeDocument/2006/bibliography" xmlns="http://schemas.openxmlformats.org/officeDocument/2006/bibliography" SelectedStyle="\APA.XSL" StyleName="APA"/>
 </file>
 
-<file path=customXml/item4.xml><?xml version="1.0" encoding="utf-8"?>
-<p:properties xmlns:p="http://schemas.microsoft.com/office/2006/metadata/properties" xmlns:xsi="http://www.w3.org/2001/XMLSchema-instance" xmlns:pc="http://schemas.microsoft.com/office/infopath/2007/PartnerControls">
-  <documentManagement>
-    <lcf76f155ced4ddcb4097134ff3c332f xmlns="a1b10758-7132-46a4-a2fe-7a2cf46f51f4">
-      <Terms xmlns="http://schemas.microsoft.com/office/infopath/2007/PartnerControls"/>
-    </lcf76f155ced4ddcb4097134ff3c332f>
-    <TaxCatchAll xmlns="f7d9f5a6-831d-4621-8c77-cbcaf993e406" xsi:nil="true"/>
-  </documentManagement>
-</p:properties>
+<file path=customXml/itemProps1.xml><?xml version="1.0" encoding="utf-8"?>
+<ds:datastoreItem xmlns:ds="http://schemas.openxmlformats.org/officeDocument/2006/customXml" ds:itemID="{2319CDB8-A2CD-412D-8359-13E6B4DF1FF4}">
+  <ds:schemaRefs>
+    <ds:schemaRef ds:uri="http://schemas.microsoft.com/office/2006/metadata/properties"/>
+    <ds:schemaRef ds:uri="http://schemas.microsoft.com/office/infopath/2007/PartnerControls"/>
+    <ds:schemaRef ds:uri="a1b10758-7132-46a4-a2fe-7a2cf46f51f4"/>
+    <ds:schemaRef ds:uri="f7d9f5a6-831d-4621-8c77-cbcaf993e406"/>
+  </ds:schemaRefs>
+</ds:datastoreItem>
 </file>
 
-<file path=customXml/itemProps1.xml><?xml version="1.0" encoding="utf-8"?>
+<file path=customXml/itemProps2.xml><?xml version="1.0" encoding="utf-8"?>
 <ds:datastoreItem xmlns:ds="http://schemas.openxmlformats.org/officeDocument/2006/customXml" ds:itemID="{41546E4A-837A-4BEF-A4B8-FFD4EAB4E855}">
   <ds:schemaRefs>
     <ds:schemaRef ds:uri="http://schemas.microsoft.com/office/2006/metadata/contentType"/>
@@ -10533,7 +10913,7 @@
 </ds:datastoreItem>
 </file>
 
-<file path=customXml/itemProps2.xml><?xml version="1.0" encoding="utf-8"?>
+<file path=customXml/itemProps3.xml><?xml version="1.0" encoding="utf-8"?>
 <ds:datastoreItem xmlns:ds="http://schemas.openxmlformats.org/officeDocument/2006/customXml" ds:itemID="{6C3F7A66-EDE3-46FD-83EB-3C265E5D2669}">
   <ds:schemaRefs>
     <ds:schemaRef ds:uri="http://schemas.microsoft.com/sharepoint/v3/contenttype/forms"/>
@@ -10541,21 +10921,10 @@
 </ds:datastoreItem>
 </file>
 
-<file path=customXml/itemProps3.xml><?xml version="1.0" encoding="utf-8"?>
+<file path=customXml/itemProps4.xml><?xml version="1.0" encoding="utf-8"?>
 <ds:datastoreItem xmlns:ds="http://schemas.openxmlformats.org/officeDocument/2006/customXml" ds:itemID="{C8C35155-3E6A-4058-B6E4-303717845E3B}">
   <ds:schemaRefs>
     <ds:schemaRef ds:uri="http://schemas.openxmlformats.org/officeDocument/2006/bibliography"/>
   </ds:schemaRefs>
 </ds:datastoreItem>
-</file>
-
-<file path=customXml/itemProps4.xml><?xml version="1.0" encoding="utf-8"?>
-<ds:datastoreItem xmlns:ds="http://schemas.openxmlformats.org/officeDocument/2006/customXml" ds:itemID="{2319CDB8-A2CD-412D-8359-13E6B4DF1FF4}">
-  <ds:schemaRefs>
-    <ds:schemaRef ds:uri="http://schemas.microsoft.com/office/2006/metadata/properties"/>
-    <ds:schemaRef ds:uri="http://schemas.microsoft.com/office/infopath/2007/PartnerControls"/>
-    <ds:schemaRef ds:uri="a1b10758-7132-46a4-a2fe-7a2cf46f51f4"/>
-    <ds:schemaRef ds:uri="f7d9f5a6-831d-4621-8c77-cbcaf993e406"/>
-  </ds:schemaRefs>
-</ds:datastoreItem>
 </file>
</xml_diff>